<commit_message>
Update documentation with new insights on chunking, web scraping issues, and processing steps
</commit_message>
<xml_diff>
--- a/doc/Memoria supongo.docx
+++ b/doc/Memoria supongo.docx
@@ -143,7 +143,19 @@
         <w:rPr>
           <w:rFonts w:ascii="Book Antiqua" w:hAnsi="Book Antiqua"/>
         </w:rPr>
-        <w:t xml:space="preserve">Aquí fallaba cuando pides lista de … =&gt; se creó un agente especializado en listas coge más </w:t>
+        <w:t xml:space="preserve">Aquí fallaba cuando pides lista de … =&gt; se creó un agente especializado en listas </w:t>
+      </w:r>
+      <w:r>
+        <w:rPr>
+          <w:rFonts w:ascii="Book Antiqua" w:hAnsi="Book Antiqua"/>
+        </w:rPr>
+        <w:t xml:space="preserve">que </w:t>
+      </w:r>
+      <w:r>
+        <w:rPr>
+          <w:rFonts w:ascii="Book Antiqua" w:hAnsi="Book Antiqua"/>
+        </w:rPr>
+        <w:t xml:space="preserve">coge más </w:t>
       </w:r>
       <w:proofErr w:type="spellStart"/>
       <w:proofErr w:type="gramStart"/>
@@ -161,6 +173,13 @@
         </w:rPr>
         <w:t xml:space="preserve"> pero más cortitos (funciona regular)</w:t>
       </w:r>
+    </w:p>
+    <w:p>
+      <w:pPr>
+        <w:rPr>
+          <w:rFonts w:ascii="Book Antiqua" w:hAnsi="Book Antiqua"/>
+        </w:rPr>
+      </w:pPr>
     </w:p>
     <w:p>
       <w:pPr>
@@ -173,14 +192,50 @@
           <w:rFonts w:ascii="Book Antiqua" w:hAnsi="Book Antiqua"/>
         </w:rPr>
       </w:pPr>
-      <w:proofErr w:type="spellStart"/>
-      <w:r>
-        <w:rPr>
-          <w:rFonts w:ascii="Book Antiqua" w:hAnsi="Book Antiqua"/>
-        </w:rPr>
-        <w:t>graphitti</w:t>
-      </w:r>
-      <w:proofErr w:type="spellEnd"/>
+      <w:r>
+        <w:rPr>
+          <w:rFonts w:ascii="Book Antiqua" w:hAnsi="Book Antiqua"/>
+        </w:rPr>
+        <w:t>G</w:t>
+      </w:r>
+      <w:r>
+        <w:rPr>
+          <w:rFonts w:ascii="Book Antiqua" w:hAnsi="Book Antiqua"/>
+        </w:rPr>
+        <w:t>raphitti</w:t>
+      </w:r>
+      <w:r>
+        <w:rPr>
+          <w:rFonts w:ascii="Book Antiqua" w:hAnsi="Book Antiqua"/>
+        </w:rPr>
+        <w:t xml:space="preserve">: </w:t>
+      </w:r>
+      <w:r>
+        <w:rPr>
+          <w:rFonts w:ascii="Book Antiqua" w:hAnsi="Book Antiqua"/>
+        </w:rPr>
+        <w:t xml:space="preserve">librería de </w:t>
+      </w:r>
+      <w:proofErr w:type="spellStart"/>
+      <w:r>
+        <w:rPr>
+          <w:rFonts w:ascii="Book Antiqua" w:hAnsi="Book Antiqua"/>
+        </w:rPr>
+        <w:t>python</w:t>
+      </w:r>
+      <w:proofErr w:type="spellEnd"/>
+      <w:r>
+        <w:rPr>
+          <w:rFonts w:ascii="Book Antiqua" w:hAnsi="Book Antiqua"/>
+        </w:rPr>
+        <w:t xml:space="preserve"> </w:t>
+      </w:r>
+      <w:r>
+        <w:rPr>
+          <w:rFonts w:ascii="Book Antiqua" w:hAnsi="Book Antiqua"/>
+        </w:rPr>
+        <w:t>para grafos de conocimiento dinámicos</w:t>
+      </w:r>
     </w:p>
     <w:p/>
     <w:p>
@@ -469,6 +524,515 @@
     </w:p>
     <w:p>
       <w:pPr>
+        <w:rPr>
+          <w:rFonts w:ascii="Book Antiqua" w:hAnsi="Book Antiqua"/>
+        </w:rPr>
+      </w:pPr>
+      <w:r>
+        <w:rPr>
+          <w:rFonts w:ascii="Book Antiqua" w:hAnsi="Book Antiqua"/>
+        </w:rPr>
+        <w:t>PROBLEMAS:</w:t>
+      </w:r>
+    </w:p>
+    <w:p>
+      <w:pPr>
+        <w:rPr>
+          <w:rFonts w:ascii="Book Antiqua" w:hAnsi="Book Antiqua"/>
+        </w:rPr>
+      </w:pPr>
+      <w:r>
+        <w:rPr>
+          <w:rFonts w:ascii="Book Antiqua" w:hAnsi="Book Antiqua"/>
+        </w:rPr>
+        <w:t xml:space="preserve">Al hacer web </w:t>
+      </w:r>
+      <w:proofErr w:type="spellStart"/>
+      <w:r>
+        <w:rPr>
+          <w:rFonts w:ascii="Book Antiqua" w:hAnsi="Book Antiqua"/>
+        </w:rPr>
+        <w:t>scrapping</w:t>
+      </w:r>
+      <w:proofErr w:type="spellEnd"/>
+      <w:r>
+        <w:rPr>
+          <w:rFonts w:ascii="Book Antiqua" w:hAnsi="Book Antiqua"/>
+        </w:rPr>
+        <w:t xml:space="preserve"> para o</w:t>
+      </w:r>
+      <w:r>
+        <w:rPr>
+          <w:rFonts w:ascii="Book Antiqua" w:hAnsi="Book Antiqua"/>
+        </w:rPr>
+        <w:t xml:space="preserve">btener los documentos de la legislación de la UE en otro ordenador, hubo problemas ya que con </w:t>
+      </w:r>
+      <w:proofErr w:type="spellStart"/>
+      <w:r>
+        <w:rPr>
+          <w:rFonts w:ascii="Book Antiqua" w:hAnsi="Book Antiqua"/>
+        </w:rPr>
+        <w:t>requests</w:t>
+      </w:r>
+      <w:proofErr w:type="spellEnd"/>
+      <w:r>
+        <w:rPr>
+          <w:rFonts w:ascii="Book Antiqua" w:hAnsi="Book Antiqua"/>
+        </w:rPr>
+        <w:t xml:space="preserve"> se rechazaba la conexión. Esto ocurre por </w:t>
+      </w:r>
+      <w:proofErr w:type="spellStart"/>
+      <w:r>
+        <w:rPr>
+          <w:rFonts w:ascii="Book Antiqua" w:hAnsi="Book Antiqua"/>
+        </w:rPr>
+        <w:t>Cloudfront</w:t>
+      </w:r>
+      <w:proofErr w:type="spellEnd"/>
+      <w:r>
+        <w:rPr>
+          <w:rFonts w:ascii="Book Antiqua" w:hAnsi="Book Antiqua"/>
+        </w:rPr>
+        <w:t xml:space="preserve"> WAF (</w:t>
+      </w:r>
+      <w:r>
+        <w:rPr>
+          <w:rFonts w:ascii="Book Antiqua" w:hAnsi="Book Antiqua"/>
+        </w:rPr>
+        <w:t xml:space="preserve">Web </w:t>
+      </w:r>
+      <w:proofErr w:type="spellStart"/>
+      <w:r>
+        <w:rPr>
+          <w:rFonts w:ascii="Book Antiqua" w:hAnsi="Book Antiqua"/>
+        </w:rPr>
+        <w:t>Application</w:t>
+      </w:r>
+      <w:proofErr w:type="spellEnd"/>
+      <w:r>
+        <w:rPr>
+          <w:rFonts w:ascii="Book Antiqua" w:hAnsi="Book Antiqua"/>
+        </w:rPr>
+        <w:t xml:space="preserve"> Firewall)</w:t>
+      </w:r>
+    </w:p>
+    <w:p>
+      <w:pPr>
+        <w:rPr>
+          <w:rFonts w:ascii="Book Antiqua" w:hAnsi="Book Antiqua"/>
+        </w:rPr>
+      </w:pPr>
+      <w:r>
+        <w:rPr>
+          <w:rFonts w:ascii="Book Antiqua" w:hAnsi="Book Antiqua"/>
+          <w:b/>
+          <w:bCs/>
+        </w:rPr>
+        <w:t>Referencias:</w:t>
+      </w:r>
+    </w:p>
+    <w:p>
+      <w:pPr>
+        <w:numPr>
+          <w:ilvl w:val="0"/>
+          <w:numId w:val="2"/>
+        </w:numPr>
+        <w:rPr>
+          <w:rFonts w:ascii="Book Antiqua" w:hAnsi="Book Antiqua"/>
+        </w:rPr>
+      </w:pPr>
+      <w:proofErr w:type="spellStart"/>
+      <w:r>
+        <w:rPr>
+          <w:rFonts w:ascii="Book Antiqua" w:hAnsi="Book Antiqua"/>
+          <w:b/>
+          <w:bCs/>
+        </w:rPr>
+        <w:t>ScrapeOps</w:t>
+      </w:r>
+      <w:proofErr w:type="spellEnd"/>
+      <w:r>
+        <w:rPr>
+          <w:rFonts w:ascii="Book Antiqua" w:hAnsi="Book Antiqua"/>
+          <w:b/>
+          <w:bCs/>
+        </w:rPr>
+        <w:t>:</w:t>
+      </w:r>
+      <w:r>
+        <w:rPr>
+          <w:rFonts w:ascii="Book Antiqua" w:hAnsi="Book Antiqua"/>
+        </w:rPr>
+        <w:t> </w:t>
+      </w:r>
+      <w:r>
+        <w:rPr>
+          <w:rFonts w:ascii="Book Antiqua" w:hAnsi="Book Antiqua"/>
+          <w:i/>
+          <w:iCs/>
+        </w:rPr>
+        <w:t xml:space="preserve">Python </w:t>
+      </w:r>
+      <w:proofErr w:type="spellStart"/>
+      <w:r>
+        <w:rPr>
+          <w:rFonts w:ascii="Book Antiqua" w:hAnsi="Book Antiqua"/>
+          <w:i/>
+          <w:iCs/>
+        </w:rPr>
+        <w:t>Selenium</w:t>
+      </w:r>
+      <w:proofErr w:type="spellEnd"/>
+      <w:r>
+        <w:rPr>
+          <w:rFonts w:ascii="Book Antiqua" w:hAnsi="Book Antiqua"/>
+          <w:i/>
+          <w:iCs/>
+        </w:rPr>
+        <w:t xml:space="preserve"> VS Python </w:t>
+      </w:r>
+      <w:proofErr w:type="spellStart"/>
+      <w:r>
+        <w:rPr>
+          <w:rFonts w:ascii="Book Antiqua" w:hAnsi="Book Antiqua"/>
+          <w:i/>
+          <w:iCs/>
+        </w:rPr>
+        <w:t>Requests</w:t>
+      </w:r>
+      <w:proofErr w:type="spellEnd"/>
+      <w:r>
+        <w:rPr>
+          <w:rFonts w:ascii="Book Antiqua" w:hAnsi="Book Antiqua"/>
+          <w:i/>
+          <w:iCs/>
+        </w:rPr>
+        <w:t xml:space="preserve"> </w:t>
+      </w:r>
+      <w:proofErr w:type="spellStart"/>
+      <w:r>
+        <w:rPr>
+          <w:rFonts w:ascii="Book Antiqua" w:hAnsi="Book Antiqua"/>
+          <w:i/>
+          <w:iCs/>
+        </w:rPr>
+        <w:t>Compared</w:t>
+      </w:r>
+      <w:proofErr w:type="spellEnd"/>
+      <w:r>
+        <w:rPr>
+          <w:rFonts w:ascii="Book Antiqua" w:hAnsi="Book Antiqua"/>
+        </w:rPr>
+        <w:t xml:space="preserve"> (Diferencias técnicas en protección </w:t>
+      </w:r>
+      <w:proofErr w:type="spellStart"/>
+      <w:r>
+        <w:rPr>
+          <w:rFonts w:ascii="Book Antiqua" w:hAnsi="Book Antiqua"/>
+        </w:rPr>
+        <w:t>anti-bot</w:t>
+      </w:r>
+      <w:proofErr w:type="spellEnd"/>
+      <w:r>
+        <w:rPr>
+          <w:rFonts w:ascii="Book Antiqua" w:hAnsi="Book Antiqua"/>
+        </w:rPr>
+        <w:t>).</w:t>
+      </w:r>
+    </w:p>
+    <w:p>
+      <w:pPr>
+        <w:numPr>
+          <w:ilvl w:val="0"/>
+          <w:numId w:val="2"/>
+        </w:numPr>
+        <w:rPr>
+          <w:rFonts w:ascii="Book Antiqua" w:hAnsi="Book Antiqua"/>
+        </w:rPr>
+      </w:pPr>
+      <w:r>
+        <w:rPr>
+          <w:rFonts w:ascii="Book Antiqua" w:hAnsi="Book Antiqua"/>
+          <w:b/>
+          <w:bCs/>
+        </w:rPr>
+        <w:t xml:space="preserve">AWS </w:t>
+      </w:r>
+      <w:proofErr w:type="spellStart"/>
+      <w:r>
+        <w:rPr>
+          <w:rFonts w:ascii="Book Antiqua" w:hAnsi="Book Antiqua"/>
+          <w:b/>
+          <w:bCs/>
+        </w:rPr>
+        <w:t>Documentation</w:t>
+      </w:r>
+      <w:proofErr w:type="spellEnd"/>
+      <w:r>
+        <w:rPr>
+          <w:rFonts w:ascii="Book Antiqua" w:hAnsi="Book Antiqua"/>
+          <w:b/>
+          <w:bCs/>
+        </w:rPr>
+        <w:t>:</w:t>
+      </w:r>
+      <w:r>
+        <w:rPr>
+          <w:rFonts w:ascii="Book Antiqua" w:hAnsi="Book Antiqua"/>
+        </w:rPr>
+        <w:t> </w:t>
+      </w:r>
+      <w:r>
+        <w:rPr>
+          <w:rFonts w:ascii="Book Antiqua" w:hAnsi="Book Antiqua"/>
+          <w:i/>
+          <w:iCs/>
+        </w:rPr>
+        <w:t>AWS WAF Bot Control</w:t>
+      </w:r>
+      <w:r>
+        <w:rPr>
+          <w:rFonts w:ascii="Book Antiqua" w:hAnsi="Book Antiqua"/>
+        </w:rPr>
+        <w:t> (Sobre por qué se bloquean clientes HTTP simples).</w:t>
+      </w:r>
+    </w:p>
+    <w:p>
+      <w:pPr>
+        <w:numPr>
+          <w:ilvl w:val="0"/>
+          <w:numId w:val="2"/>
+        </w:numPr>
+        <w:rPr>
+          <w:rFonts w:ascii="Book Antiqua" w:hAnsi="Book Antiqua"/>
+        </w:rPr>
+      </w:pPr>
+      <w:r>
+        <w:rPr>
+          <w:rFonts w:ascii="Book Antiqua" w:hAnsi="Book Antiqua"/>
+          <w:b/>
+          <w:bCs/>
+        </w:rPr>
+        <w:t xml:space="preserve">Wikipedia </w:t>
+      </w:r>
+      <w:proofErr w:type="spellStart"/>
+      <w:r>
+        <w:rPr>
+          <w:rFonts w:ascii="Book Antiqua" w:hAnsi="Book Antiqua"/>
+          <w:b/>
+          <w:bCs/>
+        </w:rPr>
+        <w:t>Official</w:t>
+      </w:r>
+      <w:proofErr w:type="spellEnd"/>
+      <w:r>
+        <w:rPr>
+          <w:rFonts w:ascii="Book Antiqua" w:hAnsi="Book Antiqua"/>
+          <w:b/>
+          <w:bCs/>
+        </w:rPr>
+        <w:t xml:space="preserve"> </w:t>
+      </w:r>
+      <w:proofErr w:type="spellStart"/>
+      <w:r>
+        <w:rPr>
+          <w:rFonts w:ascii="Book Antiqua" w:hAnsi="Book Antiqua"/>
+          <w:b/>
+          <w:bCs/>
+        </w:rPr>
+        <w:t>Article</w:t>
+      </w:r>
+      <w:proofErr w:type="spellEnd"/>
+      <w:r>
+        <w:rPr>
+          <w:rFonts w:ascii="Book Antiqua" w:hAnsi="Book Antiqua"/>
+          <w:b/>
+          <w:bCs/>
+        </w:rPr>
+        <w:t>:</w:t>
+      </w:r>
+      <w:r>
+        <w:rPr>
+          <w:rFonts w:ascii="Book Antiqua" w:hAnsi="Book Antiqua"/>
+        </w:rPr>
+        <w:t> </w:t>
+      </w:r>
+      <w:r>
+        <w:rPr>
+          <w:rFonts w:ascii="Book Antiqua" w:hAnsi="Book Antiqua"/>
+          <w:i/>
+          <w:iCs/>
+        </w:rPr>
+        <w:t xml:space="preserve">Web </w:t>
+      </w:r>
+      <w:proofErr w:type="spellStart"/>
+      <w:r>
+        <w:rPr>
+          <w:rFonts w:ascii="Book Antiqua" w:hAnsi="Book Antiqua"/>
+          <w:i/>
+          <w:iCs/>
+        </w:rPr>
+        <w:t>Scraping</w:t>
+      </w:r>
+      <w:proofErr w:type="spellEnd"/>
+      <w:r>
+        <w:rPr>
+          <w:rFonts w:ascii="Book Antiqua" w:hAnsi="Book Antiqua"/>
+        </w:rPr>
+        <w:t xml:space="preserve"> (Menciona a </w:t>
+      </w:r>
+      <w:proofErr w:type="spellStart"/>
+      <w:r>
+        <w:rPr>
+          <w:rFonts w:ascii="Book Antiqua" w:hAnsi="Book Antiqua"/>
+        </w:rPr>
+        <w:t>Selenium</w:t>
+      </w:r>
+      <w:proofErr w:type="spellEnd"/>
+      <w:r>
+        <w:rPr>
+          <w:rFonts w:ascii="Book Antiqua" w:hAnsi="Book Antiqua"/>
+        </w:rPr>
+        <w:t xml:space="preserve"> como herramienta para carga completa de DOM).</w:t>
+      </w:r>
+    </w:p>
+    <w:p>
+      <w:pPr>
+        <w:numPr>
+          <w:ilvl w:val="0"/>
+          <w:numId w:val="2"/>
+        </w:numPr>
+        <w:rPr>
+          <w:rFonts w:ascii="Book Antiqua" w:hAnsi="Book Antiqua"/>
+        </w:rPr>
+      </w:pPr>
+      <w:r>
+        <w:rPr>
+          <w:rFonts w:ascii="Book Antiqua" w:hAnsi="Book Antiqua"/>
+          <w:b/>
+          <w:bCs/>
+        </w:rPr>
+        <w:lastRenderedPageBreak/>
+        <w:t xml:space="preserve">Medium </w:t>
+      </w:r>
+      <w:proofErr w:type="spellStart"/>
+      <w:r>
+        <w:rPr>
+          <w:rFonts w:ascii="Book Antiqua" w:hAnsi="Book Antiqua"/>
+          <w:b/>
+          <w:bCs/>
+        </w:rPr>
+        <w:t>Engineering</w:t>
+      </w:r>
+      <w:proofErr w:type="spellEnd"/>
+      <w:r>
+        <w:rPr>
+          <w:rFonts w:ascii="Book Antiqua" w:hAnsi="Book Antiqua"/>
+          <w:b/>
+          <w:bCs/>
+        </w:rPr>
+        <w:t>:</w:t>
+      </w:r>
+      <w:r>
+        <w:rPr>
+          <w:rFonts w:ascii="Book Antiqua" w:hAnsi="Book Antiqua"/>
+        </w:rPr>
+        <w:t> </w:t>
+      </w:r>
+      <w:proofErr w:type="spellStart"/>
+      <w:r>
+        <w:rPr>
+          <w:rFonts w:ascii="Book Antiqua" w:hAnsi="Book Antiqua"/>
+          <w:i/>
+          <w:iCs/>
+        </w:rPr>
+        <w:t>Scraping</w:t>
+      </w:r>
+      <w:proofErr w:type="spellEnd"/>
+      <w:r>
+        <w:rPr>
+          <w:rFonts w:ascii="Book Antiqua" w:hAnsi="Book Antiqua"/>
+          <w:i/>
+          <w:iCs/>
+        </w:rPr>
+        <w:t xml:space="preserve"> </w:t>
+      </w:r>
+      <w:proofErr w:type="spellStart"/>
+      <w:r>
+        <w:rPr>
+          <w:rFonts w:ascii="Book Antiqua" w:hAnsi="Book Antiqua"/>
+          <w:i/>
+          <w:iCs/>
+        </w:rPr>
+        <w:t>from</w:t>
+      </w:r>
+      <w:proofErr w:type="spellEnd"/>
+      <w:r>
+        <w:rPr>
+          <w:rFonts w:ascii="Book Antiqua" w:hAnsi="Book Antiqua"/>
+          <w:i/>
+          <w:iCs/>
+        </w:rPr>
+        <w:t xml:space="preserve"> Wikipedia </w:t>
+      </w:r>
+      <w:proofErr w:type="spellStart"/>
+      <w:r>
+        <w:rPr>
+          <w:rFonts w:ascii="Book Antiqua" w:hAnsi="Book Antiqua"/>
+          <w:i/>
+          <w:iCs/>
+        </w:rPr>
+        <w:t>using</w:t>
+      </w:r>
+      <w:proofErr w:type="spellEnd"/>
+      <w:r>
+        <w:rPr>
+          <w:rFonts w:ascii="Book Antiqua" w:hAnsi="Book Antiqua"/>
+          <w:i/>
+          <w:iCs/>
+        </w:rPr>
+        <w:t xml:space="preserve"> Python and </w:t>
+      </w:r>
+      <w:proofErr w:type="spellStart"/>
+      <w:r>
+        <w:rPr>
+          <w:rFonts w:ascii="Book Antiqua" w:hAnsi="Book Antiqua"/>
+          <w:i/>
+          <w:iCs/>
+        </w:rPr>
+        <w:t>Selenium</w:t>
+      </w:r>
+      <w:proofErr w:type="spellEnd"/>
+      <w:r>
+        <w:rPr>
+          <w:rFonts w:ascii="Book Antiqua" w:hAnsi="Book Antiqua"/>
+        </w:rPr>
+        <w:t> (Caso de uso práctico y necesidad de JS).</w:t>
+      </w:r>
+    </w:p>
+    <w:p>
+      <w:pPr>
+        <w:rPr>
+          <w:rFonts w:ascii="Book Antiqua" w:hAnsi="Book Antiqua"/>
+        </w:rPr>
+      </w:pPr>
+    </w:p>
+    <w:p>
+      <w:pPr>
+        <w:rPr>
+          <w:rFonts w:ascii="Book Antiqua" w:hAnsi="Book Antiqua"/>
+        </w:rPr>
+      </w:pPr>
+    </w:p>
+    <w:p>
+      <w:pPr>
+        <w:rPr>
+          <w:rFonts w:ascii="Book Antiqua" w:hAnsi="Book Antiqua"/>
+        </w:rPr>
+      </w:pPr>
+    </w:p>
+    <w:p>
+      <w:pPr>
         <w:pStyle w:val="Heading1"/>
       </w:pPr>
       <w:r>
@@ -479,22 +1043,39 @@
       <w:pPr>
         <w:rPr>
           <w:rFonts w:ascii="Book Antiqua" w:hAnsi="Book Antiqua"/>
-          <w:lang w:val="en-US"/>
-        </w:rPr>
-      </w:pPr>
-      <w:proofErr w:type="spellStart"/>
-      <w:r>
-        <w:rPr>
-          <w:rFonts w:ascii="Book Antiqua" w:hAnsi="Book Antiqua"/>
-          <w:lang w:val="en-US"/>
-        </w:rPr>
-        <w:t>Instalar</w:t>
-      </w:r>
-      <w:proofErr w:type="spellEnd"/>
-      <w:r>
-        <w:rPr>
-          <w:rFonts w:ascii="Book Antiqua" w:hAnsi="Book Antiqua"/>
-          <w:lang w:val="en-US"/>
+        </w:rPr>
+      </w:pPr>
+      <w:r>
+        <w:rPr>
+          <w:rFonts w:ascii="Book Antiqua" w:hAnsi="Book Antiqua"/>
+        </w:rPr>
+        <w:t xml:space="preserve">Instalar </w:t>
+      </w:r>
+      <w:proofErr w:type="spellStart"/>
+      <w:r>
+        <w:rPr>
+          <w:rFonts w:ascii="Book Antiqua" w:hAnsi="Book Antiqua"/>
+        </w:rPr>
+        <w:t>fitz</w:t>
+      </w:r>
+      <w:proofErr w:type="spellEnd"/>
+      <w:r>
+        <w:rPr>
+          <w:rFonts w:ascii="Book Antiqua" w:hAnsi="Book Antiqua"/>
+        </w:rPr>
+        <w:t xml:space="preserve">: </w:t>
+      </w:r>
+      <w:proofErr w:type="spellStart"/>
+      <w:r>
+        <w:rPr>
+          <w:rFonts w:ascii="Book Antiqua" w:hAnsi="Book Antiqua"/>
+        </w:rPr>
+        <w:t>pip</w:t>
+      </w:r>
+      <w:proofErr w:type="spellEnd"/>
+      <w:r>
+        <w:rPr>
+          <w:rFonts w:ascii="Book Antiqua" w:hAnsi="Book Antiqua"/>
         </w:rPr>
         <w:t xml:space="preserve"> </w:t>
       </w:r>
@@ -502,23 +1083,34 @@
       <w:r>
         <w:rPr>
           <w:rFonts w:ascii="Book Antiqua" w:hAnsi="Book Antiqua"/>
-          <w:lang w:val="en-US"/>
-        </w:rPr>
-        <w:t>fitz</w:t>
-      </w:r>
-      <w:proofErr w:type="spellEnd"/>
-      <w:r>
-        <w:rPr>
-          <w:rFonts w:ascii="Book Antiqua" w:hAnsi="Book Antiqua"/>
-          <w:lang w:val="en-US"/>
-        </w:rPr>
-        <w:t xml:space="preserve">: pip install --upgrade </w:t>
-      </w:r>
-      <w:proofErr w:type="spellStart"/>
-      <w:r>
-        <w:rPr>
-          <w:rFonts w:ascii="Book Antiqua" w:hAnsi="Book Antiqua"/>
-          <w:lang w:val="en-US"/>
+        </w:rPr>
+        <w:t>install</w:t>
+      </w:r>
+      <w:proofErr w:type="spellEnd"/>
+      <w:r>
+        <w:rPr>
+          <w:rFonts w:ascii="Book Antiqua" w:hAnsi="Book Antiqua"/>
+        </w:rPr>
+        <w:t xml:space="preserve"> --</w:t>
+      </w:r>
+      <w:proofErr w:type="spellStart"/>
+      <w:r>
+        <w:rPr>
+          <w:rFonts w:ascii="Book Antiqua" w:hAnsi="Book Antiqua"/>
+        </w:rPr>
+        <w:t>upgrade</w:t>
+      </w:r>
+      <w:proofErr w:type="spellEnd"/>
+      <w:r>
+        <w:rPr>
+          <w:rFonts w:ascii="Book Antiqua" w:hAnsi="Book Antiqua"/>
+        </w:rPr>
+        <w:t xml:space="preserve"> </w:t>
+      </w:r>
+      <w:proofErr w:type="spellStart"/>
+      <w:r>
+        <w:rPr>
+          <w:rFonts w:ascii="Book Antiqua" w:hAnsi="Book Antiqua"/>
         </w:rPr>
         <w:t>pymupdf</w:t>
       </w:r>
@@ -526,16 +1118,14 @@
       <w:r>
         <w:rPr>
           <w:rFonts w:ascii="Book Antiqua" w:hAnsi="Book Antiqua"/>
-          <w:lang w:val="en-US"/>
         </w:rPr>
         <w:t xml:space="preserve"> (</w:t>
       </w:r>
-      <w:hyperlink r:id="rId5" w:history="1">
+      <w:hyperlink r:id="rId6" w:history="1">
         <w:r>
           <w:rPr>
             <w:rStyle w:val="Hyperlink"/>
             <w:rFonts w:ascii="Book Antiqua" w:hAnsi="Book Antiqua"/>
-            <w:lang w:val="en-US"/>
           </w:rPr>
           <w:t>https://pymupdf.readthedocs.io/en/latest/index.html</w:t>
         </w:r>
@@ -543,7 +1133,6 @@
       <w:r>
         <w:rPr>
           <w:rFonts w:ascii="Book Antiqua" w:hAnsi="Book Antiqua"/>
-          <w:lang w:val="en-US"/>
         </w:rPr>
         <w:t>)</w:t>
       </w:r>
@@ -651,6 +1240,36 @@
         </w:pBdr>
         <w:rPr>
           <w:rFonts w:ascii="Book Antiqua" w:hAnsi="Book Antiqua"/>
+        </w:rPr>
+      </w:pPr>
+    </w:p>
+    <w:p>
+      <w:pPr>
+        <w:pBdr>
+          <w:bottom w:val="single" w:sz="12" w:space="1" w:color="auto"/>
+        </w:pBdr>
+        <w:rPr>
+          <w:rFonts w:ascii="Book Antiqua" w:hAnsi="Book Antiqua"/>
+        </w:rPr>
+      </w:pPr>
+    </w:p>
+    <w:p>
+      <w:pPr>
+        <w:pBdr>
+          <w:bottom w:val="single" w:sz="12" w:space="1" w:color="auto"/>
+        </w:pBdr>
+        <w:rPr>
+          <w:rFonts w:ascii="Book Antiqua" w:hAnsi="Book Antiqua"/>
+        </w:rPr>
+      </w:pPr>
+    </w:p>
+    <w:p>
+      <w:pPr>
+        <w:pBdr>
+          <w:bottom w:val="single" w:sz="12" w:space="1" w:color="auto"/>
+        </w:pBdr>
+        <w:rPr>
+          <w:rFonts w:ascii="Book Antiqua" w:hAnsi="Book Antiqua"/>
           <w:b/>
           <w:bCs/>
           <w:u w:val="single"/>
@@ -757,7 +1376,6 @@
         <w:rPr>
           <w:rFonts w:ascii="Book Antiqua" w:hAnsi="Book Antiqua"/>
         </w:rPr>
-        <w:lastRenderedPageBreak/>
         <w:t>Ahora sí, vamos a ver cómo partir la información con sentido para poder usarla en el sistema RAG.</w:t>
       </w:r>
     </w:p>
@@ -1103,47 +1721,40 @@
           <w:rFonts w:ascii="Book Antiqua" w:hAnsi="Book Antiqua"/>
           <w:lang w:val="en-US"/>
         </w:rPr>
-        <w:t xml:space="preserve"> framework p</w:t>
-      </w:r>
+        <w:t xml:space="preserve"> framework powers: </w:t>
+      </w:r>
+      <w:proofErr w:type="spellStart"/>
       <w:r>
         <w:rPr>
           <w:rFonts w:ascii="Book Antiqua" w:hAnsi="Book Antiqua"/>
           <w:lang w:val="en-US"/>
         </w:rPr>
-        <w:t xml:space="preserve">owers: </w:t>
-      </w:r>
-      <w:proofErr w:type="spellStart"/>
+        <w:t>GraphRAG</w:t>
+      </w:r>
+      <w:proofErr w:type="spellEnd"/>
       <w:r>
         <w:rPr>
           <w:rFonts w:ascii="Book Antiqua" w:hAnsi="Book Antiqua"/>
           <w:lang w:val="en-US"/>
         </w:rPr>
-        <w:t>GraphRAG</w:t>
-      </w:r>
-      <w:proofErr w:type="spellEnd"/>
-      <w:r>
+        <w:t>, AI Agents, Multi-Agent Systems</w:t>
+      </w:r>
+    </w:p>
+    <w:p>
+      <w:pPr>
         <w:rPr>
           <w:rFonts w:ascii="Book Antiqua" w:hAnsi="Book Antiqua"/>
           <w:lang w:val="en-US"/>
         </w:rPr>
-        <w:t>, AI Agents, Multi-Agent Systems</w:t>
-      </w:r>
-    </w:p>
-    <w:p>
-      <w:pPr>
-        <w:rPr>
-          <w:rFonts w:ascii="Book Antiqua" w:hAnsi="Book Antiqua"/>
-          <w:lang w:val="en-US"/>
-        </w:rPr>
-      </w:pPr>
-    </w:p>
-    <w:p>
-      <w:pPr>
-        <w:rPr>
-          <w:rFonts w:ascii="Book Antiqua" w:hAnsi="Book Antiqua"/>
-        </w:rPr>
-      </w:pPr>
-      <w:hyperlink r:id="rId6" w:history="1">
+      </w:pPr>
+    </w:p>
+    <w:p>
+      <w:pPr>
+        <w:rPr>
+          <w:rFonts w:ascii="Book Antiqua" w:hAnsi="Book Antiqua"/>
+        </w:rPr>
+      </w:pPr>
+      <w:hyperlink r:id="rId7" w:history="1">
         <w:r>
           <w:rPr>
             <w:rStyle w:val="Hyperlink"/>
@@ -1246,6 +1857,274 @@
     </w:p>
     <w:p/>
     <w:p/>
+    <w:p/>
+    <w:p/>
+    <w:p/>
+    <w:p/>
+    <w:p>
+      <w:proofErr w:type="spellStart"/>
+      <w:r>
+        <w:t>isDeleted</w:t>
+      </w:r>
+      <w:proofErr w:type="spellEnd"/>
+      <w:r>
+        <w:t xml:space="preserve"> = true para que no se suban los </w:t>
+      </w:r>
+      <w:proofErr w:type="spellStart"/>
+      <w:r>
+        <w:t>docs</w:t>
+      </w:r>
+      <w:proofErr w:type="spellEnd"/>
+      <w:r>
+        <w:t xml:space="preserve"> al </w:t>
+      </w:r>
+      <w:proofErr w:type="spellStart"/>
+      <w:r>
+        <w:t>index</w:t>
+      </w:r>
+      <w:proofErr w:type="spellEnd"/>
+      <w:r>
+        <w:t xml:space="preserve"> y se borre el índice que existía</w:t>
+      </w:r>
+    </w:p>
+    <w:p>
+      <w:proofErr w:type="spellStart"/>
+      <w:r>
+        <w:t>search</w:t>
+      </w:r>
+      <w:proofErr w:type="spellEnd"/>
+      <w:r>
+        <w:t xml:space="preserve"> </w:t>
+      </w:r>
+      <w:proofErr w:type="spellStart"/>
+      <w:r>
+        <w:t>service</w:t>
+      </w:r>
+      <w:proofErr w:type="spellEnd"/>
+      <w:r>
+        <w:t xml:space="preserve"> (</w:t>
+      </w:r>
+      <w:proofErr w:type="spellStart"/>
+      <w:r>
+        <w:t>azsearch</w:t>
+      </w:r>
+      <w:proofErr w:type="spellEnd"/>
+      <w:r>
+        <w:t xml:space="preserve">) &gt; crear data </w:t>
+      </w:r>
+      <w:proofErr w:type="spellStart"/>
+      <w:r>
+        <w:t>source</w:t>
+      </w:r>
+      <w:proofErr w:type="spellEnd"/>
+      <w:r>
+        <w:t xml:space="preserve"> que apunte a un cosmos</w:t>
+      </w:r>
+      <w:r>
+        <w:t xml:space="preserve"> </w:t>
+      </w:r>
+      <w:proofErr w:type="spellStart"/>
+      <w:r>
+        <w:t>db</w:t>
+      </w:r>
+      <w:proofErr w:type="spellEnd"/>
+      <w:r>
+        <w:t xml:space="preserve"> (donde se guardan los </w:t>
+      </w:r>
+      <w:proofErr w:type="spellStart"/>
+      <w:r>
+        <w:t>json</w:t>
+      </w:r>
+      <w:proofErr w:type="spellEnd"/>
+      <w:r>
+        <w:t xml:space="preserve"> de los </w:t>
+      </w:r>
+      <w:proofErr w:type="spellStart"/>
+      <w:r>
+        <w:t>chunks</w:t>
+      </w:r>
+      <w:proofErr w:type="spellEnd"/>
+      <w:r>
+        <w:t xml:space="preserve">, como un </w:t>
+      </w:r>
+      <w:proofErr w:type="spellStart"/>
+      <w:r>
+        <w:t>mongodb</w:t>
+      </w:r>
+      <w:proofErr w:type="spellEnd"/>
+      <w:r>
+        <w:t xml:space="preserve">). Al crearlo, marcar </w:t>
+      </w:r>
+      <w:proofErr w:type="spellStart"/>
+      <w:r>
+        <w:t>enable</w:t>
+      </w:r>
+      <w:proofErr w:type="spellEnd"/>
+      <w:r>
+        <w:t xml:space="preserve"> </w:t>
+      </w:r>
+      <w:proofErr w:type="spellStart"/>
+      <w:r>
+        <w:t>deletion</w:t>
+      </w:r>
+      <w:proofErr w:type="spellEnd"/>
+      <w:r>
+        <w:t xml:space="preserve"> tracking para que funcione lo de </w:t>
+      </w:r>
+      <w:proofErr w:type="spellStart"/>
+      <w:r>
+        <w:t>isDeleted</w:t>
+      </w:r>
+      <w:proofErr w:type="spellEnd"/>
+    </w:p>
+    <w:p/>
+    <w:p>
+      <w:r>
+        <w:t>Creamos ahora el índice: (</w:t>
+      </w:r>
+      <w:proofErr w:type="spellStart"/>
+      <w:r>
+        <w:t>search</w:t>
+      </w:r>
+      <w:proofErr w:type="spellEnd"/>
+      <w:r>
+        <w:t xml:space="preserve"> </w:t>
+      </w:r>
+      <w:proofErr w:type="spellStart"/>
+      <w:r>
+        <w:t>management</w:t>
+      </w:r>
+      <w:proofErr w:type="spellEnd"/>
+      <w:r>
+        <w:t xml:space="preserve"> &gt; indexes)</w:t>
+      </w:r>
+    </w:p>
+    <w:p>
+      <w:pPr>
+        <w:pStyle w:val="ListParagraph"/>
+        <w:numPr>
+          <w:ilvl w:val="0"/>
+          <w:numId w:val="1"/>
+        </w:numPr>
+      </w:pPr>
+      <w:r>
+        <w:t xml:space="preserve">O </w:t>
+      </w:r>
+      <w:proofErr w:type="spellStart"/>
+      <w:r>
+        <w:t>bn</w:t>
+      </w:r>
+      <w:proofErr w:type="spellEnd"/>
+      <w:r>
+        <w:t xml:space="preserve"> copiar estructura del </w:t>
+      </w:r>
+      <w:proofErr w:type="spellStart"/>
+      <w:r>
+        <w:t>json</w:t>
+      </w:r>
+      <w:proofErr w:type="spellEnd"/>
+      <w:r>
+        <w:t xml:space="preserve"> de un índice existente para configurar búsquedas vectorial y semántica (en esta especificar los campos por los que quieres busca)</w:t>
+      </w:r>
+    </w:p>
+    <w:p>
+      <w:pPr>
+        <w:pStyle w:val="ListParagraph"/>
+        <w:numPr>
+          <w:ilvl w:val="0"/>
+          <w:numId w:val="1"/>
+        </w:numPr>
+      </w:pPr>
+      <w:r>
+        <w:t>Crear de 0 (no)</w:t>
+      </w:r>
+    </w:p>
+    <w:p/>
+    <w:p>
+      <w:r>
+        <w:t xml:space="preserve">Una vez creados índice y </w:t>
+      </w:r>
+      <w:proofErr w:type="spellStart"/>
+      <w:r>
+        <w:t>datasource</w:t>
+      </w:r>
+      <w:proofErr w:type="spellEnd"/>
+      <w:r>
+        <w:t xml:space="preserve">, crear </w:t>
+      </w:r>
+      <w:proofErr w:type="spellStart"/>
+      <w:r>
+        <w:t>idexer</w:t>
+      </w:r>
+      <w:proofErr w:type="spellEnd"/>
+      <w:r>
+        <w:t xml:space="preserve"> que hace de puente entre ambos</w:t>
+      </w:r>
+    </w:p>
+    <w:p>
+      <w:proofErr w:type="spellStart"/>
+      <w:r>
+        <w:t>Autoindexación</w:t>
+      </w:r>
+      <w:proofErr w:type="spellEnd"/>
+      <w:r>
+        <w:t xml:space="preserve">: que se ejecute automáticamente el </w:t>
+      </w:r>
+      <w:proofErr w:type="spellStart"/>
+      <w:r>
+        <w:t>indexer</w:t>
+      </w:r>
+      <w:proofErr w:type="spellEnd"/>
+      <w:r>
+        <w:t xml:space="preserve"> cada x tiempo. Más fácil hacer </w:t>
+      </w:r>
+      <w:proofErr w:type="spellStart"/>
+      <w:r>
+        <w:t>trigger</w:t>
+      </w:r>
+      <w:proofErr w:type="spellEnd"/>
+      <w:r>
+        <w:t xml:space="preserve"> del </w:t>
+      </w:r>
+      <w:proofErr w:type="spellStart"/>
+      <w:r>
+        <w:t>indexer</w:t>
+      </w:r>
+      <w:proofErr w:type="spellEnd"/>
+      <w:r>
+        <w:t xml:space="preserve"> (llamarlo a través de código cuando lo necesite)</w:t>
+      </w:r>
+    </w:p>
+    <w:p/>
+    <w:p>
+      <w:r>
+        <w:t xml:space="preserve">En el índice, </w:t>
+      </w:r>
+      <w:proofErr w:type="spellStart"/>
+      <w:r>
+        <w:t>scoring</w:t>
+      </w:r>
+      <w:proofErr w:type="spellEnd"/>
+      <w:r>
+        <w:t xml:space="preserve"> </w:t>
+      </w:r>
+      <w:proofErr w:type="spellStart"/>
+      <w:r>
+        <w:t>profiles</w:t>
+      </w:r>
+      <w:proofErr w:type="spellEnd"/>
+      <w:r>
+        <w:t xml:space="preserve">, se puede asignar pesos a los campos a </w:t>
+      </w:r>
+      <w:proofErr w:type="spellStart"/>
+      <w:r>
+        <w:t>bscar</w:t>
+      </w:r>
+      <w:proofErr w:type="spellEnd"/>
+      <w:r>
+        <w:t xml:space="preserve"> (no va muy allá)</w:t>
+      </w:r>
+    </w:p>
     <w:sectPr>
       <w:pgSz w:w="11906" w:h="16838"/>
       <w:pgMar w:top="1417" w:right="1701" w:bottom="1417" w:left="1701" w:header="708" w:footer="708" w:gutter="0"/>
@@ -1370,8 +2249,124 @@
       </w:rPr>
     </w:lvl>
   </w:abstractNum>
+  <w:abstractNum w:abstractNumId="1" w15:restartNumberingAfterBreak="0">
+    <w:nsid w:val="425329E2"/>
+    <w:multiLevelType w:val="multilevel"/>
+    <w:tmpl w:val="F47835D8"/>
+    <w:lvl w:ilvl="0">
+      <w:start w:val="1"/>
+      <w:numFmt w:val="decimal"/>
+      <w:lvlText w:val="%1."/>
+      <w:lvlJc w:val="left"/>
+      <w:pPr>
+        <w:tabs>
+          <w:tab w:val="num" w:pos="720"/>
+        </w:tabs>
+        <w:ind w:left="720" w:hanging="360"/>
+      </w:pPr>
+    </w:lvl>
+    <w:lvl w:ilvl="1" w:tentative="1">
+      <w:start w:val="1"/>
+      <w:numFmt w:val="decimal"/>
+      <w:lvlText w:val="%2."/>
+      <w:lvlJc w:val="left"/>
+      <w:pPr>
+        <w:tabs>
+          <w:tab w:val="num" w:pos="1440"/>
+        </w:tabs>
+        <w:ind w:left="1440" w:hanging="360"/>
+      </w:pPr>
+    </w:lvl>
+    <w:lvl w:ilvl="2" w:tentative="1">
+      <w:start w:val="1"/>
+      <w:numFmt w:val="decimal"/>
+      <w:lvlText w:val="%3."/>
+      <w:lvlJc w:val="left"/>
+      <w:pPr>
+        <w:tabs>
+          <w:tab w:val="num" w:pos="2160"/>
+        </w:tabs>
+        <w:ind w:left="2160" w:hanging="360"/>
+      </w:pPr>
+    </w:lvl>
+    <w:lvl w:ilvl="3" w:tentative="1">
+      <w:start w:val="1"/>
+      <w:numFmt w:val="decimal"/>
+      <w:lvlText w:val="%4."/>
+      <w:lvlJc w:val="left"/>
+      <w:pPr>
+        <w:tabs>
+          <w:tab w:val="num" w:pos="2880"/>
+        </w:tabs>
+        <w:ind w:left="2880" w:hanging="360"/>
+      </w:pPr>
+    </w:lvl>
+    <w:lvl w:ilvl="4" w:tentative="1">
+      <w:start w:val="1"/>
+      <w:numFmt w:val="decimal"/>
+      <w:lvlText w:val="%5."/>
+      <w:lvlJc w:val="left"/>
+      <w:pPr>
+        <w:tabs>
+          <w:tab w:val="num" w:pos="3600"/>
+        </w:tabs>
+        <w:ind w:left="3600" w:hanging="360"/>
+      </w:pPr>
+    </w:lvl>
+    <w:lvl w:ilvl="5" w:tentative="1">
+      <w:start w:val="1"/>
+      <w:numFmt w:val="decimal"/>
+      <w:lvlText w:val="%6."/>
+      <w:lvlJc w:val="left"/>
+      <w:pPr>
+        <w:tabs>
+          <w:tab w:val="num" w:pos="4320"/>
+        </w:tabs>
+        <w:ind w:left="4320" w:hanging="360"/>
+      </w:pPr>
+    </w:lvl>
+    <w:lvl w:ilvl="6" w:tentative="1">
+      <w:start w:val="1"/>
+      <w:numFmt w:val="decimal"/>
+      <w:lvlText w:val="%7."/>
+      <w:lvlJc w:val="left"/>
+      <w:pPr>
+        <w:tabs>
+          <w:tab w:val="num" w:pos="5040"/>
+        </w:tabs>
+        <w:ind w:left="5040" w:hanging="360"/>
+      </w:pPr>
+    </w:lvl>
+    <w:lvl w:ilvl="7" w:tentative="1">
+      <w:start w:val="1"/>
+      <w:numFmt w:val="decimal"/>
+      <w:lvlText w:val="%8."/>
+      <w:lvlJc w:val="left"/>
+      <w:pPr>
+        <w:tabs>
+          <w:tab w:val="num" w:pos="5760"/>
+        </w:tabs>
+        <w:ind w:left="5760" w:hanging="360"/>
+      </w:pPr>
+    </w:lvl>
+    <w:lvl w:ilvl="8" w:tentative="1">
+      <w:start w:val="1"/>
+      <w:numFmt w:val="decimal"/>
+      <w:lvlText w:val="%9."/>
+      <w:lvlJc w:val="left"/>
+      <w:pPr>
+        <w:tabs>
+          <w:tab w:val="num" w:pos="6480"/>
+        </w:tabs>
+        <w:ind w:left="6480" w:hanging="360"/>
+      </w:pPr>
+    </w:lvl>
+  </w:abstractNum>
   <w:num w:numId="1" w16cid:durableId="1518496749">
     <w:abstractNumId w:val="0"/>
+  </w:num>
+  <w:num w:numId="2" w16cid:durableId="219756876">
+    <w:abstractNumId w:val="1"/>
   </w:num>
 </w:numbering>
 </file>
@@ -2613,4 +3608,16 @@
     </a:ext>
   </a:extLst>
 </a:theme>
+</file>
+
+<file path=customXml/item1.xml><?xml version="1.0" encoding="utf-8"?>
+<b:Sources xmlns:b="http://schemas.openxmlformats.org/officeDocument/2006/bibliography" xmlns="http://schemas.openxmlformats.org/officeDocument/2006/bibliography" SelectedStyle="\APASixthEditionOfficeOnline.xsl" StyleName="APA" Version="6"/>
+</file>
+
+<file path=customXml/itemProps1.xml><?xml version="1.0" encoding="utf-8"?>
+<ds:datastoreItem xmlns:ds="http://schemas.openxmlformats.org/officeDocument/2006/customXml" ds:itemID="{74567588-A405-4ACA-9F02-B16F27D8B840}">
+  <ds:schemaRefs>
+    <ds:schemaRef ds:uri="http://schemas.openxmlformats.org/officeDocument/2006/bibliography"/>
+  </ds:schemaRefs>
+</ds:datastoreItem>
 </file>
</xml_diff>

<commit_message>
Add document ingestion runners for CVs, EU regulations, and Wikipedia articles
- Implement `run_cvs.py` for chunking CV JSON documents from Azure Blob Storage.
- Implement `run_eu.py` for processing EU regulatory documents with support for formula extraction.
- Create `run_wikipedia.py` for chunking Wikipedia articles in JSON and TXT formats.
- Introduce `run_utils.py` for shared utilities across document ingestion runners.
- Add `wikipedia_text_split.py` for future Wikipedia article chunking functionality.
- Implement `azure_storage_service.py` for Azure Blob Storage operations including upload, download, and listing JSON configurations.
</commit_message>
<xml_diff>
--- a/doc/Memoria supongo.docx
+++ b/doc/Memoria supongo.docx
@@ -44,7 +44,7 @@
     </w:p>
     <w:p>
       <w:pPr>
-        <w:pStyle w:val="ListParagraph"/>
+        <w:pStyle w:val="Prrafodelista"/>
         <w:numPr>
           <w:ilvl w:val="0"/>
           <w:numId w:val="1"/>
@@ -62,7 +62,7 @@
     </w:p>
     <w:p>
       <w:pPr>
-        <w:pStyle w:val="ListParagraph"/>
+        <w:pStyle w:val="Prrafodelista"/>
         <w:numPr>
           <w:ilvl w:val="0"/>
           <w:numId w:val="1"/>
@@ -183,7 +183,7 @@
     </w:p>
     <w:p>
       <w:pPr>
-        <w:pStyle w:val="ListParagraph"/>
+        <w:pStyle w:val="Prrafodelista"/>
         <w:numPr>
           <w:ilvl w:val="0"/>
           <w:numId w:val="1"/>
@@ -237,16 +237,31 @@
         <w:t>para grafos de conocimiento dinámicos</w:t>
       </w:r>
     </w:p>
+    <w:p>
+      <w:pPr>
+        <w:rPr>
+          <w:rFonts w:ascii="Book Antiqua" w:hAnsi="Book Antiqua"/>
+        </w:rPr>
+      </w:pPr>
+    </w:p>
+    <w:p>
+      <w:pPr>
+        <w:rPr>
+          <w:rFonts w:ascii="Book Antiqua" w:hAnsi="Book Antiqua"/>
+        </w:rPr>
+      </w:pPr>
+    </w:p>
     <w:p/>
-    <w:p>
-      <w:pPr>
-        <w:pStyle w:val="Heading1"/>
-      </w:pPr>
-      <w:r>
-        <w:t>Recopilac</w:t>
-      </w:r>
-      <w:r>
-        <w:t>ión de datos</w:t>
+    <w:p/>
+    <w:p/>
+    <w:p/>
+    <w:p>
+      <w:pPr>
+        <w:pStyle w:val="Ttulo1"/>
+      </w:pPr>
+      <w:r>
+        <w:lastRenderedPageBreak/>
+        <w:t>Recopilación de datos</w:t>
       </w:r>
     </w:p>
     <w:p>
@@ -264,7 +279,7 @@
     </w:p>
     <w:p>
       <w:pPr>
-        <w:pStyle w:val="ListParagraph"/>
+        <w:pStyle w:val="Prrafodelista"/>
         <w:numPr>
           <w:ilvl w:val="0"/>
           <w:numId w:val="1"/>
@@ -324,7 +339,7 @@
     </w:p>
     <w:p>
       <w:pPr>
-        <w:pStyle w:val="ListParagraph"/>
+        <w:pStyle w:val="Prrafodelista"/>
         <w:numPr>
           <w:ilvl w:val="0"/>
           <w:numId w:val="1"/>
@@ -356,7 +371,7 @@
     </w:p>
     <w:p>
       <w:pPr>
-        <w:pStyle w:val="ListParagraph"/>
+        <w:pStyle w:val="Prrafodelista"/>
         <w:numPr>
           <w:ilvl w:val="0"/>
           <w:numId w:val="1"/>
@@ -912,7 +927,6 @@
           <w:b/>
           <w:bCs/>
         </w:rPr>
-        <w:lastRenderedPageBreak/>
         <w:t xml:space="preserve">Medium </w:t>
       </w:r>
       <w:proofErr w:type="spellStart"/>
@@ -1021,21 +1035,96 @@
       <w:pPr>
         <w:rPr>
           <w:rFonts w:ascii="Book Antiqua" w:hAnsi="Book Antiqua"/>
-        </w:rPr>
-      </w:pPr>
-    </w:p>
-    <w:p>
-      <w:pPr>
-        <w:rPr>
-          <w:rFonts w:ascii="Book Antiqua" w:hAnsi="Book Antiqua"/>
-        </w:rPr>
-      </w:pPr>
-    </w:p>
-    <w:p>
-      <w:pPr>
-        <w:pStyle w:val="Heading1"/>
-      </w:pPr>
-      <w:r>
+          <w:u w:val="single"/>
+        </w:rPr>
+      </w:pPr>
+      <w:r>
+        <w:rPr>
+          <w:rFonts w:ascii="Book Antiqua" w:hAnsi="Book Antiqua"/>
+        </w:rPr>
+        <w:t xml:space="preserve">Los datos descargados en local los subimos a Azure Blob Storage </w:t>
+      </w:r>
+      <w:r>
+        <w:rPr>
+          <w:rFonts w:ascii="Book Antiqua" w:hAnsi="Book Antiqua"/>
+          <w:highlight w:val="yellow"/>
+        </w:rPr>
+        <w:t>[DESARROLLAR QUÉ ES</w:t>
+      </w:r>
+      <w:r>
+        <w:rPr>
+          <w:rFonts w:ascii="Book Antiqua" w:hAnsi="Book Antiqua"/>
+          <w:highlight w:val="yellow"/>
+        </w:rPr>
+        <w:t xml:space="preserve">, PARA QUÉ SE USA Y POR QUÉ USAMOS ESO Y NO LO HACEMOS TODO EN LOCAL (lo de que he decidido no hacer el trabajo completamente open </w:t>
+      </w:r>
+      <w:proofErr w:type="spellStart"/>
+      <w:r>
+        <w:rPr>
+          <w:rFonts w:ascii="Book Antiqua" w:hAnsi="Book Antiqua"/>
+          <w:highlight w:val="yellow"/>
+        </w:rPr>
+        <w:t>source</w:t>
+      </w:r>
+      <w:proofErr w:type="spellEnd"/>
+      <w:r>
+        <w:rPr>
+          <w:rFonts w:ascii="Book Antiqua" w:hAnsi="Book Antiqua"/>
+          <w:highlight w:val="yellow"/>
+        </w:rPr>
+        <w:t xml:space="preserve"> porque </w:t>
+      </w:r>
+      <w:r>
+        <w:rPr>
+          <w:rFonts w:ascii="Book Antiqua" w:hAnsi="Book Antiqua"/>
+          <w:highlight w:val="yellow"/>
+        </w:rPr>
+        <w:t xml:space="preserve">tiene más valor empresarial hacer el desarrollo en un entorno realista, ya que normalmente nadie usa una herramienta que sea totalmente open </w:t>
+      </w:r>
+      <w:proofErr w:type="spellStart"/>
+      <w:r>
+        <w:rPr>
+          <w:rFonts w:ascii="Book Antiqua" w:hAnsi="Book Antiqua"/>
+          <w:highlight w:val="yellow"/>
+        </w:rPr>
+        <w:t>source</w:t>
+      </w:r>
+      <w:proofErr w:type="spellEnd"/>
+      <w:r>
+        <w:rPr>
+          <w:rFonts w:ascii="Book Antiqua" w:hAnsi="Book Antiqua"/>
+          <w:highlight w:val="yellow"/>
+        </w:rPr>
+        <w:t>)</w:t>
+      </w:r>
+      <w:r>
+        <w:rPr>
+          <w:rFonts w:ascii="Book Antiqua" w:hAnsi="Book Antiqua"/>
+          <w:highlight w:val="yellow"/>
+        </w:rPr>
+        <w:t>]</w:t>
+      </w:r>
+    </w:p>
+    <w:p>
+      <w:pPr>
+        <w:rPr>
+          <w:rFonts w:ascii="Book Antiqua" w:hAnsi="Book Antiqua"/>
+        </w:rPr>
+      </w:pPr>
+    </w:p>
+    <w:p>
+      <w:pPr>
+        <w:rPr>
+          <w:rFonts w:ascii="Book Antiqua" w:hAnsi="Book Antiqua"/>
+        </w:rPr>
+      </w:pPr>
+    </w:p>
+    <w:p>
+      <w:pPr>
+        <w:pStyle w:val="Ttulo1"/>
+      </w:pPr>
+      <w:r>
+        <w:lastRenderedPageBreak/>
         <w:t>Procesamiento e ingesta documental</w:t>
       </w:r>
     </w:p>
@@ -1043,18 +1132,30 @@
       <w:pPr>
         <w:rPr>
           <w:rFonts w:ascii="Book Antiqua" w:hAnsi="Book Antiqua"/>
-        </w:rPr>
-      </w:pPr>
-      <w:r>
-        <w:rPr>
-          <w:rFonts w:ascii="Book Antiqua" w:hAnsi="Book Antiqua"/>
-        </w:rPr>
-        <w:t xml:space="preserve">Instalar </w:t>
-      </w:r>
-      <w:proofErr w:type="spellStart"/>
-      <w:r>
-        <w:rPr>
-          <w:rFonts w:ascii="Book Antiqua" w:hAnsi="Book Antiqua"/>
+          <w:lang w:val="en-US"/>
+        </w:rPr>
+      </w:pPr>
+      <w:proofErr w:type="spellStart"/>
+      <w:r>
+        <w:rPr>
+          <w:rFonts w:ascii="Book Antiqua" w:hAnsi="Book Antiqua"/>
+          <w:lang w:val="en-US"/>
+        </w:rPr>
+        <w:t>Instalar</w:t>
+      </w:r>
+      <w:proofErr w:type="spellEnd"/>
+      <w:r>
+        <w:rPr>
+          <w:rFonts w:ascii="Book Antiqua" w:hAnsi="Book Antiqua"/>
+          <w:lang w:val="en-US"/>
+        </w:rPr>
+        <w:t xml:space="preserve"> </w:t>
+      </w:r>
+      <w:proofErr w:type="spellStart"/>
+      <w:r>
+        <w:rPr>
+          <w:rFonts w:ascii="Book Antiqua" w:hAnsi="Book Antiqua"/>
+          <w:lang w:val="en-US"/>
         </w:rPr>
         <w:t>fitz</w:t>
       </w:r>
@@ -1062,55 +1163,15 @@
       <w:r>
         <w:rPr>
           <w:rFonts w:ascii="Book Antiqua" w:hAnsi="Book Antiqua"/>
-        </w:rPr>
-        <w:t xml:space="preserve">: </w:t>
-      </w:r>
-      <w:proofErr w:type="spellStart"/>
-      <w:r>
-        <w:rPr>
-          <w:rFonts w:ascii="Book Antiqua" w:hAnsi="Book Antiqua"/>
-        </w:rPr>
-        <w:t>pip</w:t>
-      </w:r>
-      <w:proofErr w:type="spellEnd"/>
-      <w:r>
-        <w:rPr>
-          <w:rFonts w:ascii="Book Antiqua" w:hAnsi="Book Antiqua"/>
-        </w:rPr>
-        <w:t xml:space="preserve"> </w:t>
-      </w:r>
-      <w:proofErr w:type="spellStart"/>
-      <w:r>
-        <w:rPr>
-          <w:rFonts w:ascii="Book Antiqua" w:hAnsi="Book Antiqua"/>
-        </w:rPr>
-        <w:t>install</w:t>
-      </w:r>
-      <w:proofErr w:type="spellEnd"/>
-      <w:r>
-        <w:rPr>
-          <w:rFonts w:ascii="Book Antiqua" w:hAnsi="Book Antiqua"/>
-        </w:rPr>
-        <w:t xml:space="preserve"> --</w:t>
-      </w:r>
-      <w:proofErr w:type="spellStart"/>
-      <w:r>
-        <w:rPr>
-          <w:rFonts w:ascii="Book Antiqua" w:hAnsi="Book Antiqua"/>
-        </w:rPr>
-        <w:t>upgrade</w:t>
-      </w:r>
-      <w:proofErr w:type="spellEnd"/>
-      <w:r>
-        <w:rPr>
-          <w:rFonts w:ascii="Book Antiqua" w:hAnsi="Book Antiqua"/>
-        </w:rPr>
-        <w:t xml:space="preserve"> </w:t>
-      </w:r>
-      <w:proofErr w:type="spellStart"/>
-      <w:r>
-        <w:rPr>
-          <w:rFonts w:ascii="Book Antiqua" w:hAnsi="Book Antiqua"/>
+          <w:lang w:val="en-US"/>
+        </w:rPr>
+        <w:t xml:space="preserve">: pip install --upgrade </w:t>
+      </w:r>
+      <w:proofErr w:type="spellStart"/>
+      <w:r>
+        <w:rPr>
+          <w:rFonts w:ascii="Book Antiqua" w:hAnsi="Book Antiqua"/>
+          <w:lang w:val="en-US"/>
         </w:rPr>
         <w:t>pymupdf</w:t>
       </w:r>
@@ -1118,14 +1179,16 @@
       <w:r>
         <w:rPr>
           <w:rFonts w:ascii="Book Antiqua" w:hAnsi="Book Antiqua"/>
+          <w:lang w:val="en-US"/>
         </w:rPr>
         <w:t xml:space="preserve"> (</w:t>
       </w:r>
       <w:hyperlink r:id="rId6" w:history="1">
         <w:r>
           <w:rPr>
-            <w:rStyle w:val="Hyperlink"/>
+            <w:rStyle w:val="Hipervnculo"/>
             <w:rFonts w:ascii="Book Antiqua" w:hAnsi="Book Antiqua"/>
+            <w:lang w:val="en-US"/>
           </w:rPr>
           <w:t>https://pymupdf.readthedocs.io/en/latest/index.html</w:t>
         </w:r>
@@ -1133,6 +1196,7 @@
       <w:r>
         <w:rPr>
           <w:rFonts w:ascii="Book Antiqua" w:hAnsi="Book Antiqua"/>
+          <w:lang w:val="en-US"/>
         </w:rPr>
         <w:t>)</w:t>
       </w:r>
@@ -1381,7 +1445,7 @@
     </w:p>
     <w:p>
       <w:pPr>
-        <w:pStyle w:val="ListParagraph"/>
+        <w:pStyle w:val="Prrafodelista"/>
         <w:numPr>
           <w:ilvl w:val="0"/>
           <w:numId w:val="1"/>
@@ -1535,7 +1599,19 @@
         <w:rPr>
           <w:rFonts w:ascii="Book Antiqua" w:hAnsi="Book Antiqua"/>
         </w:rPr>
-        <w:t xml:space="preserve"> se relacionan con la experiencia, la formación y experiencia se complementa con el apartado “otros”, el puesto y la experiencia tiene sentido que estén relacionadas con los estudios…</w:t>
+        <w:t xml:space="preserve"> se relacionan con la experiencia, la </w:t>
+      </w:r>
+      <w:r>
+        <w:rPr>
+          <w:rFonts w:ascii="Book Antiqua" w:hAnsi="Book Antiqua"/>
+        </w:rPr>
+        <w:t>formación</w:t>
+      </w:r>
+      <w:r>
+        <w:rPr>
+          <w:rFonts w:ascii="Book Antiqua" w:hAnsi="Book Antiqua"/>
+        </w:rPr>
+        <w:t xml:space="preserve"> y experiencia se complementa con el apartado “otros”, el puesto y la experiencia tiene sentido que estén relacionadas con los estudios…</w:t>
       </w:r>
     </w:p>
     <w:p>
@@ -1577,10 +1653,74 @@
           <w:rFonts w:ascii="Book Antiqua" w:hAnsi="Book Antiqua"/>
         </w:rPr>
       </w:pPr>
-    </w:p>
-    <w:p>
-      <w:pPr>
-        <w:pStyle w:val="ListParagraph"/>
+      <w:r>
+        <w:rPr>
+          <w:rFonts w:ascii="Book Antiqua" w:hAnsi="Book Antiqua"/>
+        </w:rPr>
+        <w:t xml:space="preserve">OTRA OPCIÓN RECOMENDABLE: Dividir cada CV en 3 </w:t>
+      </w:r>
+      <w:proofErr w:type="spellStart"/>
+      <w:r>
+        <w:rPr>
+          <w:rFonts w:ascii="Book Antiqua" w:hAnsi="Book Antiqua"/>
+        </w:rPr>
+        <w:t>chunks</w:t>
+      </w:r>
+      <w:proofErr w:type="spellEnd"/>
+      <w:r>
+        <w:rPr>
+          <w:rFonts w:ascii="Book Antiqua" w:hAnsi="Book Antiqua"/>
+        </w:rPr>
+        <w:t xml:space="preserve"> (experiencia, formación, </w:t>
+      </w:r>
+      <w:proofErr w:type="spellStart"/>
+      <w:r>
+        <w:rPr>
+          <w:rFonts w:ascii="Book Antiqua" w:hAnsi="Book Antiqua"/>
+        </w:rPr>
+        <w:t>skills</w:t>
+      </w:r>
+      <w:proofErr w:type="spellEnd"/>
+      <w:r>
+        <w:rPr>
+          <w:rFonts w:ascii="Book Antiqua" w:hAnsi="Book Antiqua"/>
+        </w:rPr>
+        <w:t xml:space="preserve">; por ejemplo), y enriquecer </w:t>
+      </w:r>
+      <w:proofErr w:type="spellStart"/>
+      <w:r>
+        <w:rPr>
+          <w:rFonts w:ascii="Book Antiqua" w:hAnsi="Book Antiqua"/>
+        </w:rPr>
+        <w:t>chunks</w:t>
+      </w:r>
+      <w:proofErr w:type="spellEnd"/>
+      <w:r>
+        <w:rPr>
+          <w:rFonts w:ascii="Book Antiqua" w:hAnsi="Book Antiqua"/>
+        </w:rPr>
+        <w:t xml:space="preserve"> con metadatos para que la búsqueda vectorial/por entidades sea mejor</w:t>
+      </w:r>
+      <w:r>
+        <w:rPr>
+          <w:rFonts w:ascii="Book Antiqua" w:hAnsi="Book Antiqua"/>
+        </w:rPr>
+        <w:t>.</w:t>
+      </w:r>
+    </w:p>
+    <w:p>
+      <w:pPr>
+        <w:pBdr>
+          <w:bottom w:val="single" w:sz="12" w:space="1" w:color="auto"/>
+        </w:pBdr>
+        <w:rPr>
+          <w:rFonts w:ascii="Book Antiqua" w:hAnsi="Book Antiqua"/>
+        </w:rPr>
+      </w:pPr>
+    </w:p>
+    <w:p>
+      <w:pPr>
+        <w:pStyle w:val="Prrafodelista"/>
         <w:numPr>
           <w:ilvl w:val="0"/>
           <w:numId w:val="1"/>
@@ -1609,7 +1749,59 @@
     </w:p>
     <w:p>
       <w:pPr>
-        <w:pStyle w:val="ListParagraph"/>
+        <w:pBdr>
+          <w:bottom w:val="single" w:sz="12" w:space="1" w:color="auto"/>
+        </w:pBdr>
+        <w:rPr>
+          <w:rFonts w:ascii="Book Antiqua" w:hAnsi="Book Antiqua"/>
+        </w:rPr>
+      </w:pPr>
+      <w:r>
+        <w:rPr>
+          <w:rFonts w:ascii="Book Antiqua" w:hAnsi="Book Antiqua"/>
+        </w:rPr>
+        <w:t xml:space="preserve">Analizando el contenido de los documentos, se observa que hay muchas páginas y secciones que están vacías. Esto </w:t>
+      </w:r>
+      <w:r>
+        <w:rPr>
+          <w:rFonts w:ascii="Book Antiqua" w:hAnsi="Book Antiqua"/>
+        </w:rPr>
+        <w:t xml:space="preserve">no sabemos qué impacto puede tener realmente en la performance del </w:t>
+      </w:r>
+      <w:proofErr w:type="spellStart"/>
+      <w:r>
+        <w:rPr>
+          <w:rFonts w:ascii="Book Antiqua" w:hAnsi="Book Antiqua"/>
+        </w:rPr>
+        <w:t>chunking</w:t>
+      </w:r>
+      <w:proofErr w:type="spellEnd"/>
+      <w:r>
+        <w:rPr>
+          <w:rFonts w:ascii="Book Antiqua" w:hAnsi="Book Antiqua"/>
+        </w:rPr>
+        <w:t xml:space="preserve"> ni de</w:t>
+      </w:r>
+      <w:r>
+        <w:rPr>
+          <w:rFonts w:ascii="Book Antiqua" w:hAnsi="Book Antiqua"/>
+        </w:rPr>
+        <w:t xml:space="preserve">l sistema RAG posteriormente, pero es probable que nos de problemas. Consideramos la opción de descargar otros documentos que tengan más información si no avanzara lo suficiente con este caso de uso. </w:t>
+      </w:r>
+    </w:p>
+    <w:p>
+      <w:pPr>
+        <w:pBdr>
+          <w:bottom w:val="single" w:sz="12" w:space="1" w:color="auto"/>
+        </w:pBdr>
+        <w:rPr>
+          <w:rFonts w:ascii="Book Antiqua" w:hAnsi="Book Antiqua"/>
+        </w:rPr>
+      </w:pPr>
+    </w:p>
+    <w:p>
+      <w:pPr>
+        <w:pStyle w:val="Prrafodelista"/>
         <w:numPr>
           <w:ilvl w:val="0"/>
           <w:numId w:val="1"/>
@@ -1757,7 +1949,7 @@
       <w:hyperlink r:id="rId7" w:history="1">
         <w:r>
           <w:rPr>
-            <w:rStyle w:val="Hyperlink"/>
+            <w:rStyle w:val="Hipervnculo"/>
             <w:rFonts w:ascii="Book Antiqua" w:hAnsi="Book Antiqua"/>
           </w:rPr>
           <w:t>https://docling-project.github.io/docling/usage/supported_formats/</w:t>
@@ -1858,272 +2050,1907 @@
     <w:p/>
     <w:p/>
     <w:p/>
-    <w:p/>
-    <w:p/>
-    <w:p/>
-    <w:p>
-      <w:proofErr w:type="spellStart"/>
-      <w:r>
+    <w:p>
+      <w:pPr>
+        <w:pStyle w:val="Ttulo1"/>
+      </w:pPr>
+      <w:r>
+        <w:lastRenderedPageBreak/>
+        <w:t>Sandbox</w:t>
+      </w:r>
+    </w:p>
+    <w:p>
+      <w:pPr>
+        <w:rPr>
+          <w:rFonts w:ascii="Book Antiqua" w:hAnsi="Book Antiqua"/>
+        </w:rPr>
+      </w:pPr>
+      <w:r>
+        <w:rPr>
+          <w:rFonts w:ascii="Book Antiqua" w:hAnsi="Book Antiqua"/>
+        </w:rPr>
+        <w:t xml:space="preserve">Para </w:t>
+      </w:r>
+      <w:proofErr w:type="gramStart"/>
+      <w:r>
+        <w:rPr>
+          <w:rFonts w:ascii="Book Antiqua" w:hAnsi="Book Antiqua"/>
+        </w:rPr>
+        <w:t>el .</w:t>
+      </w:r>
+      <w:proofErr w:type="spellStart"/>
+      <w:r>
+        <w:rPr>
+          <w:rFonts w:ascii="Book Antiqua" w:hAnsi="Book Antiqua"/>
+        </w:rPr>
+        <w:t>env</w:t>
+      </w:r>
+      <w:proofErr w:type="spellEnd"/>
+      <w:proofErr w:type="gramEnd"/>
+      <w:r>
+        <w:rPr>
+          <w:rFonts w:ascii="Book Antiqua" w:hAnsi="Book Antiqua"/>
+        </w:rPr>
+        <w:t xml:space="preserve">, las claves y tal del blob </w:t>
+      </w:r>
+      <w:proofErr w:type="spellStart"/>
+      <w:r>
+        <w:rPr>
+          <w:rFonts w:ascii="Book Antiqua" w:hAnsi="Book Antiqua"/>
+        </w:rPr>
+        <w:t>storage</w:t>
+      </w:r>
+      <w:proofErr w:type="spellEnd"/>
+      <w:r>
+        <w:rPr>
+          <w:rFonts w:ascii="Book Antiqua" w:hAnsi="Book Antiqua"/>
+        </w:rPr>
+        <w:t xml:space="preserve"> se ven aquí</w:t>
+      </w:r>
+    </w:p>
+    <w:p>
+      <w:pPr>
+        <w:rPr>
+          <w:rFonts w:ascii="Book Antiqua" w:hAnsi="Book Antiqua"/>
+        </w:rPr>
+      </w:pPr>
+      <w:r>
+        <w:rPr>
+          <w:rFonts w:ascii="Book Antiqua" w:hAnsi="Book Antiqua"/>
+        </w:rPr>
+        <w:drawing>
+          <wp:inline distT="0" distB="0" distL="0" distR="0" wp14:anchorId="1B5ECF16" wp14:editId="0FC4E02C">
+            <wp:extent cx="5400040" cy="3400425"/>
+            <wp:effectExtent l="0" t="0" r="0" b="9525"/>
+            <wp:docPr id="749824592" name="Imagen 1" descr="Interfaz de usuario gráfica, Texto, Aplicación, Correo electrónico&#10;&#10;El contenido generado por IA puede ser incorrecto."/>
+            <wp:cNvGraphicFramePr>
+              <a:graphicFrameLocks xmlns:a="http://schemas.openxmlformats.org/drawingml/2006/main" noChangeAspect="1"/>
+            </wp:cNvGraphicFramePr>
+            <a:graphic xmlns:a="http://schemas.openxmlformats.org/drawingml/2006/main">
+              <a:graphicData uri="http://schemas.openxmlformats.org/drawingml/2006/picture">
+                <pic:pic xmlns:pic="http://schemas.openxmlformats.org/drawingml/2006/picture">
+                  <pic:nvPicPr>
+                    <pic:cNvPr id="749824592" name="Imagen 1" descr="Interfaz de usuario gráfica, Texto, Aplicación, Correo electrónico&#10;&#10;El contenido generado por IA puede ser incorrecto."/>
+                    <pic:cNvPicPr/>
+                  </pic:nvPicPr>
+                  <pic:blipFill>
+                    <a:blip r:embed="rId8"/>
+                    <a:stretch>
+                      <a:fillRect/>
+                    </a:stretch>
+                  </pic:blipFill>
+                  <pic:spPr>
+                    <a:xfrm>
+                      <a:off x="0" y="0"/>
+                      <a:ext cx="5400040" cy="3400425"/>
+                    </a:xfrm>
+                    <a:prstGeom prst="rect">
+                      <a:avLst/>
+                    </a:prstGeom>
+                  </pic:spPr>
+                </pic:pic>
+              </a:graphicData>
+            </a:graphic>
+          </wp:inline>
+        </w:drawing>
+      </w:r>
+    </w:p>
+    <w:p>
+      <w:pPr>
+        <w:rPr>
+          <w:rFonts w:ascii="Book Antiqua" w:hAnsi="Book Antiqua"/>
+        </w:rPr>
+      </w:pPr>
+    </w:p>
+    <w:p>
+      <w:pPr>
+        <w:rPr>
+          <w:rFonts w:ascii="Book Antiqua" w:hAnsi="Book Antiqua"/>
+        </w:rPr>
+      </w:pPr>
+    </w:p>
+    <w:p>
+      <w:pPr>
+        <w:rPr>
+          <w:rFonts w:ascii="Book Antiqua" w:hAnsi="Book Antiqua"/>
+        </w:rPr>
+      </w:pPr>
+      <w:r>
+        <w:rPr>
+          <w:rFonts w:ascii="Book Antiqua" w:hAnsi="Book Antiqua"/>
+        </w:rPr>
+        <w:drawing>
+          <wp:inline distT="0" distB="0" distL="0" distR="0" wp14:anchorId="0F1D5F5E" wp14:editId="13531473">
+            <wp:extent cx="5400040" cy="2688590"/>
+            <wp:effectExtent l="0" t="0" r="0" b="0"/>
+            <wp:docPr id="1011491256" name="Imagen 1" descr="Interfaz de usuario gráfica, Texto, Aplicación, Correo electrónico&#10;&#10;El contenido generado por IA puede ser incorrecto."/>
+            <wp:cNvGraphicFramePr>
+              <a:graphicFrameLocks xmlns:a="http://schemas.openxmlformats.org/drawingml/2006/main" noChangeAspect="1"/>
+            </wp:cNvGraphicFramePr>
+            <a:graphic xmlns:a="http://schemas.openxmlformats.org/drawingml/2006/main">
+              <a:graphicData uri="http://schemas.openxmlformats.org/drawingml/2006/picture">
+                <pic:pic xmlns:pic="http://schemas.openxmlformats.org/drawingml/2006/picture">
+                  <pic:nvPicPr>
+                    <pic:cNvPr id="1011491256" name="Imagen 1" descr="Interfaz de usuario gráfica, Texto, Aplicación, Correo electrónico&#10;&#10;El contenido generado por IA puede ser incorrecto."/>
+                    <pic:cNvPicPr/>
+                  </pic:nvPicPr>
+                  <pic:blipFill>
+                    <a:blip r:embed="rId9"/>
+                    <a:stretch>
+                      <a:fillRect/>
+                    </a:stretch>
+                  </pic:blipFill>
+                  <pic:spPr>
+                    <a:xfrm>
+                      <a:off x="0" y="0"/>
+                      <a:ext cx="5400040" cy="2688590"/>
+                    </a:xfrm>
+                    <a:prstGeom prst="rect">
+                      <a:avLst/>
+                    </a:prstGeom>
+                  </pic:spPr>
+                </pic:pic>
+              </a:graphicData>
+            </a:graphic>
+          </wp:inline>
+        </w:drawing>
+      </w:r>
+    </w:p>
+    <w:p>
+      <w:pPr>
+        <w:rPr>
+          <w:rFonts w:ascii="Book Antiqua" w:hAnsi="Book Antiqua"/>
+        </w:rPr>
+      </w:pPr>
+      <w:proofErr w:type="spellStart"/>
+      <w:r>
+        <w:rPr>
+          <w:rFonts w:ascii="Book Antiqua" w:hAnsi="Book Antiqua"/>
+        </w:rPr>
         <w:t>isDeleted</w:t>
       </w:r>
       <w:proofErr w:type="spellEnd"/>
       <w:r>
+        <w:rPr>
+          <w:rFonts w:ascii="Book Antiqua" w:hAnsi="Book Antiqua"/>
+        </w:rPr>
         <w:t xml:space="preserve"> = true para que no se suban los </w:t>
       </w:r>
       <w:proofErr w:type="spellStart"/>
       <w:r>
+        <w:rPr>
+          <w:rFonts w:ascii="Book Antiqua" w:hAnsi="Book Antiqua"/>
+        </w:rPr>
         <w:t>docs</w:t>
       </w:r>
       <w:proofErr w:type="spellEnd"/>
       <w:r>
+        <w:rPr>
+          <w:rFonts w:ascii="Book Antiqua" w:hAnsi="Book Antiqua"/>
+        </w:rPr>
         <w:t xml:space="preserve"> al </w:t>
       </w:r>
       <w:proofErr w:type="spellStart"/>
       <w:r>
+        <w:rPr>
+          <w:rFonts w:ascii="Book Antiqua" w:hAnsi="Book Antiqua"/>
+        </w:rPr>
         <w:t>index</w:t>
       </w:r>
       <w:proofErr w:type="spellEnd"/>
       <w:r>
+        <w:rPr>
+          <w:rFonts w:ascii="Book Antiqua" w:hAnsi="Book Antiqua"/>
+        </w:rPr>
         <w:t xml:space="preserve"> y se borre el índice que existía</w:t>
       </w:r>
     </w:p>
     <w:p>
-      <w:proofErr w:type="spellStart"/>
-      <w:r>
+      <w:pPr>
+        <w:rPr>
+          <w:rFonts w:ascii="Book Antiqua" w:hAnsi="Book Antiqua"/>
+        </w:rPr>
+      </w:pPr>
+      <w:proofErr w:type="spellStart"/>
+      <w:r>
+        <w:rPr>
+          <w:rFonts w:ascii="Book Antiqua" w:hAnsi="Book Antiqua"/>
+        </w:rPr>
         <w:t>search</w:t>
       </w:r>
       <w:proofErr w:type="spellEnd"/>
       <w:r>
+        <w:rPr>
+          <w:rFonts w:ascii="Book Antiqua" w:hAnsi="Book Antiqua"/>
+        </w:rPr>
         <w:t xml:space="preserve"> </w:t>
       </w:r>
       <w:proofErr w:type="spellStart"/>
       <w:r>
+        <w:rPr>
+          <w:rFonts w:ascii="Book Antiqua" w:hAnsi="Book Antiqua"/>
+        </w:rPr>
         <w:t>service</w:t>
       </w:r>
       <w:proofErr w:type="spellEnd"/>
       <w:r>
+        <w:rPr>
+          <w:rFonts w:ascii="Book Antiqua" w:hAnsi="Book Antiqua"/>
+        </w:rPr>
         <w:t xml:space="preserve"> (</w:t>
       </w:r>
       <w:proofErr w:type="spellStart"/>
       <w:r>
+        <w:rPr>
+          <w:rFonts w:ascii="Book Antiqua" w:hAnsi="Book Antiqua"/>
+        </w:rPr>
         <w:t>azsearch</w:t>
       </w:r>
       <w:proofErr w:type="spellEnd"/>
       <w:r>
+        <w:rPr>
+          <w:rFonts w:ascii="Book Antiqua" w:hAnsi="Book Antiqua"/>
+        </w:rPr>
         <w:t xml:space="preserve">) &gt; crear data </w:t>
       </w:r>
       <w:proofErr w:type="spellStart"/>
       <w:r>
+        <w:rPr>
+          <w:rFonts w:ascii="Book Antiqua" w:hAnsi="Book Antiqua"/>
+        </w:rPr>
         <w:t>source</w:t>
       </w:r>
       <w:proofErr w:type="spellEnd"/>
       <w:r>
-        <w:t xml:space="preserve"> que apunte a un cosmos</w:t>
-      </w:r>
-      <w:r>
+        <w:rPr>
+          <w:rFonts w:ascii="Book Antiqua" w:hAnsi="Book Antiqua"/>
+        </w:rPr>
+        <w:t xml:space="preserve"> que apunte a un cosmos </w:t>
+      </w:r>
+      <w:proofErr w:type="spellStart"/>
+      <w:r>
+        <w:rPr>
+          <w:rFonts w:ascii="Book Antiqua" w:hAnsi="Book Antiqua"/>
+        </w:rPr>
+        <w:t>db</w:t>
+      </w:r>
+      <w:proofErr w:type="spellEnd"/>
+      <w:r>
+        <w:rPr>
+          <w:rFonts w:ascii="Book Antiqua" w:hAnsi="Book Antiqua"/>
+        </w:rPr>
+        <w:t xml:space="preserve"> (donde se guardan los </w:t>
+      </w:r>
+      <w:proofErr w:type="spellStart"/>
+      <w:r>
+        <w:rPr>
+          <w:rFonts w:ascii="Book Antiqua" w:hAnsi="Book Antiqua"/>
+        </w:rPr>
+        <w:t>json</w:t>
+      </w:r>
+      <w:proofErr w:type="spellEnd"/>
+      <w:r>
+        <w:rPr>
+          <w:rFonts w:ascii="Book Antiqua" w:hAnsi="Book Antiqua"/>
+        </w:rPr>
+        <w:t xml:space="preserve"> de los </w:t>
+      </w:r>
+      <w:proofErr w:type="spellStart"/>
+      <w:r>
+        <w:rPr>
+          <w:rFonts w:ascii="Book Antiqua" w:hAnsi="Book Antiqua"/>
+        </w:rPr>
+        <w:t>chunks</w:t>
+      </w:r>
+      <w:proofErr w:type="spellEnd"/>
+      <w:r>
+        <w:rPr>
+          <w:rFonts w:ascii="Book Antiqua" w:hAnsi="Book Antiqua"/>
+        </w:rPr>
+        <w:t xml:space="preserve">, como un </w:t>
+      </w:r>
+      <w:proofErr w:type="spellStart"/>
+      <w:r>
+        <w:rPr>
+          <w:rFonts w:ascii="Book Antiqua" w:hAnsi="Book Antiqua"/>
+        </w:rPr>
+        <w:t>mongodb</w:t>
+      </w:r>
+      <w:proofErr w:type="spellEnd"/>
+      <w:r>
+        <w:rPr>
+          <w:rFonts w:ascii="Book Antiqua" w:hAnsi="Book Antiqua"/>
+        </w:rPr>
+        <w:t xml:space="preserve">). Al crearlo, marcar </w:t>
+      </w:r>
+      <w:proofErr w:type="spellStart"/>
+      <w:r>
+        <w:rPr>
+          <w:rFonts w:ascii="Book Antiqua" w:hAnsi="Book Antiqua"/>
+        </w:rPr>
+        <w:t>enable</w:t>
+      </w:r>
+      <w:proofErr w:type="spellEnd"/>
+      <w:r>
+        <w:rPr>
+          <w:rFonts w:ascii="Book Antiqua" w:hAnsi="Book Antiqua"/>
+        </w:rPr>
         <w:t xml:space="preserve"> </w:t>
       </w:r>
       <w:proofErr w:type="spellStart"/>
       <w:r>
-        <w:t>db</w:t>
-      </w:r>
-      <w:proofErr w:type="spellEnd"/>
-      <w:r>
-        <w:t xml:space="preserve"> (donde se guardan los </w:t>
-      </w:r>
-      <w:proofErr w:type="spellStart"/>
-      <w:r>
-        <w:t>json</w:t>
-      </w:r>
-      <w:proofErr w:type="spellEnd"/>
-      <w:r>
-        <w:t xml:space="preserve"> de los </w:t>
-      </w:r>
-      <w:proofErr w:type="spellStart"/>
-      <w:r>
-        <w:t>chunks</w:t>
-      </w:r>
-      <w:proofErr w:type="spellEnd"/>
-      <w:r>
-        <w:t xml:space="preserve">, como un </w:t>
-      </w:r>
-      <w:proofErr w:type="spellStart"/>
-      <w:r>
-        <w:t>mongodb</w:t>
-      </w:r>
-      <w:proofErr w:type="spellEnd"/>
-      <w:r>
-        <w:t xml:space="preserve">). Al crearlo, marcar </w:t>
-      </w:r>
-      <w:proofErr w:type="spellStart"/>
-      <w:r>
-        <w:t>enable</w:t>
-      </w:r>
-      <w:proofErr w:type="spellEnd"/>
-      <w:r>
+        <w:rPr>
+          <w:rFonts w:ascii="Book Antiqua" w:hAnsi="Book Antiqua"/>
+        </w:rPr>
+        <w:t>deletion</w:t>
+      </w:r>
+      <w:proofErr w:type="spellEnd"/>
+      <w:r>
+        <w:rPr>
+          <w:rFonts w:ascii="Book Antiqua" w:hAnsi="Book Antiqua"/>
+        </w:rPr>
+        <w:t xml:space="preserve"> tracking para que funcione lo de </w:t>
+      </w:r>
+      <w:proofErr w:type="spellStart"/>
+      <w:r>
+        <w:rPr>
+          <w:rFonts w:ascii="Book Antiqua" w:hAnsi="Book Antiqua"/>
+        </w:rPr>
+        <w:t>isDeleted</w:t>
+      </w:r>
+      <w:proofErr w:type="spellEnd"/>
+    </w:p>
+    <w:p>
+      <w:pPr>
+        <w:rPr>
+          <w:rFonts w:ascii="Book Antiqua" w:hAnsi="Book Antiqua"/>
+        </w:rPr>
+      </w:pPr>
+    </w:p>
+    <w:p>
+      <w:pPr>
+        <w:rPr>
+          <w:rFonts w:ascii="Book Antiqua" w:hAnsi="Book Antiqua"/>
+        </w:rPr>
+      </w:pPr>
+      <w:r>
+        <w:rPr>
+          <w:rFonts w:ascii="Book Antiqua" w:hAnsi="Book Antiqua"/>
+        </w:rPr>
+        <w:t>Creamos ahora el índice: (</w:t>
+      </w:r>
+      <w:proofErr w:type="spellStart"/>
+      <w:r>
+        <w:rPr>
+          <w:rFonts w:ascii="Book Antiqua" w:hAnsi="Book Antiqua"/>
+        </w:rPr>
+        <w:t>search</w:t>
+      </w:r>
+      <w:proofErr w:type="spellEnd"/>
+      <w:r>
+        <w:rPr>
+          <w:rFonts w:ascii="Book Antiqua" w:hAnsi="Book Antiqua"/>
+        </w:rPr>
         <w:t xml:space="preserve"> </w:t>
       </w:r>
       <w:proofErr w:type="spellStart"/>
       <w:r>
-        <w:t>deletion</w:t>
-      </w:r>
-      <w:proofErr w:type="spellEnd"/>
-      <w:r>
-        <w:t xml:space="preserve"> tracking para que funcione lo de </w:t>
-      </w:r>
-      <w:proofErr w:type="spellStart"/>
-      <w:r>
-        <w:t>isDeleted</w:t>
-      </w:r>
-      <w:proofErr w:type="spellEnd"/>
-    </w:p>
-    <w:p/>
-    <w:p>
-      <w:r>
-        <w:t>Creamos ahora el índice: (</w:t>
-      </w:r>
-      <w:proofErr w:type="spellStart"/>
-      <w:r>
-        <w:t>search</w:t>
-      </w:r>
-      <w:proofErr w:type="spellEnd"/>
-      <w:r>
-        <w:t xml:space="preserve"> </w:t>
-      </w:r>
-      <w:proofErr w:type="spellStart"/>
-      <w:r>
+        <w:rPr>
+          <w:rFonts w:ascii="Book Antiqua" w:hAnsi="Book Antiqua"/>
+        </w:rPr>
         <w:t>management</w:t>
       </w:r>
       <w:proofErr w:type="spellEnd"/>
       <w:r>
+        <w:rPr>
+          <w:rFonts w:ascii="Book Antiqua" w:hAnsi="Book Antiqua"/>
+        </w:rPr>
         <w:t xml:space="preserve"> &gt; indexes)</w:t>
       </w:r>
     </w:p>
     <w:p>
       <w:pPr>
-        <w:pStyle w:val="ListParagraph"/>
+        <w:pStyle w:val="Prrafodelista"/>
         <w:numPr>
           <w:ilvl w:val="0"/>
           <w:numId w:val="1"/>
         </w:numPr>
-      </w:pPr>
-      <w:r>
+        <w:rPr>
+          <w:rFonts w:ascii="Book Antiqua" w:hAnsi="Book Antiqua"/>
+        </w:rPr>
+      </w:pPr>
+      <w:r>
+        <w:rPr>
+          <w:rFonts w:ascii="Book Antiqua" w:hAnsi="Book Antiqua"/>
+        </w:rPr>
+        <w:lastRenderedPageBreak/>
         <w:t xml:space="preserve">O </w:t>
       </w:r>
       <w:proofErr w:type="spellStart"/>
       <w:r>
+        <w:rPr>
+          <w:rFonts w:ascii="Book Antiqua" w:hAnsi="Book Antiqua"/>
+        </w:rPr>
         <w:t>bn</w:t>
       </w:r>
       <w:proofErr w:type="spellEnd"/>
       <w:r>
+        <w:rPr>
+          <w:rFonts w:ascii="Book Antiqua" w:hAnsi="Book Antiqua"/>
+        </w:rPr>
         <w:t xml:space="preserve"> copiar estructura del </w:t>
       </w:r>
       <w:proofErr w:type="spellStart"/>
       <w:r>
+        <w:rPr>
+          <w:rFonts w:ascii="Book Antiqua" w:hAnsi="Book Antiqua"/>
+        </w:rPr>
         <w:t>json</w:t>
       </w:r>
       <w:proofErr w:type="spellEnd"/>
       <w:r>
+        <w:rPr>
+          <w:rFonts w:ascii="Book Antiqua" w:hAnsi="Book Antiqua"/>
+        </w:rPr>
         <w:t xml:space="preserve"> de un índice existente para configurar búsquedas vectorial y semántica (en esta especificar los campos por los que quieres busca)</w:t>
       </w:r>
     </w:p>
     <w:p>
       <w:pPr>
-        <w:pStyle w:val="ListParagraph"/>
+        <w:pStyle w:val="Prrafodelista"/>
         <w:numPr>
           <w:ilvl w:val="0"/>
           <w:numId w:val="1"/>
         </w:numPr>
-      </w:pPr>
-      <w:r>
+        <w:rPr>
+          <w:rFonts w:ascii="Book Antiqua" w:hAnsi="Book Antiqua"/>
+        </w:rPr>
+      </w:pPr>
+      <w:r>
+        <w:rPr>
+          <w:rFonts w:ascii="Book Antiqua" w:hAnsi="Book Antiqua"/>
+        </w:rPr>
         <w:t>Crear de 0 (no)</w:t>
       </w:r>
     </w:p>
-    <w:p/>
-    <w:p>
-      <w:r>
+    <w:p>
+      <w:pPr>
+        <w:rPr>
+          <w:rFonts w:ascii="Book Antiqua" w:hAnsi="Book Antiqua"/>
+        </w:rPr>
+      </w:pPr>
+    </w:p>
+    <w:p>
+      <w:pPr>
+        <w:rPr>
+          <w:rFonts w:ascii="Book Antiqua" w:hAnsi="Book Antiqua"/>
+        </w:rPr>
+      </w:pPr>
+      <w:r>
+        <w:rPr>
+          <w:rFonts w:ascii="Book Antiqua" w:hAnsi="Book Antiqua"/>
+        </w:rPr>
         <w:t xml:space="preserve">Una vez creados índice y </w:t>
       </w:r>
       <w:proofErr w:type="spellStart"/>
       <w:r>
+        <w:rPr>
+          <w:rFonts w:ascii="Book Antiqua" w:hAnsi="Book Antiqua"/>
+        </w:rPr>
         <w:t>datasource</w:t>
       </w:r>
       <w:proofErr w:type="spellEnd"/>
       <w:r>
+        <w:rPr>
+          <w:rFonts w:ascii="Book Antiqua" w:hAnsi="Book Antiqua"/>
+        </w:rPr>
         <w:t xml:space="preserve">, crear </w:t>
       </w:r>
       <w:proofErr w:type="spellStart"/>
       <w:r>
+        <w:rPr>
+          <w:rFonts w:ascii="Book Antiqua" w:hAnsi="Book Antiqua"/>
+        </w:rPr>
         <w:t>idexer</w:t>
       </w:r>
       <w:proofErr w:type="spellEnd"/>
       <w:r>
+        <w:rPr>
+          <w:rFonts w:ascii="Book Antiqua" w:hAnsi="Book Antiqua"/>
+        </w:rPr>
         <w:t xml:space="preserve"> que hace de puente entre ambos</w:t>
       </w:r>
     </w:p>
     <w:p>
-      <w:proofErr w:type="spellStart"/>
-      <w:r>
+      <w:pPr>
+        <w:rPr>
+          <w:rFonts w:ascii="Book Antiqua" w:hAnsi="Book Antiqua"/>
+        </w:rPr>
+      </w:pPr>
+      <w:proofErr w:type="spellStart"/>
+      <w:r>
+        <w:rPr>
+          <w:rFonts w:ascii="Book Antiqua" w:hAnsi="Book Antiqua"/>
+        </w:rPr>
         <w:t>Autoindexación</w:t>
       </w:r>
       <w:proofErr w:type="spellEnd"/>
       <w:r>
+        <w:rPr>
+          <w:rFonts w:ascii="Book Antiqua" w:hAnsi="Book Antiqua"/>
+        </w:rPr>
         <w:t xml:space="preserve">: que se ejecute automáticamente el </w:t>
       </w:r>
       <w:proofErr w:type="spellStart"/>
       <w:r>
+        <w:rPr>
+          <w:rFonts w:ascii="Book Antiqua" w:hAnsi="Book Antiqua"/>
+        </w:rPr>
         <w:t>indexer</w:t>
       </w:r>
       <w:proofErr w:type="spellEnd"/>
       <w:r>
+        <w:rPr>
+          <w:rFonts w:ascii="Book Antiqua" w:hAnsi="Book Antiqua"/>
+        </w:rPr>
         <w:t xml:space="preserve"> cada x tiempo. Más fácil hacer </w:t>
       </w:r>
       <w:proofErr w:type="spellStart"/>
       <w:r>
+        <w:rPr>
+          <w:rFonts w:ascii="Book Antiqua" w:hAnsi="Book Antiqua"/>
+        </w:rPr>
         <w:t>trigger</w:t>
       </w:r>
       <w:proofErr w:type="spellEnd"/>
       <w:r>
+        <w:rPr>
+          <w:rFonts w:ascii="Book Antiqua" w:hAnsi="Book Antiqua"/>
+        </w:rPr>
         <w:t xml:space="preserve"> del </w:t>
       </w:r>
       <w:proofErr w:type="spellStart"/>
       <w:r>
+        <w:rPr>
+          <w:rFonts w:ascii="Book Antiqua" w:hAnsi="Book Antiqua"/>
+        </w:rPr>
         <w:t>indexer</w:t>
       </w:r>
       <w:proofErr w:type="spellEnd"/>
       <w:r>
+        <w:rPr>
+          <w:rFonts w:ascii="Book Antiqua" w:hAnsi="Book Antiqua"/>
+        </w:rPr>
         <w:t xml:space="preserve"> (llamarlo a través de código cuando lo necesite)</w:t>
       </w:r>
     </w:p>
-    <w:p/>
-    <w:p>
-      <w:r>
+    <w:p>
+      <w:pPr>
+        <w:rPr>
+          <w:rFonts w:ascii="Book Antiqua" w:hAnsi="Book Antiqua"/>
+        </w:rPr>
+      </w:pPr>
+    </w:p>
+    <w:p>
+      <w:pPr>
+        <w:rPr>
+          <w:rFonts w:ascii="Book Antiqua" w:hAnsi="Book Antiqua"/>
+        </w:rPr>
+      </w:pPr>
+      <w:r>
+        <w:rPr>
+          <w:rFonts w:ascii="Book Antiqua" w:hAnsi="Book Antiqua"/>
+        </w:rPr>
         <w:t xml:space="preserve">En el índice, </w:t>
       </w:r>
       <w:proofErr w:type="spellStart"/>
       <w:r>
+        <w:rPr>
+          <w:rFonts w:ascii="Book Antiqua" w:hAnsi="Book Antiqua"/>
+        </w:rPr>
         <w:t>scoring</w:t>
       </w:r>
       <w:proofErr w:type="spellEnd"/>
       <w:r>
+        <w:rPr>
+          <w:rFonts w:ascii="Book Antiqua" w:hAnsi="Book Antiqua"/>
+        </w:rPr>
         <w:t xml:space="preserve"> </w:t>
       </w:r>
       <w:proofErr w:type="spellStart"/>
       <w:r>
+        <w:rPr>
+          <w:rFonts w:ascii="Book Antiqua" w:hAnsi="Book Antiqua"/>
+        </w:rPr>
         <w:t>profiles</w:t>
       </w:r>
       <w:proofErr w:type="spellEnd"/>
       <w:r>
-        <w:t xml:space="preserve">, se puede asignar pesos a los campos a </w:t>
-      </w:r>
-      <w:proofErr w:type="spellStart"/>
-      <w:r>
-        <w:t>bscar</w:t>
-      </w:r>
-      <w:proofErr w:type="spellEnd"/>
-      <w:r>
-        <w:t xml:space="preserve"> (no va muy allá)</w:t>
-      </w:r>
+        <w:rPr>
+          <w:rFonts w:ascii="Book Antiqua" w:hAnsi="Book Antiqua"/>
+        </w:rPr>
+        <w:t>, se puede asignar pesos a los campos a b</w:t>
+      </w:r>
+      <w:r>
+        <w:rPr>
+          <w:rFonts w:ascii="Book Antiqua" w:hAnsi="Book Antiqua"/>
+        </w:rPr>
+        <w:t>u</w:t>
+      </w:r>
+      <w:r>
+        <w:rPr>
+          <w:rFonts w:ascii="Book Antiqua" w:hAnsi="Book Antiqua"/>
+        </w:rPr>
+        <w:t>scar (no va muy allá)</w:t>
+      </w:r>
+    </w:p>
+    <w:p>
+      <w:pPr>
+        <w:rPr>
+          <w:rFonts w:ascii="Book Antiqua" w:hAnsi="Book Antiqua"/>
+        </w:rPr>
+      </w:pPr>
+    </w:p>
+    <w:p>
+      <w:pPr>
+        <w:pStyle w:val="Ttuloaux"/>
+      </w:pPr>
+      <w:r>
+        <w:t>PROPUESTA TFG INICIAL</w:t>
+      </w:r>
+    </w:p>
+    <w:p>
+      <w:pPr>
+        <w:rPr>
+          <w:rFonts w:ascii="Book Antiqua" w:hAnsi="Book Antiqua"/>
+        </w:rPr>
+      </w:pPr>
+      <w:r>
+        <w:rPr>
+          <w:rFonts w:ascii="Book Antiqua" w:hAnsi="Book Antiqua"/>
+        </w:rPr>
+        <w:t>Objetivo Principal</w:t>
+      </w:r>
+    </w:p>
+    <w:p>
+      <w:pPr>
+        <w:rPr>
+          <w:rFonts w:ascii="Book Antiqua" w:hAnsi="Book Antiqua"/>
+        </w:rPr>
+      </w:pPr>
+      <w:r>
+        <w:rPr>
+          <w:rFonts w:ascii="Book Antiqua" w:hAnsi="Book Antiqua"/>
+        </w:rPr>
+        <w:t xml:space="preserve">Desarrollar un sistema RAG modular y escalable que soporte múltiples idiomas utilizando modelos y herramientas open </w:t>
+      </w:r>
+      <w:proofErr w:type="spellStart"/>
+      <w:r>
+        <w:rPr>
+          <w:rFonts w:ascii="Book Antiqua" w:hAnsi="Book Antiqua"/>
+        </w:rPr>
+        <w:t>source</w:t>
+      </w:r>
+      <w:proofErr w:type="spellEnd"/>
+      <w:r>
+        <w:rPr>
+          <w:rFonts w:ascii="Book Antiqua" w:hAnsi="Book Antiqua"/>
+        </w:rPr>
+        <w:t xml:space="preserve">, eliminando la dependencia de servicios propietarios como </w:t>
+      </w:r>
+      <w:proofErr w:type="spellStart"/>
+      <w:r>
+        <w:rPr>
+          <w:rFonts w:ascii="Book Antiqua" w:hAnsi="Book Antiqua"/>
+        </w:rPr>
+        <w:t>OpenAI</w:t>
+      </w:r>
+      <w:proofErr w:type="spellEnd"/>
+      <w:r>
+        <w:rPr>
+          <w:rFonts w:ascii="Book Antiqua" w:hAnsi="Book Antiqua"/>
+        </w:rPr>
+        <w:t>.</w:t>
+      </w:r>
+    </w:p>
+    <w:p>
+      <w:pPr>
+        <w:rPr>
+          <w:rFonts w:ascii="Book Antiqua" w:hAnsi="Book Antiqua"/>
+        </w:rPr>
+      </w:pPr>
+      <w:r>
+        <w:rPr>
+          <w:rFonts w:ascii="Book Antiqua" w:hAnsi="Book Antiqua"/>
+        </w:rPr>
+        <w:t>Alcance del Proyecto</w:t>
+      </w:r>
+    </w:p>
+    <w:p>
+      <w:pPr>
+        <w:rPr>
+          <w:rFonts w:ascii="Book Antiqua" w:hAnsi="Book Antiqua"/>
+        </w:rPr>
+      </w:pPr>
+      <w:r>
+        <w:rPr>
+          <w:rFonts w:ascii="Book Antiqua" w:hAnsi="Book Antiqua"/>
+        </w:rPr>
+        <w:t>1. Análisis y Diseño</w:t>
+      </w:r>
+    </w:p>
+    <w:p>
+      <w:pPr>
+        <w:rPr>
+          <w:rFonts w:ascii="Book Antiqua" w:hAnsi="Book Antiqua"/>
+        </w:rPr>
+      </w:pPr>
+      <w:r>
+        <w:rPr>
+          <w:rFonts w:ascii="Book Antiqua" w:hAnsi="Book Antiqua"/>
+        </w:rPr>
+        <w:t>•</w:t>
+      </w:r>
+      <w:r>
+        <w:rPr>
+          <w:rFonts w:ascii="Book Antiqua" w:hAnsi="Book Antiqua"/>
+        </w:rPr>
+        <w:tab/>
+        <w:t>Estudio comparativo de arquitecturas RAG existentes</w:t>
+      </w:r>
+    </w:p>
+    <w:p>
+      <w:pPr>
+        <w:rPr>
+          <w:rFonts w:ascii="Book Antiqua" w:hAnsi="Book Antiqua"/>
+        </w:rPr>
+      </w:pPr>
+      <w:r>
+        <w:rPr>
+          <w:rFonts w:ascii="Book Antiqua" w:hAnsi="Book Antiqua"/>
+        </w:rPr>
+        <w:t>•</w:t>
+      </w:r>
+      <w:r>
+        <w:rPr>
+          <w:rFonts w:ascii="Book Antiqua" w:hAnsi="Book Antiqua"/>
+        </w:rPr>
+        <w:tab/>
+        <w:t xml:space="preserve">Diseño de una arquitectura modular mejorada con soporte </w:t>
+      </w:r>
+      <w:proofErr w:type="spellStart"/>
+      <w:r>
+        <w:rPr>
+          <w:rFonts w:ascii="Book Antiqua" w:hAnsi="Book Antiqua"/>
+        </w:rPr>
+        <w:t>multiidioma</w:t>
+      </w:r>
+      <w:proofErr w:type="spellEnd"/>
+    </w:p>
+    <w:p>
+      <w:pPr>
+        <w:rPr>
+          <w:rFonts w:ascii="Book Antiqua" w:hAnsi="Book Antiqua"/>
+        </w:rPr>
+      </w:pPr>
+      <w:r>
+        <w:rPr>
+          <w:rFonts w:ascii="Book Antiqua" w:hAnsi="Book Antiqua"/>
+        </w:rPr>
+        <w:t>2. Componentes a Desarrollar/Adaptar</w:t>
+      </w:r>
+    </w:p>
+    <w:p>
+      <w:pPr>
+        <w:rPr>
+          <w:rFonts w:ascii="Book Antiqua" w:hAnsi="Book Antiqua"/>
+        </w:rPr>
+      </w:pPr>
+      <w:r>
+        <w:rPr>
+          <w:rFonts w:ascii="Book Antiqua" w:hAnsi="Book Antiqua"/>
+        </w:rPr>
+        <w:t xml:space="preserve">A) Procesamiento </w:t>
+      </w:r>
+      <w:proofErr w:type="spellStart"/>
+      <w:r>
+        <w:rPr>
+          <w:rFonts w:ascii="Book Antiqua" w:hAnsi="Book Antiqua"/>
+        </w:rPr>
+        <w:t>Multiidioma</w:t>
+      </w:r>
+      <w:proofErr w:type="spellEnd"/>
+      <w:r>
+        <w:rPr>
+          <w:rFonts w:ascii="Book Antiqua" w:hAnsi="Book Antiqua"/>
+        </w:rPr>
+        <w:t xml:space="preserve"> de Documentos</w:t>
+      </w:r>
+    </w:p>
+    <w:p>
+      <w:pPr>
+        <w:rPr>
+          <w:rFonts w:ascii="Book Antiqua" w:hAnsi="Book Antiqua"/>
+        </w:rPr>
+      </w:pPr>
+      <w:r>
+        <w:rPr>
+          <w:rFonts w:ascii="Book Antiqua" w:hAnsi="Book Antiqua"/>
+        </w:rPr>
+        <w:t>•</w:t>
+      </w:r>
+      <w:r>
+        <w:rPr>
+          <w:rFonts w:ascii="Book Antiqua" w:hAnsi="Book Antiqua"/>
+        </w:rPr>
+        <w:tab/>
+        <w:t>Detección automática de idioma de documentos</w:t>
+      </w:r>
+    </w:p>
+    <w:p>
+      <w:pPr>
+        <w:rPr>
+          <w:rFonts w:ascii="Book Antiqua" w:hAnsi="Book Antiqua"/>
+        </w:rPr>
+      </w:pPr>
+      <w:r>
+        <w:rPr>
+          <w:rFonts w:ascii="Book Antiqua" w:hAnsi="Book Antiqua"/>
+        </w:rPr>
+        <w:t>•</w:t>
+      </w:r>
+      <w:r>
+        <w:rPr>
+          <w:rFonts w:ascii="Book Antiqua" w:hAnsi="Book Antiqua"/>
+        </w:rPr>
+        <w:tab/>
+        <w:t xml:space="preserve">Adaptación del </w:t>
+      </w:r>
+      <w:proofErr w:type="spellStart"/>
+      <w:r>
+        <w:rPr>
+          <w:rFonts w:ascii="Book Antiqua" w:hAnsi="Book Antiqua"/>
+        </w:rPr>
+        <w:t>chunking</w:t>
+      </w:r>
+      <w:proofErr w:type="spellEnd"/>
+      <w:r>
+        <w:rPr>
+          <w:rFonts w:ascii="Book Antiqua" w:hAnsi="Book Antiqua"/>
+        </w:rPr>
+        <w:t xml:space="preserve"> según características lingüísticas de cada idioma</w:t>
+      </w:r>
+    </w:p>
+    <w:p>
+      <w:pPr>
+        <w:rPr>
+          <w:rFonts w:ascii="Book Antiqua" w:hAnsi="Book Antiqua"/>
+        </w:rPr>
+      </w:pPr>
+      <w:r>
+        <w:rPr>
+          <w:rFonts w:ascii="Book Antiqua" w:hAnsi="Book Antiqua"/>
+        </w:rPr>
+        <w:t>•</w:t>
+      </w:r>
+      <w:r>
+        <w:rPr>
+          <w:rFonts w:ascii="Book Antiqua" w:hAnsi="Book Antiqua"/>
+        </w:rPr>
+        <w:tab/>
+        <w:t>Procesamiento específico para diferentes tipos de documento (PDF, Word, etc.)</w:t>
+      </w:r>
+    </w:p>
+    <w:p>
+      <w:pPr>
+        <w:rPr>
+          <w:rFonts w:ascii="Book Antiqua" w:hAnsi="Book Antiqua"/>
+          <w:lang w:val="en-US"/>
+        </w:rPr>
+      </w:pPr>
+      <w:r>
+        <w:rPr>
+          <w:rFonts w:ascii="Book Antiqua" w:hAnsi="Book Antiqua"/>
+          <w:lang w:val="en-US"/>
+        </w:rPr>
+        <w:t>B) Sistema de Embeddings Open Source</w:t>
+      </w:r>
+    </w:p>
+    <w:p>
+      <w:pPr>
+        <w:rPr>
+          <w:rFonts w:ascii="Book Antiqua" w:hAnsi="Book Antiqua"/>
+        </w:rPr>
+      </w:pPr>
+      <w:r>
+        <w:rPr>
+          <w:rFonts w:ascii="Book Antiqua" w:hAnsi="Book Antiqua"/>
+        </w:rPr>
+        <w:t>•</w:t>
+      </w:r>
+      <w:r>
+        <w:rPr>
+          <w:rFonts w:ascii="Book Antiqua" w:hAnsi="Book Antiqua"/>
+        </w:rPr>
+        <w:tab/>
+        <w:t xml:space="preserve">Integración de modelos de </w:t>
+      </w:r>
+      <w:proofErr w:type="spellStart"/>
+      <w:r>
+        <w:rPr>
+          <w:rFonts w:ascii="Book Antiqua" w:hAnsi="Book Antiqua"/>
+        </w:rPr>
+        <w:t>embeddings</w:t>
+      </w:r>
+      <w:proofErr w:type="spellEnd"/>
+      <w:r>
+        <w:rPr>
+          <w:rFonts w:ascii="Book Antiqua" w:hAnsi="Book Antiqua"/>
+        </w:rPr>
+        <w:t xml:space="preserve"> </w:t>
+      </w:r>
+      <w:proofErr w:type="spellStart"/>
+      <w:r>
+        <w:rPr>
+          <w:rFonts w:ascii="Book Antiqua" w:hAnsi="Book Antiqua"/>
+        </w:rPr>
+        <w:t>multiidioma</w:t>
+      </w:r>
+      <w:proofErr w:type="spellEnd"/>
+      <w:r>
+        <w:rPr>
+          <w:rFonts w:ascii="Book Antiqua" w:hAnsi="Book Antiqua"/>
+        </w:rPr>
+        <w:t xml:space="preserve"> (</w:t>
+      </w:r>
+      <w:proofErr w:type="spellStart"/>
+      <w:r>
+        <w:rPr>
+          <w:rFonts w:ascii="Book Antiqua" w:hAnsi="Book Antiqua"/>
+        </w:rPr>
+        <w:t>ej</w:t>
+      </w:r>
+      <w:proofErr w:type="spellEnd"/>
+      <w:r>
+        <w:rPr>
+          <w:rFonts w:ascii="Book Antiqua" w:hAnsi="Book Antiqua"/>
+        </w:rPr>
+        <w:t xml:space="preserve">: multilingual-e5, SBERT </w:t>
+      </w:r>
+      <w:proofErr w:type="spellStart"/>
+      <w:r>
+        <w:rPr>
+          <w:rFonts w:ascii="Book Antiqua" w:hAnsi="Book Antiqua"/>
+        </w:rPr>
+        <w:t>multilingual</w:t>
+      </w:r>
+      <w:proofErr w:type="spellEnd"/>
+      <w:r>
+        <w:rPr>
+          <w:rFonts w:ascii="Book Antiqua" w:hAnsi="Book Antiqua"/>
+        </w:rPr>
+        <w:t>)</w:t>
+      </w:r>
+    </w:p>
+    <w:p>
+      <w:pPr>
+        <w:rPr>
+          <w:rFonts w:ascii="Book Antiqua" w:hAnsi="Book Antiqua"/>
+        </w:rPr>
+      </w:pPr>
+      <w:r>
+        <w:rPr>
+          <w:rFonts w:ascii="Book Antiqua" w:hAnsi="Book Antiqua"/>
+        </w:rPr>
+        <w:t>o</w:t>
+      </w:r>
+      <w:r>
+        <w:rPr>
+          <w:rFonts w:ascii="Book Antiqua" w:hAnsi="Book Antiqua"/>
+        </w:rPr>
+        <w:tab/>
+        <w:t>Y comparativas entre estos modelos</w:t>
+      </w:r>
+    </w:p>
+    <w:p>
+      <w:pPr>
+        <w:rPr>
+          <w:rFonts w:ascii="Book Antiqua" w:hAnsi="Book Antiqua"/>
+        </w:rPr>
+      </w:pPr>
+      <w:r>
+        <w:rPr>
+          <w:rFonts w:ascii="Book Antiqua" w:hAnsi="Book Antiqua"/>
+        </w:rPr>
+        <w:t>•</w:t>
+      </w:r>
+      <w:r>
+        <w:rPr>
+          <w:rFonts w:ascii="Book Antiqua" w:hAnsi="Book Antiqua"/>
+        </w:rPr>
+        <w:tab/>
+        <w:t xml:space="preserve">Optimización del índice vectorial (Con alternativas como </w:t>
+      </w:r>
+      <w:proofErr w:type="spellStart"/>
+      <w:r>
+        <w:rPr>
+          <w:rFonts w:ascii="Book Antiqua" w:hAnsi="Book Antiqua"/>
+        </w:rPr>
+        <w:t>Qdrant</w:t>
+      </w:r>
+      <w:proofErr w:type="spellEnd"/>
+      <w:r>
+        <w:rPr>
+          <w:rFonts w:ascii="Book Antiqua" w:hAnsi="Book Antiqua"/>
+        </w:rPr>
+        <w:t xml:space="preserve">, </w:t>
+      </w:r>
+      <w:proofErr w:type="spellStart"/>
+      <w:r>
+        <w:rPr>
+          <w:rFonts w:ascii="Book Antiqua" w:hAnsi="Book Antiqua"/>
+        </w:rPr>
+        <w:t>Weaviate</w:t>
+      </w:r>
+      <w:proofErr w:type="spellEnd"/>
+      <w:r>
+        <w:rPr>
+          <w:rFonts w:ascii="Book Antiqua" w:hAnsi="Book Antiqua"/>
+        </w:rPr>
+        <w:t>)</w:t>
+      </w:r>
+    </w:p>
+    <w:p>
+      <w:pPr>
+        <w:rPr>
+          <w:rFonts w:ascii="Book Antiqua" w:hAnsi="Book Antiqua"/>
+        </w:rPr>
+      </w:pPr>
+      <w:r>
+        <w:rPr>
+          <w:rFonts w:ascii="Book Antiqua" w:hAnsi="Book Antiqua"/>
+        </w:rPr>
+        <w:t xml:space="preserve">C) Generación con </w:t>
+      </w:r>
+      <w:proofErr w:type="spellStart"/>
+      <w:r>
+        <w:rPr>
+          <w:rFonts w:ascii="Book Antiqua" w:hAnsi="Book Antiqua"/>
+        </w:rPr>
+        <w:t>LLMs</w:t>
+      </w:r>
+      <w:proofErr w:type="spellEnd"/>
+      <w:r>
+        <w:rPr>
+          <w:rFonts w:ascii="Book Antiqua" w:hAnsi="Book Antiqua"/>
+        </w:rPr>
+        <w:t xml:space="preserve"> Open </w:t>
+      </w:r>
+      <w:proofErr w:type="spellStart"/>
+      <w:r>
+        <w:rPr>
+          <w:rFonts w:ascii="Book Antiqua" w:hAnsi="Book Antiqua"/>
+        </w:rPr>
+        <w:t>Source</w:t>
+      </w:r>
+      <w:proofErr w:type="spellEnd"/>
+    </w:p>
+    <w:p>
+      <w:pPr>
+        <w:rPr>
+          <w:rFonts w:ascii="Book Antiqua" w:hAnsi="Book Antiqua"/>
+        </w:rPr>
+      </w:pPr>
+      <w:r>
+        <w:rPr>
+          <w:rFonts w:ascii="Book Antiqua" w:hAnsi="Book Antiqua"/>
+        </w:rPr>
+        <w:t>•</w:t>
+      </w:r>
+      <w:r>
+        <w:rPr>
+          <w:rFonts w:ascii="Book Antiqua" w:hAnsi="Book Antiqua"/>
+        </w:rPr>
+        <w:tab/>
+        <w:t>Integración de modelos como Llama 3, Mistral, o Phi-3</w:t>
+      </w:r>
+    </w:p>
+    <w:p>
+      <w:pPr>
+        <w:rPr>
+          <w:rFonts w:ascii="Book Antiqua" w:hAnsi="Book Antiqua"/>
+        </w:rPr>
+      </w:pPr>
+      <w:r>
+        <w:rPr>
+          <w:rFonts w:ascii="Book Antiqua" w:hAnsi="Book Antiqua"/>
+        </w:rPr>
+        <w:t>•</w:t>
+      </w:r>
+      <w:r>
+        <w:rPr>
+          <w:rFonts w:ascii="Book Antiqua" w:hAnsi="Book Antiqua"/>
+        </w:rPr>
+        <w:tab/>
+        <w:t>Implementación de técnicas de optimización (</w:t>
+      </w:r>
+      <w:proofErr w:type="spellStart"/>
+      <w:r>
+        <w:rPr>
+          <w:rFonts w:ascii="Book Antiqua" w:hAnsi="Book Antiqua"/>
+        </w:rPr>
+        <w:t>quantización</w:t>
+      </w:r>
+      <w:proofErr w:type="spellEnd"/>
+      <w:r>
+        <w:rPr>
+          <w:rFonts w:ascii="Book Antiqua" w:hAnsi="Book Antiqua"/>
+        </w:rPr>
+        <w:t xml:space="preserve">, </w:t>
+      </w:r>
+      <w:proofErr w:type="spellStart"/>
+      <w:r>
+        <w:rPr>
+          <w:rFonts w:ascii="Book Antiqua" w:hAnsi="Book Antiqua"/>
+        </w:rPr>
+        <w:t>LoRA</w:t>
+      </w:r>
+      <w:proofErr w:type="spellEnd"/>
+      <w:r>
+        <w:rPr>
+          <w:rFonts w:ascii="Book Antiqua" w:hAnsi="Book Antiqua"/>
+        </w:rPr>
+        <w:t>)</w:t>
+      </w:r>
+    </w:p>
+    <w:p>
+      <w:pPr>
+        <w:rPr>
+          <w:rFonts w:ascii="Book Antiqua" w:hAnsi="Book Antiqua"/>
+        </w:rPr>
+      </w:pPr>
+      <w:r>
+        <w:rPr>
+          <w:rFonts w:ascii="Book Antiqua" w:hAnsi="Book Antiqua"/>
+        </w:rPr>
+        <w:t>•</w:t>
+      </w:r>
+      <w:r>
+        <w:rPr>
+          <w:rFonts w:ascii="Book Antiqua" w:hAnsi="Book Antiqua"/>
+        </w:rPr>
+        <w:tab/>
+        <w:t xml:space="preserve">Sistema de </w:t>
+      </w:r>
+      <w:proofErr w:type="spellStart"/>
+      <w:r>
+        <w:rPr>
+          <w:rFonts w:ascii="Book Antiqua" w:hAnsi="Book Antiqua"/>
+        </w:rPr>
+        <w:t>prompting</w:t>
+      </w:r>
+      <w:proofErr w:type="spellEnd"/>
+      <w:r>
+        <w:rPr>
+          <w:rFonts w:ascii="Book Antiqua" w:hAnsi="Book Antiqua"/>
+        </w:rPr>
+        <w:t xml:space="preserve"> </w:t>
+      </w:r>
+      <w:proofErr w:type="spellStart"/>
+      <w:r>
+        <w:rPr>
+          <w:rFonts w:ascii="Book Antiqua" w:hAnsi="Book Antiqua"/>
+        </w:rPr>
+        <w:t>multiidioma</w:t>
+      </w:r>
+      <w:proofErr w:type="spellEnd"/>
+    </w:p>
+    <w:p>
+      <w:pPr>
+        <w:rPr>
+          <w:rFonts w:ascii="Book Antiqua" w:hAnsi="Book Antiqua"/>
+        </w:rPr>
+      </w:pPr>
+      <w:r>
+        <w:rPr>
+          <w:rFonts w:ascii="Book Antiqua" w:hAnsi="Book Antiqua"/>
+        </w:rPr>
+        <w:t xml:space="preserve">D) Sistema de </w:t>
+      </w:r>
+      <w:proofErr w:type="spellStart"/>
+      <w:r>
+        <w:rPr>
+          <w:rFonts w:ascii="Book Antiqua" w:hAnsi="Book Antiqua"/>
+        </w:rPr>
+        <w:t>Keywords</w:t>
+      </w:r>
+      <w:proofErr w:type="spellEnd"/>
+      <w:r>
+        <w:rPr>
+          <w:rFonts w:ascii="Book Antiqua" w:hAnsi="Book Antiqua"/>
+        </w:rPr>
+        <w:t xml:space="preserve"> y Metadatos</w:t>
+      </w:r>
+    </w:p>
+    <w:p>
+      <w:pPr>
+        <w:rPr>
+          <w:rFonts w:ascii="Book Antiqua" w:hAnsi="Book Antiqua"/>
+        </w:rPr>
+      </w:pPr>
+      <w:r>
+        <w:rPr>
+          <w:rFonts w:ascii="Book Antiqua" w:hAnsi="Book Antiqua"/>
+        </w:rPr>
+        <w:t>•</w:t>
+      </w:r>
+      <w:r>
+        <w:rPr>
+          <w:rFonts w:ascii="Book Antiqua" w:hAnsi="Book Antiqua"/>
+        </w:rPr>
+        <w:tab/>
+        <w:t xml:space="preserve">Extracción de </w:t>
+      </w:r>
+      <w:proofErr w:type="spellStart"/>
+      <w:r>
+        <w:rPr>
+          <w:rFonts w:ascii="Book Antiqua" w:hAnsi="Book Antiqua"/>
+        </w:rPr>
+        <w:t>keywords</w:t>
+      </w:r>
+      <w:proofErr w:type="spellEnd"/>
+      <w:r>
+        <w:rPr>
+          <w:rFonts w:ascii="Book Antiqua" w:hAnsi="Book Antiqua"/>
+        </w:rPr>
+        <w:t xml:space="preserve"> específica por idioma</w:t>
+      </w:r>
+    </w:p>
+    <w:p>
+      <w:pPr>
+        <w:rPr>
+          <w:rFonts w:ascii="Book Antiqua" w:hAnsi="Book Antiqua"/>
+        </w:rPr>
+      </w:pPr>
+      <w:r>
+        <w:rPr>
+          <w:rFonts w:ascii="Book Antiqua" w:hAnsi="Book Antiqua"/>
+        </w:rPr>
+        <w:t>•</w:t>
+      </w:r>
+      <w:r>
+        <w:rPr>
+          <w:rFonts w:ascii="Book Antiqua" w:hAnsi="Book Antiqua"/>
+        </w:rPr>
+        <w:tab/>
+        <w:t>Adaptación de los metadatos del índice para soportar múltiples idiomas</w:t>
+      </w:r>
+    </w:p>
+    <w:p>
+      <w:pPr>
+        <w:rPr>
+          <w:rFonts w:ascii="Book Antiqua" w:hAnsi="Book Antiqua"/>
+        </w:rPr>
+      </w:pPr>
+    </w:p>
+    <w:p>
+      <w:pPr>
+        <w:rPr>
+          <w:rFonts w:ascii="Book Antiqua" w:hAnsi="Book Antiqua"/>
+        </w:rPr>
+      </w:pPr>
+      <w:r>
+        <w:rPr>
+          <w:rFonts w:ascii="Book Antiqua" w:hAnsi="Book Antiqua"/>
+        </w:rPr>
+        <w:t>•</w:t>
+      </w:r>
+      <w:r>
+        <w:rPr>
+          <w:rFonts w:ascii="Book Antiqua" w:hAnsi="Book Antiqua"/>
+        </w:rPr>
+        <w:tab/>
+        <w:t xml:space="preserve">Mundo “grafos” de conocimiento, podríamos añadirlo en la ingesta y </w:t>
+      </w:r>
+      <w:proofErr w:type="spellStart"/>
+      <w:r>
+        <w:rPr>
+          <w:rFonts w:ascii="Book Antiqua" w:hAnsi="Book Antiqua"/>
+        </w:rPr>
+        <w:t>retrieval</w:t>
+      </w:r>
+      <w:proofErr w:type="spellEnd"/>
+      <w:r>
+        <w:rPr>
+          <w:rFonts w:ascii="Book Antiqua" w:hAnsi="Book Antiqua"/>
+        </w:rPr>
+        <w:t xml:space="preserve">, es más “moderno” y académico y conseguir un </w:t>
+      </w:r>
+      <w:proofErr w:type="spellStart"/>
+      <w:r>
+        <w:rPr>
+          <w:rFonts w:ascii="Book Antiqua" w:hAnsi="Book Antiqua"/>
+        </w:rPr>
+        <w:t>approach</w:t>
+      </w:r>
+      <w:proofErr w:type="spellEnd"/>
+      <w:r>
+        <w:rPr>
+          <w:rFonts w:ascii="Book Antiqua" w:hAnsi="Book Antiqua"/>
+        </w:rPr>
+        <w:t xml:space="preserve"> practico sería genial</w:t>
+      </w:r>
+    </w:p>
+    <w:p>
+      <w:pPr>
+        <w:rPr>
+          <w:rFonts w:ascii="Book Antiqua" w:hAnsi="Book Antiqua"/>
+        </w:rPr>
+      </w:pPr>
+      <w:r>
+        <w:rPr>
+          <w:rFonts w:ascii="Book Antiqua" w:hAnsi="Book Antiqua"/>
+        </w:rPr>
+        <w:t>•</w:t>
+      </w:r>
+      <w:r>
+        <w:rPr>
+          <w:rFonts w:ascii="Book Antiqua" w:hAnsi="Book Antiqua"/>
+        </w:rPr>
+        <w:tab/>
+        <w:t xml:space="preserve">Un </w:t>
+      </w:r>
+      <w:proofErr w:type="spellStart"/>
+      <w:r>
+        <w:rPr>
+          <w:rFonts w:ascii="Book Antiqua" w:hAnsi="Book Antiqua"/>
+        </w:rPr>
+        <w:t>rag</w:t>
+      </w:r>
+      <w:proofErr w:type="spellEnd"/>
+      <w:r>
+        <w:rPr>
+          <w:rFonts w:ascii="Book Antiqua" w:hAnsi="Book Antiqua"/>
+        </w:rPr>
+        <w:t xml:space="preserve"> que resuelva nuestros problemas típicos:</w:t>
+      </w:r>
+    </w:p>
+    <w:p>
+      <w:pPr>
+        <w:rPr>
+          <w:rFonts w:ascii="Book Antiqua" w:hAnsi="Book Antiqua"/>
+        </w:rPr>
+      </w:pPr>
+      <w:r>
+        <w:rPr>
+          <w:rFonts w:ascii="Book Antiqua" w:hAnsi="Book Antiqua"/>
+        </w:rPr>
+        <w:t>o</w:t>
+      </w:r>
+      <w:r>
+        <w:rPr>
+          <w:rFonts w:ascii="Book Antiqua" w:hAnsi="Book Antiqua"/>
+        </w:rPr>
+        <w:tab/>
+        <w:t xml:space="preserve">problema de una lista: “dame todas las personas que X”, “dame todos los modelos de </w:t>
+      </w:r>
+      <w:proofErr w:type="spellStart"/>
+      <w:proofErr w:type="gramStart"/>
+      <w:r>
+        <w:rPr>
+          <w:rFonts w:ascii="Book Antiqua" w:hAnsi="Book Antiqua"/>
+        </w:rPr>
+        <w:t>Iphone</w:t>
+      </w:r>
+      <w:proofErr w:type="spellEnd"/>
+      <w:r>
+        <w:rPr>
+          <w:rFonts w:ascii="Book Antiqua" w:hAnsi="Book Antiqua"/>
+        </w:rPr>
+        <w:t>”…</w:t>
+      </w:r>
+      <w:proofErr w:type="gramEnd"/>
+      <w:r>
+        <w:rPr>
+          <w:rFonts w:ascii="Book Antiqua" w:hAnsi="Book Antiqua"/>
+        </w:rPr>
+        <w:t xml:space="preserve"> como sabéis, al hacer </w:t>
+      </w:r>
+      <w:proofErr w:type="spellStart"/>
+      <w:r>
+        <w:rPr>
+          <w:rFonts w:ascii="Book Antiqua" w:hAnsi="Book Antiqua"/>
+        </w:rPr>
+        <w:t>trieval</w:t>
+      </w:r>
+      <w:proofErr w:type="spellEnd"/>
+      <w:r>
+        <w:rPr>
+          <w:rFonts w:ascii="Book Antiqua" w:hAnsi="Book Antiqua"/>
+        </w:rPr>
+        <w:t xml:space="preserve"> de 20-50 </w:t>
+      </w:r>
+      <w:proofErr w:type="spellStart"/>
+      <w:r>
+        <w:rPr>
+          <w:rFonts w:ascii="Book Antiqua" w:hAnsi="Book Antiqua"/>
+        </w:rPr>
+        <w:t>docs</w:t>
+      </w:r>
+      <w:proofErr w:type="spellEnd"/>
+      <w:r>
+        <w:rPr>
+          <w:rFonts w:ascii="Book Antiqua" w:hAnsi="Book Antiqua"/>
+        </w:rPr>
+        <w:t xml:space="preserve">, nunca sacas todos los </w:t>
+      </w:r>
+      <w:proofErr w:type="spellStart"/>
+      <w:r>
+        <w:rPr>
+          <w:rFonts w:ascii="Book Antiqua" w:hAnsi="Book Antiqua"/>
+        </w:rPr>
+        <w:t>docs</w:t>
+      </w:r>
+      <w:proofErr w:type="spellEnd"/>
+      <w:r>
+        <w:rPr>
+          <w:rFonts w:ascii="Book Antiqua" w:hAnsi="Book Antiqua"/>
+        </w:rPr>
+        <w:t xml:space="preserve"> con todos los “ítems” y por tanto erramos SIEMPRE</w:t>
+      </w:r>
+    </w:p>
+    <w:p>
+      <w:pPr>
+        <w:rPr>
+          <w:rFonts w:ascii="Book Antiqua" w:hAnsi="Book Antiqua"/>
+        </w:rPr>
+      </w:pPr>
+      <w:r>
+        <w:rPr>
+          <w:rFonts w:ascii="Book Antiqua" w:hAnsi="Book Antiqua"/>
+        </w:rPr>
+        <w:t>o</w:t>
+      </w:r>
+      <w:r>
+        <w:rPr>
+          <w:rFonts w:ascii="Book Antiqua" w:hAnsi="Book Antiqua"/>
+        </w:rPr>
+        <w:tab/>
+        <w:t>Documentos inconexos</w:t>
+      </w:r>
+    </w:p>
+    <w:p>
+      <w:pPr>
+        <w:rPr>
+          <w:rFonts w:ascii="Book Antiqua" w:hAnsi="Book Antiqua"/>
+        </w:rPr>
+      </w:pPr>
+      <w:r>
+        <w:rPr>
+          <w:rFonts w:ascii="Book Antiqua" w:hAnsi="Book Antiqua"/>
+        </w:rPr>
+        <w:t xml:space="preserve">Para resolver esto no se si necesitamos clasificación de palabra y flujos de </w:t>
+      </w:r>
+      <w:proofErr w:type="spellStart"/>
+      <w:r>
+        <w:rPr>
+          <w:rFonts w:ascii="Book Antiqua" w:hAnsi="Book Antiqua"/>
+        </w:rPr>
+        <w:t>retrival</w:t>
+      </w:r>
+      <w:proofErr w:type="spellEnd"/>
+      <w:r>
+        <w:rPr>
+          <w:rFonts w:ascii="Book Antiqua" w:hAnsi="Book Antiqua"/>
+        </w:rPr>
+        <w:t xml:space="preserve"> distinto, usar grafos o quizás múltiples agentes, que hagan múltiples búsquedas en paralelo y al final elegir la mejor respuesta…</w:t>
+      </w:r>
+    </w:p>
+    <w:p>
+      <w:pPr>
+        <w:rPr>
+          <w:rFonts w:ascii="Book Antiqua" w:hAnsi="Book Antiqua"/>
+        </w:rPr>
+      </w:pPr>
+      <w:r>
+        <w:rPr>
+          <w:rFonts w:ascii="Book Antiqua" w:hAnsi="Book Antiqua"/>
+        </w:rPr>
+        <w:t>3. Evaluación y Benchmarking</w:t>
+      </w:r>
+    </w:p>
+    <w:p>
+      <w:pPr>
+        <w:rPr>
+          <w:rFonts w:ascii="Book Antiqua" w:hAnsi="Book Antiqua"/>
+        </w:rPr>
+      </w:pPr>
+      <w:r>
+        <w:rPr>
+          <w:rFonts w:ascii="Book Antiqua" w:hAnsi="Book Antiqua"/>
+        </w:rPr>
+        <w:t>•</w:t>
+      </w:r>
+      <w:r>
+        <w:rPr>
+          <w:rFonts w:ascii="Book Antiqua" w:hAnsi="Book Antiqua"/>
+        </w:rPr>
+        <w:tab/>
+        <w:t>Métricas de calidad de respuestas (relevancia, precisión, completitud)</w:t>
+      </w:r>
+    </w:p>
+    <w:p>
+      <w:pPr>
+        <w:rPr>
+          <w:rFonts w:ascii="Book Antiqua" w:hAnsi="Book Antiqua"/>
+        </w:rPr>
+      </w:pPr>
+      <w:r>
+        <w:rPr>
+          <w:rFonts w:ascii="Book Antiqua" w:hAnsi="Book Antiqua"/>
+        </w:rPr>
+        <w:t>•</w:t>
+      </w:r>
+      <w:r>
+        <w:rPr>
+          <w:rFonts w:ascii="Book Antiqua" w:hAnsi="Book Antiqua"/>
+        </w:rPr>
+        <w:tab/>
+        <w:t>Análisis de costes y recursos computacionales</w:t>
+      </w:r>
+    </w:p>
+    <w:p>
+      <w:pPr>
+        <w:rPr>
+          <w:rFonts w:ascii="Book Antiqua" w:hAnsi="Book Antiqua"/>
+        </w:rPr>
+      </w:pPr>
+      <w:r>
+        <w:rPr>
+          <w:rFonts w:ascii="Book Antiqua" w:hAnsi="Book Antiqua"/>
+        </w:rPr>
+        <w:t>•</w:t>
+      </w:r>
+      <w:r>
+        <w:rPr>
+          <w:rFonts w:ascii="Book Antiqua" w:hAnsi="Book Antiqua"/>
+        </w:rPr>
+        <w:tab/>
+        <w:t>Evaluación específica por idioma (español, inglés, francés, etc.)</w:t>
+      </w:r>
+    </w:p>
+    <w:p>
+      <w:pPr>
+        <w:rPr>
+          <w:rFonts w:ascii="Book Antiqua" w:hAnsi="Book Antiqua"/>
+        </w:rPr>
+      </w:pPr>
+      <w:r>
+        <w:rPr>
+          <w:rFonts w:ascii="Book Antiqua" w:hAnsi="Book Antiqua"/>
+        </w:rPr>
+        <w:t>4. Casos de Uso</w:t>
+      </w:r>
+    </w:p>
+    <w:p>
+      <w:pPr>
+        <w:rPr>
+          <w:rFonts w:ascii="Book Antiqua" w:hAnsi="Book Antiqua"/>
+        </w:rPr>
+      </w:pPr>
+      <w:r>
+        <w:rPr>
+          <w:rFonts w:ascii="Book Antiqua" w:hAnsi="Book Antiqua"/>
+        </w:rPr>
+        <w:t>•</w:t>
+      </w:r>
+      <w:r>
+        <w:rPr>
+          <w:rFonts w:ascii="Book Antiqua" w:hAnsi="Book Antiqua"/>
+        </w:rPr>
+        <w:tab/>
+        <w:t>Implementación de al menos 2-3 casos de uso reales</w:t>
+      </w:r>
+    </w:p>
+    <w:p>
+      <w:pPr>
+        <w:rPr>
+          <w:rFonts w:ascii="Book Antiqua" w:hAnsi="Book Antiqua"/>
+        </w:rPr>
+      </w:pPr>
+      <w:r>
+        <w:rPr>
+          <w:rFonts w:ascii="Book Antiqua" w:hAnsi="Book Antiqua"/>
+        </w:rPr>
+        <w:t>•</w:t>
+      </w:r>
+      <w:r>
+        <w:rPr>
+          <w:rFonts w:ascii="Book Antiqua" w:hAnsi="Book Antiqua"/>
+        </w:rPr>
+        <w:tab/>
+        <w:t>Documentación de lecciones aprendidas</w:t>
+      </w:r>
+    </w:p>
+    <w:p>
+      <w:pPr>
+        <w:rPr>
+          <w:rFonts w:ascii="Book Antiqua" w:hAnsi="Book Antiqua"/>
+        </w:rPr>
+      </w:pPr>
+    </w:p>
+    <w:p>
+      <w:pPr>
+        <w:rPr>
+          <w:rFonts w:ascii="Book Antiqua" w:hAnsi="Book Antiqua"/>
+        </w:rPr>
+      </w:pPr>
+      <w:r>
+        <w:rPr>
+          <w:rFonts w:ascii="Book Antiqua" w:hAnsi="Book Antiqua"/>
+        </w:rPr>
+        <w:t>Entregables</w:t>
+      </w:r>
+    </w:p>
+    <w:p>
+      <w:pPr>
+        <w:rPr>
+          <w:rFonts w:ascii="Book Antiqua" w:hAnsi="Book Antiqua"/>
+        </w:rPr>
+      </w:pPr>
+      <w:r>
+        <w:rPr>
+          <w:rFonts w:ascii="Book Antiqua" w:hAnsi="Book Antiqua"/>
+        </w:rPr>
+        <w:t>1.</w:t>
+      </w:r>
+      <w:r>
+        <w:rPr>
+          <w:rFonts w:ascii="Book Antiqua" w:hAnsi="Book Antiqua"/>
+        </w:rPr>
+        <w:tab/>
+        <w:t>Memoria técnica con análisis, diseño e implementación</w:t>
+      </w:r>
+    </w:p>
+    <w:p>
+      <w:pPr>
+        <w:rPr>
+          <w:rFonts w:ascii="Book Antiqua" w:hAnsi="Book Antiqua"/>
+        </w:rPr>
+      </w:pPr>
+      <w:r>
+        <w:rPr>
+          <w:rFonts w:ascii="Book Antiqua" w:hAnsi="Book Antiqua"/>
+        </w:rPr>
+        <w:t>2.</w:t>
+      </w:r>
+      <w:r>
+        <w:rPr>
+          <w:rFonts w:ascii="Book Antiqua" w:hAnsi="Book Antiqua"/>
+        </w:rPr>
+        <w:tab/>
+        <w:t>Código fuente modular y documentado</w:t>
+      </w:r>
+    </w:p>
+    <w:p>
+      <w:pPr>
+        <w:rPr>
+          <w:rFonts w:ascii="Book Antiqua" w:hAnsi="Book Antiqua"/>
+        </w:rPr>
+      </w:pPr>
+      <w:r>
+        <w:rPr>
+          <w:rFonts w:ascii="Book Antiqua" w:hAnsi="Book Antiqua"/>
+        </w:rPr>
+        <w:t>3.</w:t>
+      </w:r>
+      <w:r>
+        <w:rPr>
+          <w:rFonts w:ascii="Book Antiqua" w:hAnsi="Book Antiqua"/>
+        </w:rPr>
+        <w:tab/>
+        <w:t>Guía de despliegue y configuración</w:t>
+      </w:r>
+    </w:p>
+    <w:p>
+      <w:pPr>
+        <w:rPr>
+          <w:rFonts w:ascii="Book Antiqua" w:hAnsi="Book Antiqua"/>
+        </w:rPr>
+      </w:pPr>
+      <w:r>
+        <w:rPr>
+          <w:rFonts w:ascii="Book Antiqua" w:hAnsi="Book Antiqua"/>
+        </w:rPr>
+        <w:t>4.</w:t>
+      </w:r>
+      <w:r>
+        <w:rPr>
+          <w:rFonts w:ascii="Book Antiqua" w:hAnsi="Book Antiqua"/>
+        </w:rPr>
+        <w:tab/>
+      </w:r>
+      <w:proofErr w:type="spellStart"/>
+      <w:r>
+        <w:rPr>
+          <w:rFonts w:ascii="Book Antiqua" w:hAnsi="Book Antiqua"/>
+        </w:rPr>
+        <w:t>Benchmarks</w:t>
+      </w:r>
+      <w:proofErr w:type="spellEnd"/>
+      <w:r>
+        <w:rPr>
+          <w:rFonts w:ascii="Book Antiqua" w:hAnsi="Book Antiqua"/>
+        </w:rPr>
+        <w:t xml:space="preserve"> y análisis de resultados</w:t>
+      </w:r>
+    </w:p>
+    <w:p>
+      <w:pPr>
+        <w:rPr>
+          <w:rFonts w:ascii="Book Antiqua" w:hAnsi="Book Antiqua"/>
+        </w:rPr>
+      </w:pPr>
+      <w:r>
+        <w:rPr>
+          <w:rFonts w:ascii="Book Antiqua" w:hAnsi="Book Antiqua"/>
+        </w:rPr>
+        <w:t>5.</w:t>
+      </w:r>
+      <w:r>
+        <w:rPr>
+          <w:rFonts w:ascii="Book Antiqua" w:hAnsi="Book Antiqua"/>
+        </w:rPr>
+        <w:tab/>
+        <w:t>Presentación de resultados</w:t>
+      </w:r>
+    </w:p>
+    <w:p>
+      <w:pPr>
+        <w:rPr>
+          <w:rFonts w:ascii="Book Antiqua" w:hAnsi="Book Antiqua"/>
+        </w:rPr>
+      </w:pPr>
+      <w:r>
+        <w:rPr>
+          <w:rFonts w:ascii="Book Antiqua" w:hAnsi="Book Antiqua"/>
+        </w:rPr>
+        <w:t>Valor Diferencial</w:t>
+      </w:r>
+    </w:p>
+    <w:p>
+      <w:pPr>
+        <w:rPr>
+          <w:rFonts w:ascii="Book Antiqua" w:hAnsi="Book Antiqua"/>
+        </w:rPr>
+      </w:pPr>
+      <w:r>
+        <w:rPr>
+          <w:rFonts w:ascii="Book Antiqua" w:hAnsi="Book Antiqua"/>
+        </w:rPr>
+        <w:t>•</w:t>
+      </w:r>
+      <w:r>
+        <w:rPr>
+          <w:rFonts w:ascii="Book Antiqua" w:hAnsi="Book Antiqua"/>
+        </w:rPr>
+        <w:tab/>
+        <w:t>Independencia tecnológica: No depende de servicios propietarios</w:t>
+      </w:r>
+    </w:p>
+    <w:p>
+      <w:pPr>
+        <w:rPr>
+          <w:rFonts w:ascii="Book Antiqua" w:hAnsi="Book Antiqua"/>
+        </w:rPr>
+      </w:pPr>
+      <w:r>
+        <w:rPr>
+          <w:rFonts w:ascii="Book Antiqua" w:hAnsi="Book Antiqua"/>
+        </w:rPr>
+        <w:t>•</w:t>
+      </w:r>
+      <w:r>
+        <w:rPr>
+          <w:rFonts w:ascii="Book Antiqua" w:hAnsi="Book Antiqua"/>
+        </w:rPr>
+        <w:tab/>
+      </w:r>
+      <w:proofErr w:type="spellStart"/>
+      <w:r>
+        <w:rPr>
+          <w:rFonts w:ascii="Book Antiqua" w:hAnsi="Book Antiqua"/>
+        </w:rPr>
+        <w:t>Multiidioma</w:t>
+      </w:r>
+      <w:proofErr w:type="spellEnd"/>
+      <w:r>
+        <w:rPr>
+          <w:rFonts w:ascii="Book Antiqua" w:hAnsi="Book Antiqua"/>
+        </w:rPr>
+        <w:t xml:space="preserve"> nativo: Diseñado desde el inicio para soportar múltiples idiomas</w:t>
+      </w:r>
+    </w:p>
+    <w:p>
+      <w:pPr>
+        <w:rPr>
+          <w:rFonts w:ascii="Book Antiqua" w:hAnsi="Book Antiqua"/>
+        </w:rPr>
+      </w:pPr>
+      <w:r>
+        <w:rPr>
+          <w:rFonts w:ascii="Book Antiqua" w:hAnsi="Book Antiqua"/>
+        </w:rPr>
+        <w:t>•</w:t>
+      </w:r>
+      <w:r>
+        <w:rPr>
+          <w:rFonts w:ascii="Book Antiqua" w:hAnsi="Book Antiqua"/>
+        </w:rPr>
+        <w:tab/>
+        <w:t>Modularidad: Componentes intercambiables y extensibles</w:t>
+      </w:r>
+    </w:p>
+    <w:p>
+      <w:pPr>
+        <w:rPr>
+          <w:rFonts w:ascii="Book Antiqua" w:hAnsi="Book Antiqua"/>
+        </w:rPr>
+      </w:pPr>
+      <w:r>
+        <w:rPr>
+          <w:rFonts w:ascii="Book Antiqua" w:hAnsi="Book Antiqua"/>
+        </w:rPr>
+        <w:t>•</w:t>
+      </w:r>
+      <w:r>
+        <w:rPr>
+          <w:rFonts w:ascii="Book Antiqua" w:hAnsi="Book Antiqua"/>
+        </w:rPr>
+        <w:tab/>
+        <w:t xml:space="preserve">Open </w:t>
+      </w:r>
+      <w:proofErr w:type="spellStart"/>
+      <w:r>
+        <w:rPr>
+          <w:rFonts w:ascii="Book Antiqua" w:hAnsi="Book Antiqua"/>
+        </w:rPr>
+        <w:t>Source</w:t>
+      </w:r>
+      <w:proofErr w:type="spellEnd"/>
+      <w:r>
+        <w:rPr>
+          <w:rFonts w:ascii="Book Antiqua" w:hAnsi="Book Antiqua"/>
+        </w:rPr>
+        <w:t>: Accesible para la comunidad académica y empresarial</w:t>
+      </w:r>
+    </w:p>
+    <w:p>
+      <w:pPr>
+        <w:rPr>
+          <w:rFonts w:ascii="Book Antiqua" w:hAnsi="Book Antiqua"/>
+        </w:rPr>
+      </w:pPr>
     </w:p>
     <w:sectPr>
       <w:pgSz w:w="11906" w:h="16838"/>
@@ -2772,18 +4599,18 @@
     <w:name w:val="Normal"/>
     <w:qFormat/>
   </w:style>
-  <w:style w:type="paragraph" w:styleId="Heading1">
+  <w:style w:type="paragraph" w:styleId="Ttulo1">
     <w:name w:val="heading 1"/>
     <w:basedOn w:val="Normal"/>
     <w:next w:val="Normal"/>
-    <w:link w:val="Heading1Char"/>
-    <w:autoRedefine/>
+    <w:link w:val="Ttulo1Car"/>
     <w:uiPriority w:val="9"/>
     <w:qFormat/>
-    <w:rsid w:val="00001170"/>
+    <w:rsid w:val="001D6C56"/>
     <w:pPr>
       <w:keepNext/>
       <w:keepLines/>
+      <w:pageBreakBefore/>
       <w:spacing w:before="80"/>
       <w:outlineLvl w:val="0"/>
     </w:pPr>
@@ -2794,11 +4621,11 @@
       <w:szCs w:val="40"/>
     </w:rPr>
   </w:style>
-  <w:style w:type="paragraph" w:styleId="Heading2">
+  <w:style w:type="paragraph" w:styleId="Ttulo2">
     <w:name w:val="heading 2"/>
     <w:basedOn w:val="Normal"/>
     <w:next w:val="Normal"/>
-    <w:link w:val="Heading2Char"/>
+    <w:link w:val="Ttulo2Car"/>
     <w:uiPriority w:val="9"/>
     <w:semiHidden/>
     <w:unhideWhenUsed/>
@@ -2817,11 +4644,11 @@
       <w:szCs w:val="32"/>
     </w:rPr>
   </w:style>
-  <w:style w:type="paragraph" w:styleId="Heading3">
+  <w:style w:type="paragraph" w:styleId="Ttulo3">
     <w:name w:val="heading 3"/>
     <w:basedOn w:val="Normal"/>
     <w:next w:val="Normal"/>
-    <w:link w:val="Heading3Char"/>
+    <w:link w:val="Ttulo3Car"/>
     <w:uiPriority w:val="9"/>
     <w:semiHidden/>
     <w:unhideWhenUsed/>
@@ -2840,11 +4667,11 @@
       <w:szCs w:val="28"/>
     </w:rPr>
   </w:style>
-  <w:style w:type="paragraph" w:styleId="Heading4">
+  <w:style w:type="paragraph" w:styleId="Ttulo4">
     <w:name w:val="heading 4"/>
     <w:basedOn w:val="Normal"/>
     <w:next w:val="Normal"/>
-    <w:link w:val="Heading4Char"/>
+    <w:link w:val="Ttulo4Car"/>
     <w:uiPriority w:val="9"/>
     <w:semiHidden/>
     <w:unhideWhenUsed/>
@@ -2863,11 +4690,11 @@
       <w:color w:val="2F5496" w:themeColor="accent1" w:themeShade="BF"/>
     </w:rPr>
   </w:style>
-  <w:style w:type="paragraph" w:styleId="Heading5">
+  <w:style w:type="paragraph" w:styleId="Ttulo5">
     <w:name w:val="heading 5"/>
     <w:basedOn w:val="Normal"/>
     <w:next w:val="Normal"/>
-    <w:link w:val="Heading5Char"/>
+    <w:link w:val="Ttulo5Car"/>
     <w:uiPriority w:val="9"/>
     <w:semiHidden/>
     <w:unhideWhenUsed/>
@@ -2884,11 +4711,11 @@
       <w:color w:val="2F5496" w:themeColor="accent1" w:themeShade="BF"/>
     </w:rPr>
   </w:style>
-  <w:style w:type="paragraph" w:styleId="Heading6">
+  <w:style w:type="paragraph" w:styleId="Ttulo6">
     <w:name w:val="heading 6"/>
     <w:basedOn w:val="Normal"/>
     <w:next w:val="Normal"/>
-    <w:link w:val="Heading6Char"/>
+    <w:link w:val="Ttulo6Car"/>
     <w:uiPriority w:val="9"/>
     <w:semiHidden/>
     <w:unhideWhenUsed/>
@@ -2907,11 +4734,11 @@
       <w:color w:val="595959" w:themeColor="text1" w:themeTint="A6"/>
     </w:rPr>
   </w:style>
-  <w:style w:type="paragraph" w:styleId="Heading7">
+  <w:style w:type="paragraph" w:styleId="Ttulo7">
     <w:name w:val="heading 7"/>
     <w:basedOn w:val="Normal"/>
     <w:next w:val="Normal"/>
-    <w:link w:val="Heading7Char"/>
+    <w:link w:val="Ttulo7Car"/>
     <w:uiPriority w:val="9"/>
     <w:semiHidden/>
     <w:unhideWhenUsed/>
@@ -2928,11 +4755,11 @@
       <w:color w:val="595959" w:themeColor="text1" w:themeTint="A6"/>
     </w:rPr>
   </w:style>
-  <w:style w:type="paragraph" w:styleId="Heading8">
+  <w:style w:type="paragraph" w:styleId="Ttulo8">
     <w:name w:val="heading 8"/>
     <w:basedOn w:val="Normal"/>
     <w:next w:val="Normal"/>
-    <w:link w:val="Heading8Char"/>
+    <w:link w:val="Ttulo8Car"/>
     <w:uiPriority w:val="9"/>
     <w:semiHidden/>
     <w:unhideWhenUsed/>
@@ -2951,11 +4778,11 @@
       <w:color w:val="272727" w:themeColor="text1" w:themeTint="D8"/>
     </w:rPr>
   </w:style>
-  <w:style w:type="paragraph" w:styleId="Heading9">
+  <w:style w:type="paragraph" w:styleId="Ttulo9">
     <w:name w:val="heading 9"/>
     <w:basedOn w:val="Normal"/>
     <w:next w:val="Normal"/>
-    <w:link w:val="Heading9Char"/>
+    <w:link w:val="Ttulo9Car"/>
     <w:uiPriority w:val="9"/>
     <w:semiHidden/>
     <w:unhideWhenUsed/>
@@ -2972,12 +4799,13 @@
       <w:color w:val="272727" w:themeColor="text1" w:themeTint="D8"/>
     </w:rPr>
   </w:style>
-  <w:style w:type="character" w:default="1" w:styleId="DefaultParagraphFont">
+  <w:style w:type="character" w:default="1" w:styleId="Fuentedeprrafopredeter">
     <w:name w:val="Default Paragraph Font"/>
     <w:uiPriority w:val="1"/>
+    <w:semiHidden/>
     <w:unhideWhenUsed/>
   </w:style>
-  <w:style w:type="table" w:default="1" w:styleId="TableNormal">
+  <w:style w:type="table" w:default="1" w:styleId="Tablanormal">
     <w:name w:val="Normal Table"/>
     <w:uiPriority w:val="99"/>
     <w:semiHidden/>
@@ -2992,18 +4820,18 @@
       </w:tblCellMar>
     </w:tblPr>
   </w:style>
-  <w:style w:type="numbering" w:default="1" w:styleId="NoList">
+  <w:style w:type="numbering" w:default="1" w:styleId="Sinlista">
     <w:name w:val="No List"/>
     <w:uiPriority w:val="99"/>
     <w:semiHidden/>
     <w:unhideWhenUsed/>
   </w:style>
-  <w:style w:type="character" w:customStyle="1" w:styleId="Heading1Char">
-    <w:name w:val="Heading 1 Char"/>
-    <w:basedOn w:val="DefaultParagraphFont"/>
-    <w:link w:val="Heading1"/>
+  <w:style w:type="character" w:customStyle="1" w:styleId="Ttulo1Car">
+    <w:name w:val="Título 1 Car"/>
+    <w:basedOn w:val="Fuentedeprrafopredeter"/>
+    <w:link w:val="Ttulo1"/>
     <w:uiPriority w:val="9"/>
-    <w:rsid w:val="00001170"/>
+    <w:rsid w:val="001D6C56"/>
     <w:rPr>
       <w:rFonts w:ascii="Book Antiqua" w:eastAsiaTheme="majorEastAsia" w:hAnsi="Book Antiqua" w:cstheme="majorBidi"/>
       <w:b/>
@@ -3011,10 +4839,10 @@
       <w:szCs w:val="40"/>
     </w:rPr>
   </w:style>
-  <w:style w:type="character" w:customStyle="1" w:styleId="Heading2Char">
-    <w:name w:val="Heading 2 Char"/>
-    <w:basedOn w:val="DefaultParagraphFont"/>
-    <w:link w:val="Heading2"/>
+  <w:style w:type="character" w:customStyle="1" w:styleId="Ttulo2Car">
+    <w:name w:val="Título 2 Car"/>
+    <w:basedOn w:val="Fuentedeprrafopredeter"/>
+    <w:link w:val="Ttulo2"/>
     <w:uiPriority w:val="9"/>
     <w:semiHidden/>
     <w:rsid w:val="00B61C5A"/>
@@ -3025,10 +4853,10 @@
       <w:szCs w:val="32"/>
     </w:rPr>
   </w:style>
-  <w:style w:type="character" w:customStyle="1" w:styleId="Heading3Char">
-    <w:name w:val="Heading 3 Char"/>
-    <w:basedOn w:val="DefaultParagraphFont"/>
-    <w:link w:val="Heading3"/>
+  <w:style w:type="character" w:customStyle="1" w:styleId="Ttulo3Car">
+    <w:name w:val="Título 3 Car"/>
+    <w:basedOn w:val="Fuentedeprrafopredeter"/>
+    <w:link w:val="Ttulo3"/>
     <w:uiPriority w:val="9"/>
     <w:semiHidden/>
     <w:rsid w:val="00B61C5A"/>
@@ -3039,10 +4867,10 @@
       <w:szCs w:val="28"/>
     </w:rPr>
   </w:style>
-  <w:style w:type="character" w:customStyle="1" w:styleId="Heading4Char">
-    <w:name w:val="Heading 4 Char"/>
-    <w:basedOn w:val="DefaultParagraphFont"/>
-    <w:link w:val="Heading4"/>
+  <w:style w:type="character" w:customStyle="1" w:styleId="Ttulo4Car">
+    <w:name w:val="Título 4 Car"/>
+    <w:basedOn w:val="Fuentedeprrafopredeter"/>
+    <w:link w:val="Ttulo4"/>
     <w:uiPriority w:val="9"/>
     <w:semiHidden/>
     <w:rsid w:val="00B61C5A"/>
@@ -3053,10 +4881,10 @@
       <w:color w:val="2F5496" w:themeColor="accent1" w:themeShade="BF"/>
     </w:rPr>
   </w:style>
-  <w:style w:type="character" w:customStyle="1" w:styleId="Heading5Char">
-    <w:name w:val="Heading 5 Char"/>
-    <w:basedOn w:val="DefaultParagraphFont"/>
-    <w:link w:val="Heading5"/>
+  <w:style w:type="character" w:customStyle="1" w:styleId="Ttulo5Car">
+    <w:name w:val="Título 5 Car"/>
+    <w:basedOn w:val="Fuentedeprrafopredeter"/>
+    <w:link w:val="Ttulo5"/>
     <w:uiPriority w:val="9"/>
     <w:semiHidden/>
     <w:rsid w:val="00B61C5A"/>
@@ -3065,10 +4893,10 @@
       <w:color w:val="2F5496" w:themeColor="accent1" w:themeShade="BF"/>
     </w:rPr>
   </w:style>
-  <w:style w:type="character" w:customStyle="1" w:styleId="Heading6Char">
-    <w:name w:val="Heading 6 Char"/>
-    <w:basedOn w:val="DefaultParagraphFont"/>
-    <w:link w:val="Heading6"/>
+  <w:style w:type="character" w:customStyle="1" w:styleId="Ttulo6Car">
+    <w:name w:val="Título 6 Car"/>
+    <w:basedOn w:val="Fuentedeprrafopredeter"/>
+    <w:link w:val="Ttulo6"/>
     <w:uiPriority w:val="9"/>
     <w:semiHidden/>
     <w:rsid w:val="00B61C5A"/>
@@ -3079,10 +4907,10 @@
       <w:color w:val="595959" w:themeColor="text1" w:themeTint="A6"/>
     </w:rPr>
   </w:style>
-  <w:style w:type="character" w:customStyle="1" w:styleId="Heading7Char">
-    <w:name w:val="Heading 7 Char"/>
-    <w:basedOn w:val="DefaultParagraphFont"/>
-    <w:link w:val="Heading7"/>
+  <w:style w:type="character" w:customStyle="1" w:styleId="Ttulo7Car">
+    <w:name w:val="Título 7 Car"/>
+    <w:basedOn w:val="Fuentedeprrafopredeter"/>
+    <w:link w:val="Ttulo7"/>
     <w:uiPriority w:val="9"/>
     <w:semiHidden/>
     <w:rsid w:val="00B61C5A"/>
@@ -3091,10 +4919,10 @@
       <w:color w:val="595959" w:themeColor="text1" w:themeTint="A6"/>
     </w:rPr>
   </w:style>
-  <w:style w:type="character" w:customStyle="1" w:styleId="Heading8Char">
-    <w:name w:val="Heading 8 Char"/>
-    <w:basedOn w:val="DefaultParagraphFont"/>
-    <w:link w:val="Heading8"/>
+  <w:style w:type="character" w:customStyle="1" w:styleId="Ttulo8Car">
+    <w:name w:val="Título 8 Car"/>
+    <w:basedOn w:val="Fuentedeprrafopredeter"/>
+    <w:link w:val="Ttulo8"/>
     <w:uiPriority w:val="9"/>
     <w:semiHidden/>
     <w:rsid w:val="00B61C5A"/>
@@ -3105,10 +4933,10 @@
       <w:color w:val="272727" w:themeColor="text1" w:themeTint="D8"/>
     </w:rPr>
   </w:style>
-  <w:style w:type="character" w:customStyle="1" w:styleId="Heading9Char">
-    <w:name w:val="Heading 9 Char"/>
-    <w:basedOn w:val="DefaultParagraphFont"/>
-    <w:link w:val="Heading9"/>
+  <w:style w:type="character" w:customStyle="1" w:styleId="Ttulo9Car">
+    <w:name w:val="Título 9 Car"/>
+    <w:basedOn w:val="Fuentedeprrafopredeter"/>
+    <w:link w:val="Ttulo9"/>
     <w:uiPriority w:val="9"/>
     <w:semiHidden/>
     <w:rsid w:val="00B61C5A"/>
@@ -3117,11 +4945,11 @@
       <w:color w:val="272727" w:themeColor="text1" w:themeTint="D8"/>
     </w:rPr>
   </w:style>
-  <w:style w:type="paragraph" w:styleId="Title">
+  <w:style w:type="paragraph" w:styleId="Ttulo">
     <w:name w:val="Title"/>
     <w:basedOn w:val="Normal"/>
     <w:next w:val="Normal"/>
-    <w:link w:val="TitleChar"/>
+    <w:link w:val="TtuloCar"/>
     <w:uiPriority w:val="10"/>
     <w:qFormat/>
     <w:rsid w:val="00B61C5A"/>
@@ -3137,10 +4965,10 @@
       <w:szCs w:val="56"/>
     </w:rPr>
   </w:style>
-  <w:style w:type="character" w:customStyle="1" w:styleId="TitleChar">
-    <w:name w:val="Title Char"/>
-    <w:basedOn w:val="DefaultParagraphFont"/>
-    <w:link w:val="Title"/>
+  <w:style w:type="character" w:customStyle="1" w:styleId="TtuloCar">
+    <w:name w:val="Título Car"/>
+    <w:basedOn w:val="Fuentedeprrafopredeter"/>
+    <w:link w:val="Ttulo"/>
     <w:uiPriority w:val="10"/>
     <w:rsid w:val="00B61C5A"/>
     <w:rPr>
@@ -3151,11 +4979,11 @@
       <w:szCs w:val="56"/>
     </w:rPr>
   </w:style>
-  <w:style w:type="paragraph" w:styleId="Subtitle">
+  <w:style w:type="paragraph" w:styleId="Subttulo">
     <w:name w:val="Subtitle"/>
     <w:basedOn w:val="Normal"/>
     <w:next w:val="Normal"/>
-    <w:link w:val="SubtitleChar"/>
+    <w:link w:val="SubttuloCar"/>
     <w:uiPriority w:val="11"/>
     <w:qFormat/>
     <w:rsid w:val="00B61C5A"/>
@@ -3173,10 +5001,10 @@
       <w:szCs w:val="28"/>
     </w:rPr>
   </w:style>
-  <w:style w:type="character" w:customStyle="1" w:styleId="SubtitleChar">
-    <w:name w:val="Subtitle Char"/>
-    <w:basedOn w:val="DefaultParagraphFont"/>
-    <w:link w:val="Subtitle"/>
+  <w:style w:type="character" w:customStyle="1" w:styleId="SubttuloCar">
+    <w:name w:val="Subtítulo Car"/>
+    <w:basedOn w:val="Fuentedeprrafopredeter"/>
+    <w:link w:val="Subttulo"/>
     <w:uiPriority w:val="11"/>
     <w:rsid w:val="00B61C5A"/>
     <w:rPr>
@@ -3187,11 +5015,11 @@
       <w:szCs w:val="28"/>
     </w:rPr>
   </w:style>
-  <w:style w:type="paragraph" w:styleId="Quote">
+  <w:style w:type="paragraph" w:styleId="Cita">
     <w:name w:val="Quote"/>
     <w:basedOn w:val="Normal"/>
     <w:next w:val="Normal"/>
-    <w:link w:val="QuoteChar"/>
+    <w:link w:val="CitaCar"/>
     <w:uiPriority w:val="29"/>
     <w:qFormat/>
     <w:rsid w:val="00B61C5A"/>
@@ -3205,10 +5033,10 @@
       <w:color w:val="404040" w:themeColor="text1" w:themeTint="BF"/>
     </w:rPr>
   </w:style>
-  <w:style w:type="character" w:customStyle="1" w:styleId="QuoteChar">
-    <w:name w:val="Quote Char"/>
-    <w:basedOn w:val="DefaultParagraphFont"/>
-    <w:link w:val="Quote"/>
+  <w:style w:type="character" w:customStyle="1" w:styleId="CitaCar">
+    <w:name w:val="Cita Car"/>
+    <w:basedOn w:val="Fuentedeprrafopredeter"/>
+    <w:link w:val="Cita"/>
     <w:uiPriority w:val="29"/>
     <w:rsid w:val="00B61C5A"/>
     <w:rPr>
@@ -3217,7 +5045,7 @@
       <w:color w:val="404040" w:themeColor="text1" w:themeTint="BF"/>
     </w:rPr>
   </w:style>
-  <w:style w:type="paragraph" w:styleId="ListParagraph">
+  <w:style w:type="paragraph" w:styleId="Prrafodelista">
     <w:name w:val="List Paragraph"/>
     <w:basedOn w:val="Normal"/>
     <w:uiPriority w:val="34"/>
@@ -3228,9 +5056,9 @@
       <w:contextualSpacing/>
     </w:pPr>
   </w:style>
-  <w:style w:type="character" w:styleId="IntenseEmphasis">
+  <w:style w:type="character" w:styleId="nfasisintenso">
     <w:name w:val="Intense Emphasis"/>
-    <w:basedOn w:val="DefaultParagraphFont"/>
+    <w:basedOn w:val="Fuentedeprrafopredeter"/>
     <w:uiPriority w:val="21"/>
     <w:qFormat/>
     <w:rsid w:val="00B61C5A"/>
@@ -3240,11 +5068,11 @@
       <w:color w:val="2F5496" w:themeColor="accent1" w:themeShade="BF"/>
     </w:rPr>
   </w:style>
-  <w:style w:type="paragraph" w:styleId="IntenseQuote">
+  <w:style w:type="paragraph" w:styleId="Citadestacada">
     <w:name w:val="Intense Quote"/>
     <w:basedOn w:val="Normal"/>
     <w:next w:val="Normal"/>
-    <w:link w:val="IntenseQuoteChar"/>
+    <w:link w:val="CitadestacadaCar"/>
     <w:uiPriority w:val="30"/>
     <w:qFormat/>
     <w:rsid w:val="00B61C5A"/>
@@ -3263,10 +5091,10 @@
       <w:color w:val="2F5496" w:themeColor="accent1" w:themeShade="BF"/>
     </w:rPr>
   </w:style>
-  <w:style w:type="character" w:customStyle="1" w:styleId="IntenseQuoteChar">
-    <w:name w:val="Intense Quote Char"/>
-    <w:basedOn w:val="DefaultParagraphFont"/>
-    <w:link w:val="IntenseQuote"/>
+  <w:style w:type="character" w:customStyle="1" w:styleId="CitadestacadaCar">
+    <w:name w:val="Cita destacada Car"/>
+    <w:basedOn w:val="Fuentedeprrafopredeter"/>
+    <w:link w:val="Citadestacada"/>
     <w:uiPriority w:val="30"/>
     <w:rsid w:val="00B61C5A"/>
     <w:rPr>
@@ -3275,9 +5103,9 @@
       <w:color w:val="2F5496" w:themeColor="accent1" w:themeShade="BF"/>
     </w:rPr>
   </w:style>
-  <w:style w:type="character" w:styleId="IntenseReference">
+  <w:style w:type="character" w:styleId="Referenciaintensa">
     <w:name w:val="Intense Reference"/>
-    <w:basedOn w:val="DefaultParagraphFont"/>
+    <w:basedOn w:val="Fuentedeprrafopredeter"/>
     <w:uiPriority w:val="32"/>
     <w:qFormat/>
     <w:rsid w:val="00B61C5A"/>
@@ -3289,9 +5117,9 @@
       <w:spacing w:val="5"/>
     </w:rPr>
   </w:style>
-  <w:style w:type="character" w:styleId="Hyperlink">
+  <w:style w:type="character" w:styleId="Hipervnculo">
     <w:name w:val="Hyperlink"/>
-    <w:basedOn w:val="DefaultParagraphFont"/>
+    <w:basedOn w:val="Fuentedeprrafopredeter"/>
     <w:uiPriority w:val="99"/>
     <w:unhideWhenUsed/>
     <w:rsid w:val="00A37B61"/>
@@ -3300,9 +5128,9 @@
       <w:u w:val="single"/>
     </w:rPr>
   </w:style>
-  <w:style w:type="character" w:styleId="UnresolvedMention">
+  <w:style w:type="character" w:styleId="Mencinsinresolver">
     <w:name w:val="Unresolved Mention"/>
-    <w:basedOn w:val="DefaultParagraphFont"/>
+    <w:basedOn w:val="Fuentedeprrafopredeter"/>
     <w:uiPriority w:val="99"/>
     <w:semiHidden/>
     <w:unhideWhenUsed/>
@@ -3310,6 +5138,35 @@
     <w:rPr>
       <w:color w:val="605E5C"/>
       <w:shd w:val="clear" w:color="auto" w:fill="E1DFDD"/>
+    </w:rPr>
+  </w:style>
+  <w:style w:type="paragraph" w:customStyle="1" w:styleId="Ttuloaux">
+    <w:name w:val="Título aux"/>
+    <w:basedOn w:val="Ttulo1"/>
+    <w:link w:val="TtuloauxCar"/>
+    <w:autoRedefine/>
+    <w:qFormat/>
+    <w:rsid w:val="001D6C56"/>
+    <w:pPr>
+      <w:pageBreakBefore w:val="0"/>
+    </w:pPr>
+    <w:rPr>
+      <w:rFonts w:eastAsiaTheme="minorHAnsi"/>
+      <w:sz w:val="24"/>
+      <w:u w:val="single"/>
+    </w:rPr>
+  </w:style>
+  <w:style w:type="character" w:customStyle="1" w:styleId="TtuloauxCar">
+    <w:name w:val="Título aux Car"/>
+    <w:basedOn w:val="Ttulo1Car"/>
+    <w:link w:val="Ttuloaux"/>
+    <w:rsid w:val="001D6C56"/>
+    <w:rPr>
+      <w:rFonts w:ascii="Book Antiqua" w:eastAsiaTheme="majorEastAsia" w:hAnsi="Book Antiqua" w:cstheme="majorBidi"/>
+      <w:b/>
+      <w:sz w:val="24"/>
+      <w:szCs w:val="40"/>
+      <w:u w:val="single"/>
     </w:rPr>
   </w:style>
 </w:styles>

</xml_diff>

<commit_message>
refactor: Update import paths to use src module structure and clean up config usage
</commit_message>
<xml_diff>
--- a/doc/Memoria supongo.docx
+++ b/doc/Memoria supongo.docx
@@ -2071,12 +2071,20 @@
         </w:rPr>
         <w:t xml:space="preserve">Para </w:t>
       </w:r>
+      <w:proofErr w:type="spellStart"/>
       <w:proofErr w:type="gramStart"/>
       <w:r>
         <w:rPr>
           <w:rFonts w:ascii="Book Antiqua" w:hAnsi="Book Antiqua"/>
         </w:rPr>
-        <w:t>el .</w:t>
+        <w:t>el</w:t>
+      </w:r>
+      <w:proofErr w:type="spellEnd"/>
+      <w:r>
+        <w:rPr>
+          <w:rFonts w:ascii="Book Antiqua" w:hAnsi="Book Antiqua"/>
+        </w:rPr>
+        <w:t xml:space="preserve"> .</w:t>
       </w:r>
       <w:proofErr w:type="spellStart"/>
       <w:r>
@@ -2117,6 +2125,7 @@
       <w:r>
         <w:rPr>
           <w:rFonts w:ascii="Book Antiqua" w:hAnsi="Book Antiqua"/>
+          <w:noProof/>
         </w:rPr>
         <w:drawing>
           <wp:inline distT="0" distB="0" distL="0" distR="0" wp14:anchorId="1B5ECF16" wp14:editId="0FC4E02C">
@@ -2178,6 +2187,7 @@
       <w:r>
         <w:rPr>
           <w:rFonts w:ascii="Book Antiqua" w:hAnsi="Book Antiqua"/>
+          <w:noProof/>
         </w:rPr>
         <w:drawing>
           <wp:inline distT="0" distB="0" distL="0" distR="0" wp14:anchorId="0F1D5F5E" wp14:editId="13531473">

</xml_diff>

<commit_message>
feat: Implement CV chunking pipeline and data generation modules
- Added doc_chunking_cvs.py for processing CVs into semantic chunks and uploading to Cosmos DB.
- Introduced processchunks_cvs.py for generating semantic chunks from structured CV JSON.
- Created runner.py to execute the CV chunking process for multiple languages.
- Updated generate_cvs.py and generate_eu.py with module docstrings for clarity.
- Removed generate_valid_data.py as it was redundant.
- Refactored azure_storage_service.py to streamline Azure storage key and container name usage.
- Added a new runner for synthetic data generation, integrating CV, EU, and Wikipedia document generation.
</commit_message>
<xml_diff>
--- a/doc/Memoria supongo.docx
+++ b/doc/Memoria supongo.docx
@@ -158,7 +158,6 @@
         <w:t xml:space="preserve">coge más </w:t>
       </w:r>
       <w:proofErr w:type="spellStart"/>
-      <w:proofErr w:type="gramStart"/>
       <w:r>
         <w:rPr>
           <w:rFonts w:ascii="Book Antiqua" w:hAnsi="Book Antiqua"/>
@@ -166,7 +165,6 @@
         <w:t>chunks</w:t>
       </w:r>
       <w:proofErr w:type="spellEnd"/>
-      <w:proofErr w:type="gramEnd"/>
       <w:r>
         <w:rPr>
           <w:rFonts w:ascii="Book Antiqua" w:hAnsi="Book Antiqua"/>
@@ -251,7 +249,88 @@
         </w:rPr>
       </w:pPr>
     </w:p>
-    <w:p/>
+    <w:p>
+      <w:r>
+        <w:t xml:space="preserve">Vamos a implementar el </w:t>
+      </w:r>
+      <w:proofErr w:type="spellStart"/>
+      <w:r>
+        <w:t>chunkeo</w:t>
+      </w:r>
+      <w:proofErr w:type="spellEnd"/>
+      <w:r>
+        <w:t xml:space="preserve"> de </w:t>
+      </w:r>
+      <w:proofErr w:type="spellStart"/>
+      <w:r>
+        <w:t>CVs</w:t>
+      </w:r>
+      <w:proofErr w:type="spellEnd"/>
+      <w:r>
+        <w:t xml:space="preserve"> ahora paso a paso y poco a poco. Lo primero será crear un doc_chunking_cvs.py dentro de </w:t>
+      </w:r>
+      <w:proofErr w:type="spellStart"/>
+      <w:r>
+        <w:t>src</w:t>
+      </w:r>
+      <w:proofErr w:type="spellEnd"/>
+      <w:r>
+        <w:t>/</w:t>
+      </w:r>
+      <w:proofErr w:type="spellStart"/>
+      <w:r>
+        <w:t>document_ingestion</w:t>
+      </w:r>
+      <w:proofErr w:type="spellEnd"/>
+      <w:r>
+        <w:t>/</w:t>
+      </w:r>
+      <w:proofErr w:type="spellStart"/>
+      <w:r>
+        <w:t>cvs</w:t>
+      </w:r>
+      <w:proofErr w:type="spellEnd"/>
+      <w:r>
+        <w:t xml:space="preserve">/ que 1. copie tal cual el contenido del script doc_chunking.py 2. adapte ese código para </w:t>
+      </w:r>
+      <w:proofErr w:type="spellStart"/>
+      <w:r>
+        <w:t>chunkear</w:t>
+      </w:r>
+      <w:proofErr w:type="spellEnd"/>
+      <w:r>
+        <w:t xml:space="preserve"> </w:t>
+      </w:r>
+      <w:proofErr w:type="spellStart"/>
+      <w:r>
+        <w:t>cvs</w:t>
+      </w:r>
+      <w:proofErr w:type="spellEnd"/>
+      <w:r>
+        <w:t xml:space="preserve"> en vez de </w:t>
+      </w:r>
+      <w:proofErr w:type="spellStart"/>
+      <w:r>
+        <w:t>pdfs</w:t>
+      </w:r>
+      <w:proofErr w:type="spellEnd"/>
+      <w:r>
+        <w:t xml:space="preserve">. Ten en cuenta que los </w:t>
+      </w:r>
+      <w:proofErr w:type="spellStart"/>
+      <w:r>
+        <w:t>cvs</w:t>
+      </w:r>
+      <w:proofErr w:type="spellEnd"/>
+      <w:r>
+        <w:t xml:space="preserve"> están almacenados en el blob </w:t>
+      </w:r>
+      <w:proofErr w:type="spellStart"/>
+      <w:r>
+        <w:t>storage</w:t>
+      </w:r>
+      <w:proofErr w:type="spellEnd"/>
+    </w:p>
     <w:p/>
     <w:p/>
     <w:p/>
@@ -306,14 +385,7 @@
         <w:rPr>
           <w:rFonts w:ascii="Book Antiqua" w:hAnsi="Book Antiqua"/>
         </w:rPr>
-        <w:t xml:space="preserve"> </w:t>
-      </w:r>
-      <w:proofErr w:type="gramStart"/>
-      <w:r>
-        <w:rPr>
-          <w:rFonts w:ascii="Book Antiqua" w:hAnsi="Book Antiqua"/>
-        </w:rPr>
-        <w:t>en .</w:t>
+        <w:t xml:space="preserve"> en .</w:t>
       </w:r>
       <w:proofErr w:type="spellStart"/>
       <w:r>
@@ -323,7 +395,6 @@
         <w:t>json</w:t>
       </w:r>
       <w:proofErr w:type="spellEnd"/>
-      <w:proofErr w:type="gramEnd"/>
       <w:r>
         <w:rPr>
           <w:rFonts w:ascii="Book Antiqua" w:hAnsi="Book Antiqua"/>
@@ -384,14 +455,7 @@
         <w:rPr>
           <w:rFonts w:ascii="Book Antiqua" w:hAnsi="Book Antiqua"/>
         </w:rPr>
-        <w:t xml:space="preserve">Obras de literatura. Lo tengo guardado </w:t>
-      </w:r>
-      <w:proofErr w:type="gramStart"/>
-      <w:r>
-        <w:rPr>
-          <w:rFonts w:ascii="Book Antiqua" w:hAnsi="Book Antiqua"/>
-        </w:rPr>
-        <w:t>en .</w:t>
+        <w:t>Obras de literatura. Lo tengo guardado en .</w:t>
       </w:r>
       <w:proofErr w:type="spellStart"/>
       <w:r>
@@ -401,7 +465,6 @@
         <w:t>json</w:t>
       </w:r>
       <w:proofErr w:type="spellEnd"/>
-      <w:proofErr w:type="gramEnd"/>
       <w:r>
         <w:rPr>
           <w:rFonts w:ascii="Book Antiqua" w:hAnsi="Book Antiqua"/>
@@ -450,7 +513,6 @@
         <w:t xml:space="preserve">Generamos también </w:t>
       </w:r>
       <w:proofErr w:type="spellStart"/>
-      <w:proofErr w:type="gramStart"/>
       <w:r>
         <w:rPr>
           <w:rFonts w:ascii="Book Antiqua" w:hAnsi="Book Antiqua"/>
@@ -458,19 +520,11 @@
         <w:t>schema.json</w:t>
       </w:r>
       <w:proofErr w:type="spellEnd"/>
-      <w:proofErr w:type="gramEnd"/>
-      <w:r>
-        <w:rPr>
-          <w:rFonts w:ascii="Book Antiqua" w:hAnsi="Book Antiqua"/>
-        </w:rPr>
-        <w:t xml:space="preserve"> para los </w:t>
-      </w:r>
-      <w:proofErr w:type="gramStart"/>
-      <w:r>
-        <w:rPr>
-          <w:rFonts w:ascii="Book Antiqua" w:hAnsi="Book Antiqua"/>
-        </w:rPr>
-        <w:t>archivos .</w:t>
+      <w:r>
+        <w:rPr>
+          <w:rFonts w:ascii="Book Antiqua" w:hAnsi="Book Antiqua"/>
+        </w:rPr>
+        <w:t xml:space="preserve"> para los archivos .</w:t>
       </w:r>
       <w:proofErr w:type="spellStart"/>
       <w:r>
@@ -480,7 +534,6 @@
         <w:t>json</w:t>
       </w:r>
       <w:proofErr w:type="spellEnd"/>
-      <w:proofErr w:type="gramEnd"/>
       <w:r>
         <w:rPr>
           <w:rFonts w:ascii="Book Antiqua" w:hAnsi="Book Antiqua"/>
@@ -1132,71 +1185,42 @@
       <w:pPr>
         <w:rPr>
           <w:rFonts w:ascii="Book Antiqua" w:hAnsi="Book Antiqua"/>
-          <w:lang w:val="en-US"/>
-        </w:rPr>
-      </w:pPr>
-      <w:proofErr w:type="spellStart"/>
-      <w:r>
-        <w:rPr>
-          <w:rFonts w:ascii="Book Antiqua" w:hAnsi="Book Antiqua"/>
-          <w:lang w:val="en-US"/>
-        </w:rPr>
-        <w:t>Instalar</w:t>
-      </w:r>
-      <w:proofErr w:type="spellEnd"/>
-      <w:r>
-        <w:rPr>
-          <w:rFonts w:ascii="Book Antiqua" w:hAnsi="Book Antiqua"/>
-          <w:lang w:val="en-US"/>
-        </w:rPr>
-        <w:t xml:space="preserve"> </w:t>
-      </w:r>
-      <w:proofErr w:type="spellStart"/>
-      <w:r>
-        <w:rPr>
-          <w:rFonts w:ascii="Book Antiqua" w:hAnsi="Book Antiqua"/>
-          <w:lang w:val="en-US"/>
-        </w:rPr>
-        <w:t>fitz</w:t>
-      </w:r>
-      <w:proofErr w:type="spellEnd"/>
-      <w:r>
-        <w:rPr>
-          <w:rFonts w:ascii="Book Antiqua" w:hAnsi="Book Antiqua"/>
-          <w:lang w:val="en-US"/>
-        </w:rPr>
-        <w:t xml:space="preserve">: pip install --upgrade </w:t>
-      </w:r>
-      <w:proofErr w:type="spellStart"/>
-      <w:r>
-        <w:rPr>
-          <w:rFonts w:ascii="Book Antiqua" w:hAnsi="Book Antiqua"/>
-          <w:lang w:val="en-US"/>
-        </w:rPr>
-        <w:t>pymupdf</w:t>
-      </w:r>
-      <w:proofErr w:type="spellEnd"/>
-      <w:r>
-        <w:rPr>
-          <w:rFonts w:ascii="Book Antiqua" w:hAnsi="Book Antiqua"/>
-          <w:lang w:val="en-US"/>
+        </w:rPr>
+      </w:pPr>
+      <w:r>
+        <w:rPr>
+          <w:rFonts w:ascii="Book Antiqua" w:hAnsi="Book Antiqua"/>
+        </w:rPr>
+        <w:t>Instalar fitz: pip install --upgrade pymupdf</w:t>
+      </w:r>
+      <w:r>
+        <w:rPr>
+          <w:rFonts w:ascii="Book Antiqua" w:hAnsi="Book Antiqua"/>
         </w:rPr>
         <w:t xml:space="preserve"> (</w:t>
       </w:r>
-      <w:hyperlink r:id="rId6" w:history="1">
-        <w:r>
-          <w:rPr>
-            <w:rStyle w:val="Hipervnculo"/>
-            <w:rFonts w:ascii="Book Antiqua" w:hAnsi="Book Antiqua"/>
-            <w:lang w:val="en-US"/>
-          </w:rPr>
-          <w:t>https://pymupdf.readthedocs.io/en/latest/index.html</w:t>
-        </w:r>
-      </w:hyperlink>
-      <w:r>
-        <w:rPr>
-          <w:rFonts w:ascii="Book Antiqua" w:hAnsi="Book Antiqua"/>
-          <w:lang w:val="en-US"/>
+      <w:r>
+        <w:fldChar w:fldCharType="begin"/>
+      </w:r>
+      <w:r>
+        <w:instrText>HYPERLINK "https://pymupdf.readthedocs.io/en/latest/index.html"</w:instrText>
+      </w:r>
+      <w:r>
+        <w:fldChar w:fldCharType="separate"/>
+      </w:r>
+      <w:r>
+        <w:rPr>
+          <w:rStyle w:val="Hipervnculo"/>
+          <w:rFonts w:ascii="Book Antiqua" w:hAnsi="Book Antiqua"/>
+        </w:rPr>
+        <w:t>https://pymupdf.readthedocs.io/en/latest/index.html</w:t>
+      </w:r>
+      <w:r>
+        <w:fldChar w:fldCharType="end"/>
+      </w:r>
+      <w:r>
+        <w:rPr>
+          <w:rFonts w:ascii="Book Antiqua" w:hAnsi="Book Antiqua"/>
         </w:rPr>
         <w:t>)</w:t>
       </w:r>
@@ -1238,7 +1262,6 @@
         <w:t>pdf</w:t>
       </w:r>
       <w:proofErr w:type="spellEnd"/>
-      <w:proofErr w:type="gramStart"/>
       <w:r>
         <w:rPr>
           <w:rFonts w:ascii="Book Antiqua" w:hAnsi="Book Antiqua"/>
@@ -1253,7 +1276,6 @@
         <w:t>json</w:t>
       </w:r>
       <w:proofErr w:type="spellEnd"/>
-      <w:proofErr w:type="gramEnd"/>
       <w:r>
         <w:rPr>
           <w:rFonts w:ascii="Book Antiqua" w:hAnsi="Book Antiqua"/>
@@ -1272,14 +1294,7 @@
         <w:rPr>
           <w:rFonts w:ascii="Book Antiqua" w:hAnsi="Book Antiqua"/>
         </w:rPr>
-        <w:t xml:space="preserve">) lo más parecido posible. Por eso, el primer paso es extraer el texto de cada uno de ellos. Esto parece algo ineficiente, ya que de </w:t>
-      </w:r>
-      <w:proofErr w:type="gramStart"/>
-      <w:r>
-        <w:rPr>
-          <w:rFonts w:ascii="Book Antiqua" w:hAnsi="Book Antiqua"/>
-        </w:rPr>
-        <w:t>un .</w:t>
+        <w:t>) lo más parecido posible. Por eso, el primer paso es extraer el texto de cada uno de ellos. Esto parece algo ineficiente, ya que de un .</w:t>
       </w:r>
       <w:proofErr w:type="spellStart"/>
       <w:r>
@@ -1289,7 +1304,6 @@
         <w:t>json</w:t>
       </w:r>
       <w:proofErr w:type="spellEnd"/>
-      <w:proofErr w:type="gramEnd"/>
       <w:r>
         <w:rPr>
           <w:rFonts w:ascii="Book Antiqua" w:hAnsi="Book Antiqua"/>
@@ -1572,7 +1586,6 @@
         <w:t xml:space="preserve"> sea un CV distinto. Esta idea contradice el objetivo del </w:t>
       </w:r>
       <w:proofErr w:type="spellStart"/>
-      <w:proofErr w:type="gramStart"/>
       <w:r>
         <w:rPr>
           <w:rFonts w:ascii="Book Antiqua" w:hAnsi="Book Antiqua"/>
@@ -1580,7 +1593,6 @@
         <w:t>chunking</w:t>
       </w:r>
       <w:proofErr w:type="spellEnd"/>
-      <w:proofErr w:type="gramEnd"/>
       <w:r>
         <w:rPr>
           <w:rFonts w:ascii="Book Antiqua" w:hAnsi="Book Antiqua"/>
@@ -1946,7 +1958,7 @@
           <w:rFonts w:ascii="Book Antiqua" w:hAnsi="Book Antiqua"/>
         </w:rPr>
       </w:pPr>
-      <w:hyperlink r:id="rId7" w:history="1">
+      <w:hyperlink r:id="rId6" w:history="1">
         <w:r>
           <w:rPr>
             <w:rStyle w:val="Hipervnculo"/>
@@ -1987,14 +1999,7 @@
         <w:rPr>
           <w:rFonts w:ascii="Book Antiqua" w:hAnsi="Book Antiqua"/>
         </w:rPr>
-        <w:t xml:space="preserve"> </w:t>
-      </w:r>
-      <w:proofErr w:type="gramStart"/>
-      <w:r>
-        <w:rPr>
-          <w:rFonts w:ascii="Book Antiqua" w:hAnsi="Book Antiqua"/>
-        </w:rPr>
-        <w:t>y .</w:t>
+        <w:t xml:space="preserve"> y .</w:t>
       </w:r>
       <w:proofErr w:type="spellStart"/>
       <w:r>
@@ -2004,7 +2009,6 @@
         <w:t>json</w:t>
       </w:r>
       <w:proofErr w:type="spellEnd"/>
-      <w:proofErr w:type="gramEnd"/>
       <w:r>
         <w:rPr>
           <w:rFonts w:ascii="Book Antiqua" w:hAnsi="Book Antiqua"/>
@@ -2015,14 +2019,7 @@
         <w:rPr>
           <w:rFonts w:ascii="Book Antiqua" w:hAnsi="Book Antiqua"/>
         </w:rPr>
-        <w:t xml:space="preserve">. </w:t>
-      </w:r>
-      <w:proofErr w:type="gramStart"/>
-      <w:r>
-        <w:rPr>
-          <w:rFonts w:ascii="Book Antiqua" w:hAnsi="Book Antiqua"/>
-        </w:rPr>
-        <w:t xml:space="preserve">DEPENDE DE </w:t>
+        <w:t xml:space="preserve">. DEPENDE DE </w:t>
       </w:r>
       <w:proofErr w:type="spellStart"/>
       <w:r>
@@ -2038,7 +2035,6 @@
         </w:rPr>
         <w:t>!!</w:t>
       </w:r>
-      <w:proofErr w:type="gramEnd"/>
     </w:p>
     <w:p>
       <w:pPr>
@@ -2072,7 +2068,6 @@
         <w:t xml:space="preserve">Para </w:t>
       </w:r>
       <w:proofErr w:type="spellStart"/>
-      <w:proofErr w:type="gramStart"/>
       <w:r>
         <w:rPr>
           <w:rFonts w:ascii="Book Antiqua" w:hAnsi="Book Antiqua"/>
@@ -2094,7 +2089,6 @@
         <w:t>env</w:t>
       </w:r>
       <w:proofErr w:type="spellEnd"/>
-      <w:proofErr w:type="gramEnd"/>
       <w:r>
         <w:rPr>
           <w:rFonts w:ascii="Book Antiqua" w:hAnsi="Book Antiqua"/>
@@ -2143,7 +2137,7 @@
                     <pic:cNvPicPr/>
                   </pic:nvPicPr>
                   <pic:blipFill>
-                    <a:blip r:embed="rId8"/>
+                    <a:blip r:embed="rId7"/>
                     <a:stretch>
                       <a:fillRect/>
                     </a:stretch>
@@ -2205,7 +2199,7 @@
                     <pic:cNvPicPr/>
                   </pic:nvPicPr>
                   <pic:blipFill>
-                    <a:blip r:embed="rId9"/>
+                    <a:blip r:embed="rId8"/>
                     <a:stretch>
                       <a:fillRect/>
                     </a:stretch>
@@ -3465,7 +3459,6 @@
         <w:t xml:space="preserve">problema de una lista: “dame todas las personas que X”, “dame todos los modelos de </w:t>
       </w:r>
       <w:proofErr w:type="spellStart"/>
-      <w:proofErr w:type="gramStart"/>
       <w:r>
         <w:rPr>
           <w:rFonts w:ascii="Book Antiqua" w:hAnsi="Book Antiqua"/>
@@ -3477,14 +3470,7 @@
         <w:rPr>
           <w:rFonts w:ascii="Book Antiqua" w:hAnsi="Book Antiqua"/>
         </w:rPr>
-        <w:t>”…</w:t>
-      </w:r>
-      <w:proofErr w:type="gramEnd"/>
-      <w:r>
-        <w:rPr>
-          <w:rFonts w:ascii="Book Antiqua" w:hAnsi="Book Antiqua"/>
-        </w:rPr>
-        <w:t xml:space="preserve"> como sabéis, al hacer </w:t>
+        <w:t xml:space="preserve">”… como sabéis, al hacer </w:t>
       </w:r>
       <w:proofErr w:type="spellStart"/>
       <w:r>

</xml_diff>

<commit_message>
Add EU and Wikipedia document ingestion pipelines
- Implemented runner for chunking EU legislative documents from Blob Storage to Cosmos DB.
- Created index and indexer for Azure Search specific to Wikipedia articles with hybrid search capabilities.
- Developed chunking pipeline for Wikipedia articles, including JSON download, text processing, and Cosmos DB upload.
- Added helper functions for processing and uploading Wikipedia chunks.
- Introduced a new module for managing Wikipedia article metadata and chunking logic.
- Created a test script for initial validation of the new ingestion processes.
</commit_message>
<xml_diff>
--- a/doc/Memoria supongo.docx
+++ b/doc/Memoria supongo.docx
@@ -249,88 +249,6 @@
         </w:rPr>
       </w:pPr>
     </w:p>
-    <w:p>
-      <w:r>
-        <w:t xml:space="preserve">Vamos a implementar el </w:t>
-      </w:r>
-      <w:proofErr w:type="spellStart"/>
-      <w:r>
-        <w:t>chunkeo</w:t>
-      </w:r>
-      <w:proofErr w:type="spellEnd"/>
-      <w:r>
-        <w:t xml:space="preserve"> de </w:t>
-      </w:r>
-      <w:proofErr w:type="spellStart"/>
-      <w:r>
-        <w:t>CVs</w:t>
-      </w:r>
-      <w:proofErr w:type="spellEnd"/>
-      <w:r>
-        <w:t xml:space="preserve"> ahora paso a paso y poco a poco. Lo primero será crear un doc_chunking_cvs.py dentro de </w:t>
-      </w:r>
-      <w:proofErr w:type="spellStart"/>
-      <w:r>
-        <w:t>src</w:t>
-      </w:r>
-      <w:proofErr w:type="spellEnd"/>
-      <w:r>
-        <w:t>/</w:t>
-      </w:r>
-      <w:proofErr w:type="spellStart"/>
-      <w:r>
-        <w:t>document_ingestion</w:t>
-      </w:r>
-      <w:proofErr w:type="spellEnd"/>
-      <w:r>
-        <w:t>/</w:t>
-      </w:r>
-      <w:proofErr w:type="spellStart"/>
-      <w:r>
-        <w:t>cvs</w:t>
-      </w:r>
-      <w:proofErr w:type="spellEnd"/>
-      <w:r>
-        <w:t xml:space="preserve">/ que 1. copie tal cual el contenido del script doc_chunking.py 2. adapte ese código para </w:t>
-      </w:r>
-      <w:proofErr w:type="spellStart"/>
-      <w:r>
-        <w:t>chunkear</w:t>
-      </w:r>
-      <w:proofErr w:type="spellEnd"/>
-      <w:r>
-        <w:t xml:space="preserve"> </w:t>
-      </w:r>
-      <w:proofErr w:type="spellStart"/>
-      <w:r>
-        <w:t>cvs</w:t>
-      </w:r>
-      <w:proofErr w:type="spellEnd"/>
-      <w:r>
-        <w:t xml:space="preserve"> en vez de </w:t>
-      </w:r>
-      <w:proofErr w:type="spellStart"/>
-      <w:r>
-        <w:t>pdfs</w:t>
-      </w:r>
-      <w:proofErr w:type="spellEnd"/>
-      <w:r>
-        <w:t xml:space="preserve">. Ten en cuenta que los </w:t>
-      </w:r>
-      <w:proofErr w:type="spellStart"/>
-      <w:r>
-        <w:t>cvs</w:t>
-      </w:r>
-      <w:proofErr w:type="spellEnd"/>
-      <w:r>
-        <w:t xml:space="preserve"> están almacenados en el blob </w:t>
-      </w:r>
-      <w:proofErr w:type="spellStart"/>
-      <w:r>
-        <w:t>storage</w:t>
-      </w:r>
-      <w:proofErr w:type="spellEnd"/>
-    </w:p>
     <w:p/>
     <w:p/>
     <w:p/>
@@ -1191,33 +1109,87 @@
         <w:rPr>
           <w:rFonts w:ascii="Book Antiqua" w:hAnsi="Book Antiqua"/>
         </w:rPr>
-        <w:t>Instalar fitz: pip install --upgrade pymupdf</w:t>
-      </w:r>
+        <w:t xml:space="preserve">Instalar </w:t>
+      </w:r>
+      <w:proofErr w:type="spellStart"/>
+      <w:r>
+        <w:rPr>
+          <w:rFonts w:ascii="Book Antiqua" w:hAnsi="Book Antiqua"/>
+        </w:rPr>
+        <w:t>fitz</w:t>
+      </w:r>
+      <w:proofErr w:type="spellEnd"/>
+      <w:r>
+        <w:rPr>
+          <w:rFonts w:ascii="Book Antiqua" w:hAnsi="Book Antiqua"/>
+        </w:rPr>
+        <w:t xml:space="preserve">: </w:t>
+      </w:r>
+      <w:proofErr w:type="spellStart"/>
+      <w:r>
+        <w:rPr>
+          <w:rFonts w:ascii="Book Antiqua" w:hAnsi="Book Antiqua"/>
+        </w:rPr>
+        <w:t>pip</w:t>
+      </w:r>
+      <w:proofErr w:type="spellEnd"/>
+      <w:r>
+        <w:rPr>
+          <w:rFonts w:ascii="Book Antiqua" w:hAnsi="Book Antiqua"/>
+        </w:rPr>
+        <w:t xml:space="preserve"> </w:t>
+      </w:r>
+      <w:proofErr w:type="spellStart"/>
+      <w:r>
+        <w:rPr>
+          <w:rFonts w:ascii="Book Antiqua" w:hAnsi="Book Antiqua"/>
+        </w:rPr>
+        <w:t>install</w:t>
+      </w:r>
+      <w:proofErr w:type="spellEnd"/>
+      <w:r>
+        <w:rPr>
+          <w:rFonts w:ascii="Book Antiqua" w:hAnsi="Book Antiqua"/>
+        </w:rPr>
+        <w:t xml:space="preserve"> --</w:t>
+      </w:r>
+      <w:proofErr w:type="spellStart"/>
+      <w:r>
+        <w:rPr>
+          <w:rFonts w:ascii="Book Antiqua" w:hAnsi="Book Antiqua"/>
+        </w:rPr>
+        <w:t>upgrade</w:t>
+      </w:r>
+      <w:proofErr w:type="spellEnd"/>
+      <w:r>
+        <w:rPr>
+          <w:rFonts w:ascii="Book Antiqua" w:hAnsi="Book Antiqua"/>
+        </w:rPr>
+        <w:t xml:space="preserve"> </w:t>
+      </w:r>
+      <w:proofErr w:type="spellStart"/>
+      <w:r>
+        <w:rPr>
+          <w:rFonts w:ascii="Book Antiqua" w:hAnsi="Book Antiqua"/>
+        </w:rPr>
+        <w:t>pymupdf</w:t>
+      </w:r>
+      <w:proofErr w:type="spellEnd"/>
       <w:r>
         <w:rPr>
           <w:rFonts w:ascii="Book Antiqua" w:hAnsi="Book Antiqua"/>
         </w:rPr>
         <w:t xml:space="preserve"> (</w:t>
       </w:r>
-      <w:r>
-        <w:fldChar w:fldCharType="begin"/>
-      </w:r>
-      <w:r>
-        <w:instrText>HYPERLINK "https://pymupdf.readthedocs.io/en/latest/index.html"</w:instrText>
-      </w:r>
-      <w:r>
-        <w:fldChar w:fldCharType="separate"/>
-      </w:r>
-      <w:r>
-        <w:rPr>
-          <w:rStyle w:val="Hipervnculo"/>
-          <w:rFonts w:ascii="Book Antiqua" w:hAnsi="Book Antiqua"/>
-        </w:rPr>
-        <w:t>https://pymupdf.readthedocs.io/en/latest/index.html</w:t>
-      </w:r>
-      <w:r>
-        <w:fldChar w:fldCharType="end"/>
-      </w:r>
+      <w:hyperlink r:id="rId6" w:history="1">
+        <w:r>
+          <w:rPr>
+            <w:rStyle w:val="Hipervnculo"/>
+            <w:rFonts w:ascii="Book Antiqua" w:hAnsi="Book Antiqua"/>
+          </w:rPr>
+          <w:t>https://pymupdf.readthedocs.io/en/latest/index.html</w:t>
+        </w:r>
+      </w:hyperlink>
       <w:r>
         <w:rPr>
           <w:rFonts w:ascii="Book Antiqua" w:hAnsi="Book Antiqua"/>
@@ -1958,7 +1930,7 @@
           <w:rFonts w:ascii="Book Antiqua" w:hAnsi="Book Antiqua"/>
         </w:rPr>
       </w:pPr>
-      <w:hyperlink r:id="rId6" w:history="1">
+      <w:hyperlink r:id="rId7" w:history="1">
         <w:r>
           <w:rPr>
             <w:rStyle w:val="Hipervnculo"/>
@@ -2137,7 +2109,7 @@
                     <pic:cNvPicPr/>
                   </pic:nvPicPr>
                   <pic:blipFill>
-                    <a:blip r:embed="rId7"/>
+                    <a:blip r:embed="rId8"/>
                     <a:stretch>
                       <a:fillRect/>
                     </a:stretch>
@@ -2199,7 +2171,7 @@
                     <pic:cNvPicPr/>
                   </pic:nvPicPr>
                   <pic:blipFill>
-                    <a:blip r:embed="rId8"/>
+                    <a:blip r:embed="rId9"/>
                     <a:stretch>
                       <a:fillRect/>
                     </a:stretch>

</xml_diff>

<commit_message>
feat: Implement RAG strategies for retrieval and processing, including BasicFusion, CvsParallel, and GraphRag strategies; update config and app_langgraph for strategy selection
</commit_message>
<xml_diff>
--- a/doc/Memoria supongo.docx
+++ b/doc/Memoria supongo.docx
@@ -4713,14 +4713,7 @@
         <w:rPr>
           <w:rFonts w:ascii="Book Antiqua" w:hAnsi="Book Antiqua"/>
         </w:rPr>
-        <w:t>por ejemplo “de”, “la”, “que</w:t>
-      </w:r>
-      <w:proofErr w:type="gramStart"/>
-      <w:r>
-        <w:rPr>
-          <w:rFonts w:ascii="Book Antiqua" w:hAnsi="Book Antiqua"/>
-        </w:rPr>
-        <w:t>”</w:t>
+        <w:t>por ejemplo “de”, “la”, “que”</w:t>
       </w:r>
       <w:r>
         <w:rPr>
@@ -4732,14 +4725,7 @@
         <w:rPr>
           <w:rFonts w:ascii="Book Antiqua" w:hAnsi="Book Antiqua"/>
         </w:rPr>
-        <w:t>…</w:t>
-      </w:r>
-      <w:proofErr w:type="gramEnd"/>
-      <w:r>
-        <w:rPr>
-          <w:rFonts w:ascii="Book Antiqua" w:hAnsi="Book Antiqua"/>
-        </w:rPr>
-        <w:t>)</w:t>
+        <w:t>…)</w:t>
       </w:r>
       <w:r>
         <w:rPr>
@@ -4804,25 +4790,43 @@
           <w:color w:val="4472C4" w:themeColor="accent1"/>
           <w:lang w:val="en-US"/>
         </w:rPr>
-        <w:t xml:space="preserve">"        </w:t>
-      </w:r>
-      <w:proofErr w:type="gramStart"/>
-      <w:r>
+        <w:t>"        →  [chunk_23 (×4), chunk_47 (×1), chunk_89 (×2)]</w:t>
+      </w:r>
+    </w:p>
+    <w:p>
+      <w:pPr>
+        <w:ind w:left="1080"/>
         <w:rPr>
           <w:rFonts w:ascii="Book Antiqua" w:hAnsi="Book Antiqua"/>
           <w:color w:val="4472C4" w:themeColor="accent1"/>
           <w:lang w:val="en-US"/>
         </w:rPr>
-        <w:t>→  [</w:t>
-      </w:r>
-      <w:proofErr w:type="gramEnd"/>
+      </w:pPr>
       <w:r>
         <w:rPr>
           <w:rFonts w:ascii="Book Antiqua" w:hAnsi="Book Antiqua"/>
           <w:color w:val="4472C4" w:themeColor="accent1"/>
           <w:lang w:val="en-US"/>
         </w:rPr>
-        <w:t>chunk_23 (×4), chunk_47 (×1), chunk_89 (×2)]</w:t>
+        <w:t>"</w:t>
+      </w:r>
+      <w:proofErr w:type="spellStart"/>
+      <w:r>
+        <w:rPr>
+          <w:rFonts w:ascii="Book Antiqua" w:hAnsi="Book Antiqua"/>
+          <w:color w:val="4472C4" w:themeColor="accent1"/>
+          <w:lang w:val="en-US"/>
+        </w:rPr>
+        <w:t>certificado</w:t>
+      </w:r>
+      <w:proofErr w:type="spellEnd"/>
+      <w:r>
+        <w:rPr>
+          <w:rFonts w:ascii="Book Antiqua" w:hAnsi="Book Antiqua"/>
+          <w:color w:val="4472C4" w:themeColor="accent1"/>
+          <w:lang w:val="en-US"/>
+        </w:rPr>
+        <w:t>" → [chunk_23 (×2), chunk_61 (×3)]</w:t>
       </w:r>
     </w:p>
     <w:p>
@@ -4831,14 +4835,12 @@
         <w:rPr>
           <w:rFonts w:ascii="Book Antiqua" w:hAnsi="Book Antiqua"/>
           <w:color w:val="4472C4" w:themeColor="accent1"/>
-          <w:lang w:val="en-US"/>
-        </w:rPr>
-      </w:pPr>
-      <w:r>
-        <w:rPr>
-          <w:rFonts w:ascii="Book Antiqua" w:hAnsi="Book Antiqua"/>
-          <w:color w:val="4472C4" w:themeColor="accent1"/>
-          <w:lang w:val="en-US"/>
+        </w:rPr>
+      </w:pPr>
+      <w:r>
+        <w:rPr>
+          <w:rFonts w:ascii="Book Antiqua" w:hAnsi="Book Antiqua"/>
+          <w:color w:val="4472C4" w:themeColor="accent1"/>
         </w:rPr>
         <w:t>"</w:t>
       </w:r>
@@ -4847,40 +4849,6 @@
         <w:rPr>
           <w:rFonts w:ascii="Book Antiqua" w:hAnsi="Book Antiqua"/>
           <w:color w:val="4472C4" w:themeColor="accent1"/>
-          <w:lang w:val="en-US"/>
-        </w:rPr>
-        <w:t>certificado</w:t>
-      </w:r>
-      <w:proofErr w:type="spellEnd"/>
-      <w:r>
-        <w:rPr>
-          <w:rFonts w:ascii="Book Antiqua" w:hAnsi="Book Antiqua"/>
-          <w:color w:val="4472C4" w:themeColor="accent1"/>
-          <w:lang w:val="en-US"/>
-        </w:rPr>
-        <w:t>" → [chunk_23 (×2), chunk_61 (×3)]</w:t>
-      </w:r>
-    </w:p>
-    <w:p>
-      <w:pPr>
-        <w:ind w:left="1080"/>
-        <w:rPr>
-          <w:rFonts w:ascii="Book Antiqua" w:hAnsi="Book Antiqua"/>
-          <w:color w:val="4472C4" w:themeColor="accent1"/>
-        </w:rPr>
-      </w:pPr>
-      <w:r>
-        <w:rPr>
-          <w:rFonts w:ascii="Book Antiqua" w:hAnsi="Book Antiqua"/>
-          <w:color w:val="4472C4" w:themeColor="accent1"/>
-        </w:rPr>
-        <w:t>"</w:t>
-      </w:r>
-      <w:proofErr w:type="spellStart"/>
-      <w:r>
-        <w:rPr>
-          <w:rFonts w:ascii="Book Antiqua" w:hAnsi="Book Antiqua"/>
-          <w:color w:val="4472C4" w:themeColor="accent1"/>
         </w:rPr>
         <w:t>cloud</w:t>
       </w:r>
@@ -4890,23 +4858,7 @@
           <w:rFonts w:ascii="Book Antiqua" w:hAnsi="Book Antiqua"/>
           <w:color w:val="4472C4" w:themeColor="accent1"/>
         </w:rPr>
-        <w:t xml:space="preserve">"      </w:t>
-      </w:r>
-      <w:proofErr w:type="gramStart"/>
-      <w:r>
-        <w:rPr>
-          <w:rFonts w:ascii="Book Antiqua" w:hAnsi="Book Antiqua"/>
-          <w:color w:val="4472C4" w:themeColor="accent1"/>
-        </w:rPr>
-        <w:t>→  [</w:t>
-      </w:r>
-      <w:proofErr w:type="gramEnd"/>
-      <w:r>
-        <w:rPr>
-          <w:rFonts w:ascii="Book Antiqua" w:hAnsi="Book Antiqua"/>
-          <w:color w:val="4472C4" w:themeColor="accent1"/>
-        </w:rPr>
-        <w:t>chunk_12 (×5), chunk_23 (×1), ...]</w:t>
+        <w:t>"      →  [chunk_12 (×5), chunk_23 (×1), ...]</w:t>
       </w:r>
     </w:p>
     <w:p>
@@ -5364,25 +5316,7 @@
           <w:color w:val="4472C4" w:themeColor="accent1"/>
           <w:lang w:val="en-US"/>
         </w:rPr>
-        <w:t>(</w:t>
-      </w:r>
-      <w:proofErr w:type="gramStart"/>
-      <w:r>
-        <w:rPr>
-          <w:rFonts w:ascii="Book Antiqua" w:hAnsi="Book Antiqua"/>
-          <w:color w:val="4472C4" w:themeColor="accent1"/>
-          <w:lang w:val="en-US"/>
-        </w:rPr>
-        <w:t>query)  #</w:t>
-      </w:r>
-      <w:proofErr w:type="gramEnd"/>
-      <w:r>
-        <w:rPr>
-          <w:rFonts w:ascii="Book Antiqua" w:hAnsi="Book Antiqua"/>
-          <w:color w:val="4472C4" w:themeColor="accent1"/>
-          <w:lang w:val="en-US"/>
-        </w:rPr>
-        <w:t xml:space="preserve"> vector de la query</w:t>
+        <w:t>(query)  # vector de la query</w:t>
       </w:r>
     </w:p>
     <w:p>
@@ -5410,19 +5344,9 @@
           <w:color w:val="4472C4" w:themeColor="accent1"/>
           <w:lang w:val="en-US"/>
         </w:rPr>
-        <w:t>search_</w:t>
-      </w:r>
-      <w:proofErr w:type="gramStart"/>
-      <w:r>
-        <w:rPr>
-          <w:rFonts w:ascii="Book Antiqua" w:hAnsi="Book Antiqua"/>
-          <w:color w:val="4472C4" w:themeColor="accent1"/>
-          <w:lang w:val="en-US"/>
-        </w:rPr>
-        <w:t>client.search</w:t>
-      </w:r>
-      <w:proofErr w:type="spellEnd"/>
-      <w:proofErr w:type="gramEnd"/>
+        <w:t>search_client.search</w:t>
+      </w:r>
+      <w:proofErr w:type="spellEnd"/>
       <w:r>
         <w:rPr>
           <w:rFonts w:ascii="Book Antiqua" w:hAnsi="Book Antiqua"/>
@@ -5466,7 +5390,6 @@
         <w:t>=</w:t>
       </w:r>
       <w:proofErr w:type="spellStart"/>
-      <w:proofErr w:type="gramStart"/>
       <w:r>
         <w:rPr>
           <w:rFonts w:ascii="Book Antiqua" w:hAnsi="Book Antiqua"/>
@@ -5480,15 +5403,7 @@
           <w:rFonts w:ascii="Book Antiqua" w:hAnsi="Book Antiqua"/>
           <w:color w:val="4472C4" w:themeColor="accent1"/>
         </w:rPr>
-        <w:t xml:space="preserve">,   </w:t>
-      </w:r>
-      <w:proofErr w:type="gramEnd"/>
-      <w:r>
-        <w:rPr>
-          <w:rFonts w:ascii="Book Antiqua" w:hAnsi="Book Antiqua"/>
-          <w:color w:val="4472C4" w:themeColor="accent1"/>
-        </w:rPr>
-        <w:t xml:space="preserve">                     # búsqueda léxica</w:t>
+        <w:t>,                        # búsqueda léxica</w:t>
       </w:r>
     </w:p>
     <w:p>
@@ -5516,7 +5431,6 @@
         <w:t>vector_queries</w:t>
       </w:r>
       <w:proofErr w:type="spellEnd"/>
-      <w:proofErr w:type="gramStart"/>
       <w:r>
         <w:rPr>
           <w:rFonts w:ascii="Book Antiqua" w:hAnsi="Book Antiqua"/>
@@ -5540,7 +5454,6 @@
         </w:rPr>
         <w:t>(</w:t>
       </w:r>
-      <w:proofErr w:type="gramEnd"/>
     </w:p>
     <w:p>
       <w:pPr>
@@ -5574,34 +5487,16 @@
           <w:color w:val="4472C4" w:themeColor="accent1"/>
           <w:lang w:val="en-US"/>
         </w:rPr>
-        <w:t>query_</w:t>
-      </w:r>
-      <w:proofErr w:type="gramStart"/>
+        <w:t>query_embedding</w:t>
+      </w:r>
+      <w:proofErr w:type="spellEnd"/>
       <w:r>
         <w:rPr>
           <w:rFonts w:ascii="Book Antiqua" w:hAnsi="Book Antiqua"/>
           <w:color w:val="4472C4" w:themeColor="accent1"/>
           <w:lang w:val="en-US"/>
         </w:rPr>
-        <w:t>embedding</w:t>
-      </w:r>
-      <w:proofErr w:type="spellEnd"/>
-      <w:r>
-        <w:rPr>
-          <w:rFonts w:ascii="Book Antiqua" w:hAnsi="Book Antiqua"/>
-          <w:color w:val="4472C4" w:themeColor="accent1"/>
-          <w:lang w:val="en-US"/>
-        </w:rPr>
-        <w:t xml:space="preserve">,   </w:t>
-      </w:r>
-      <w:proofErr w:type="gramEnd"/>
-      <w:r>
-        <w:rPr>
-          <w:rFonts w:ascii="Book Antiqua" w:hAnsi="Book Antiqua"/>
-          <w:color w:val="4472C4" w:themeColor="accent1"/>
-          <w:lang w:val="en-US"/>
-        </w:rPr>
-        <w:t xml:space="preserve">            # </w:t>
+        <w:t xml:space="preserve">,               # </w:t>
       </w:r>
       <w:proofErr w:type="spellStart"/>
       <w:r>
@@ -5719,21 +5614,12 @@
         <w:t>embedding</w:t>
       </w:r>
       <w:proofErr w:type="spellEnd"/>
-      <w:proofErr w:type="gramStart"/>
-      <w:r>
-        <w:rPr>
-          <w:rFonts w:ascii="Book Antiqua" w:hAnsi="Book Antiqua"/>
-          <w:color w:val="4472C4" w:themeColor="accent1"/>
-        </w:rPr>
-        <w:t xml:space="preserve">",   </w:t>
-      </w:r>
-      <w:proofErr w:type="gramEnd"/>
-      <w:r>
-        <w:rPr>
-          <w:rFonts w:ascii="Book Antiqua" w:hAnsi="Book Antiqua"/>
-          <w:color w:val="4472C4" w:themeColor="accent1"/>
-        </w:rPr>
-        <w:t xml:space="preserve">                # campo del índice con los vectores</w:t>
+      <w:r>
+        <w:rPr>
+          <w:rFonts w:ascii="Book Antiqua" w:hAnsi="Book Antiqua"/>
+          <w:color w:val="4472C4" w:themeColor="accent1"/>
+        </w:rPr>
+        <w:t>",                   # campo del índice con los vectores</w:t>
       </w:r>
     </w:p>
     <w:p>
@@ -5925,7 +5811,6 @@
         </w:rPr>
         <w:t>) que evalúa la relevancia de cada resultado </w:t>
       </w:r>
-      <w:proofErr w:type="gramStart"/>
       <w:r>
         <w:rPr>
           <w:rFonts w:ascii="Book Antiqua" w:hAnsi="Book Antiqua"/>
@@ -5933,17 +5818,7 @@
           <w:bCs/>
           <w:color w:val="4472C4" w:themeColor="accent1"/>
         </w:rPr>
-        <w:t>en relación a</w:t>
-      </w:r>
-      <w:proofErr w:type="gramEnd"/>
-      <w:r>
-        <w:rPr>
-          <w:rFonts w:ascii="Book Antiqua" w:hAnsi="Book Antiqua"/>
-          <w:b/>
-          <w:bCs/>
-          <w:color w:val="4472C4" w:themeColor="accent1"/>
-        </w:rPr>
-        <w:t xml:space="preserve"> la </w:t>
+        <w:t xml:space="preserve">en relación a la </w:t>
       </w:r>
       <w:proofErr w:type="spellStart"/>
       <w:r>
@@ -7058,6 +6933,511 @@
     </w:p>
     <w:p>
       <w:pPr>
+        <w:rPr>
+          <w:rFonts w:ascii="Book Antiqua" w:hAnsi="Book Antiqua"/>
+          <w:lang w:val="en-US"/>
+        </w:rPr>
+      </w:pPr>
+      <w:proofErr w:type="spellStart"/>
+      <w:r>
+        <w:rPr>
+          <w:rFonts w:ascii="Book Antiqua" w:hAnsi="Book Antiqua"/>
+          <w:lang w:val="en-US"/>
+        </w:rPr>
+        <w:t>src</w:t>
+      </w:r>
+      <w:proofErr w:type="spellEnd"/>
+      <w:r>
+        <w:rPr>
+          <w:rFonts w:ascii="Book Antiqua" w:hAnsi="Book Antiqua"/>
+          <w:lang w:val="en-US"/>
+        </w:rPr>
+        <w:t>/rag/</w:t>
+      </w:r>
+    </w:p>
+    <w:p>
+      <w:pPr>
+        <w:rPr>
+          <w:rFonts w:ascii="Book Antiqua" w:hAnsi="Book Antiqua"/>
+          <w:lang w:val="en-US"/>
+        </w:rPr>
+      </w:pPr>
+      <w:r>
+        <w:rPr>
+          <w:rFonts w:ascii="Book Antiqua" w:hAnsi="Book Antiqua"/>
+          <w:lang w:val="en-US"/>
+        </w:rPr>
+        <w:t xml:space="preserve">  strategies/</w:t>
+      </w:r>
+    </w:p>
+    <w:p>
+      <w:pPr>
+        <w:rPr>
+          <w:rFonts w:ascii="Book Antiqua" w:hAnsi="Book Antiqua"/>
+          <w:lang w:val="en-US"/>
+        </w:rPr>
+      </w:pPr>
+      <w:r>
+        <w:rPr>
+          <w:rFonts w:ascii="Book Antiqua" w:hAnsi="Book Antiqua"/>
+          <w:lang w:val="en-US"/>
+        </w:rPr>
+        <w:t xml:space="preserve">    base.py              # </w:t>
+      </w:r>
+      <w:proofErr w:type="spellStart"/>
+      <w:r>
+        <w:rPr>
+          <w:rFonts w:ascii="Book Antiqua" w:hAnsi="Book Antiqua"/>
+          <w:lang w:val="en-US"/>
+        </w:rPr>
+        <w:t>interfaz</w:t>
+      </w:r>
+      <w:proofErr w:type="spellEnd"/>
+      <w:r>
+        <w:rPr>
+          <w:rFonts w:ascii="Book Antiqua" w:hAnsi="Book Antiqua"/>
+          <w:lang w:val="en-US"/>
+        </w:rPr>
+        <w:t xml:space="preserve"> </w:t>
+      </w:r>
+      <w:proofErr w:type="spellStart"/>
+      <w:r>
+        <w:rPr>
+          <w:rFonts w:ascii="Book Antiqua" w:hAnsi="Book Antiqua"/>
+          <w:lang w:val="en-US"/>
+        </w:rPr>
+        <w:t>RetrievalStrategy.retrieve</w:t>
+      </w:r>
+      <w:proofErr w:type="spellEnd"/>
+      <w:r>
+        <w:rPr>
+          <w:rFonts w:ascii="Book Antiqua" w:hAnsi="Book Antiqua"/>
+          <w:lang w:val="en-US"/>
+        </w:rPr>
+        <w:t>(state) -&gt; chunks</w:t>
+      </w:r>
+    </w:p>
+    <w:p>
+      <w:pPr>
+        <w:rPr>
+          <w:rFonts w:ascii="Book Antiqua" w:hAnsi="Book Antiqua"/>
+        </w:rPr>
+      </w:pPr>
+      <w:r>
+        <w:rPr>
+          <w:rFonts w:ascii="Book Antiqua" w:hAnsi="Book Antiqua"/>
+          <w:lang w:val="en-US"/>
+        </w:rPr>
+        <w:t xml:space="preserve">    </w:t>
+      </w:r>
+      <w:r>
+        <w:rPr>
+          <w:rFonts w:ascii="Book Antiqua" w:hAnsi="Book Antiqua"/>
+        </w:rPr>
+        <w:t xml:space="preserve">basic_fusion.py      # RAG </w:t>
+      </w:r>
+      <w:proofErr w:type="spellStart"/>
+      <w:r>
+        <w:rPr>
+          <w:rFonts w:ascii="Book Antiqua" w:hAnsi="Book Antiqua"/>
+        </w:rPr>
+        <w:t>Fusion</w:t>
+      </w:r>
+      <w:proofErr w:type="spellEnd"/>
+      <w:r>
+        <w:rPr>
+          <w:rFonts w:ascii="Book Antiqua" w:hAnsi="Book Antiqua"/>
+        </w:rPr>
+        <w:t xml:space="preserve"> + híbrida (lo de retriever.py actual)</w:t>
+      </w:r>
+    </w:p>
+    <w:p>
+      <w:pPr>
+        <w:rPr>
+          <w:rFonts w:ascii="Book Antiqua" w:hAnsi="Book Antiqua"/>
+        </w:rPr>
+      </w:pPr>
+      <w:r>
+        <w:rPr>
+          <w:rFonts w:ascii="Book Antiqua" w:hAnsi="Book Antiqua"/>
+        </w:rPr>
+        <w:t xml:space="preserve">    cvs_parallel.py      # pipeline de fiabilidad + mini-LLM (lo del </w:t>
+      </w:r>
+      <w:proofErr w:type="spellStart"/>
+      <w:r>
+        <w:rPr>
+          <w:rFonts w:ascii="Book Antiqua" w:hAnsi="Book Antiqua"/>
+        </w:rPr>
+        <w:t>cvs_handler</w:t>
+      </w:r>
+      <w:proofErr w:type="spellEnd"/>
+      <w:r>
+        <w:rPr>
+          <w:rFonts w:ascii="Book Antiqua" w:hAnsi="Book Antiqua"/>
+        </w:rPr>
+        <w:t>)</w:t>
+      </w:r>
+    </w:p>
+    <w:p>
+      <w:pPr>
+        <w:rPr>
+          <w:rFonts w:ascii="Book Antiqua" w:hAnsi="Book Antiqua"/>
+          <w:lang w:val="en-US"/>
+        </w:rPr>
+      </w:pPr>
+      <w:r>
+        <w:rPr>
+          <w:rFonts w:ascii="Book Antiqua" w:hAnsi="Book Antiqua"/>
+        </w:rPr>
+        <w:t xml:space="preserve">    </w:t>
+      </w:r>
+      <w:r>
+        <w:rPr>
+          <w:rFonts w:ascii="Book Antiqua" w:hAnsi="Book Antiqua"/>
+          <w:lang w:val="en-US"/>
+        </w:rPr>
+        <w:t xml:space="preserve">graph_rag.py         # NUEVO: Neo4j + </w:t>
+      </w:r>
+      <w:proofErr w:type="spellStart"/>
+      <w:r>
+        <w:rPr>
+          <w:rFonts w:ascii="Book Antiqua" w:hAnsi="Book Antiqua"/>
+          <w:lang w:val="en-US"/>
+        </w:rPr>
+        <w:t>Graphiti</w:t>
+      </w:r>
+      <w:proofErr w:type="spellEnd"/>
+      <w:r>
+        <w:rPr>
+          <w:rFonts w:ascii="Book Antiqua" w:hAnsi="Book Antiqua"/>
+          <w:lang w:val="en-US"/>
+        </w:rPr>
+        <w:t xml:space="preserve"> search</w:t>
+      </w:r>
+    </w:p>
+    <w:p>
+      <w:pPr>
+        <w:rPr>
+          <w:rFonts w:ascii="Book Antiqua" w:hAnsi="Book Antiqua"/>
+          <w:lang w:val="en-US"/>
+        </w:rPr>
+      </w:pPr>
+      <w:r>
+        <w:rPr>
+          <w:rFonts w:ascii="Book Antiqua" w:hAnsi="Book Antiqua"/>
+          <w:lang w:val="en-US"/>
+        </w:rPr>
+        <w:t xml:space="preserve">  router.py              # </w:t>
+      </w:r>
+      <w:proofErr w:type="spellStart"/>
+      <w:r>
+        <w:rPr>
+          <w:rFonts w:ascii="Book Antiqua" w:hAnsi="Book Antiqua"/>
+          <w:lang w:val="en-US"/>
+        </w:rPr>
+        <w:t>elige</w:t>
+      </w:r>
+      <w:proofErr w:type="spellEnd"/>
+      <w:r>
+        <w:rPr>
+          <w:rFonts w:ascii="Book Antiqua" w:hAnsi="Book Antiqua"/>
+          <w:lang w:val="en-US"/>
+        </w:rPr>
+        <w:t xml:space="preserve"> strategy </w:t>
+      </w:r>
+      <w:proofErr w:type="spellStart"/>
+      <w:r>
+        <w:rPr>
+          <w:rFonts w:ascii="Book Antiqua" w:hAnsi="Book Antiqua"/>
+          <w:lang w:val="en-US"/>
+        </w:rPr>
+        <w:t>según</w:t>
+      </w:r>
+      <w:proofErr w:type="spellEnd"/>
+      <w:r>
+        <w:rPr>
+          <w:rFonts w:ascii="Book Antiqua" w:hAnsi="Book Antiqua"/>
+          <w:lang w:val="en-US"/>
+        </w:rPr>
+        <w:t xml:space="preserve"> (</w:t>
+      </w:r>
+      <w:proofErr w:type="spellStart"/>
+      <w:r>
+        <w:rPr>
+          <w:rFonts w:ascii="Book Antiqua" w:hAnsi="Book Antiqua"/>
+          <w:lang w:val="en-US"/>
+        </w:rPr>
+        <w:t>use_case</w:t>
+      </w:r>
+      <w:proofErr w:type="spellEnd"/>
+      <w:r>
+        <w:rPr>
+          <w:rFonts w:ascii="Book Antiqua" w:hAnsi="Book Antiqua"/>
+          <w:lang w:val="en-US"/>
+        </w:rPr>
+        <w:t>, language)</w:t>
+      </w:r>
+    </w:p>
+    <w:p>
+      <w:pPr>
+        <w:rPr>
+          <w:rFonts w:ascii="Book Antiqua" w:hAnsi="Book Antiqua"/>
+          <w:lang w:val="en-US"/>
+        </w:rPr>
+      </w:pPr>
+    </w:p>
+    <w:p>
+      <w:pPr>
+        <w:rPr>
+          <w:rFonts w:ascii="Book Antiqua" w:hAnsi="Book Antiqua"/>
+          <w:lang w:val="en-US"/>
+        </w:rPr>
+      </w:pPr>
+      <w:r>
+        <w:rPr>
+          <w:noProof/>
+        </w:rPr>
+        <w:drawing>
+          <wp:inline distT="0" distB="0" distL="0" distR="0" wp14:anchorId="57DE1215" wp14:editId="7D68814C">
+            <wp:extent cx="4323809" cy="2780952"/>
+            <wp:effectExtent l="0" t="0" r="635" b="635"/>
+            <wp:docPr id="1616113236" name="Imagen 1"/>
+            <wp:cNvGraphicFramePr>
+              <a:graphicFrameLocks xmlns:a="http://schemas.openxmlformats.org/drawingml/2006/main" noChangeAspect="1"/>
+            </wp:cNvGraphicFramePr>
+            <a:graphic xmlns:a="http://schemas.openxmlformats.org/drawingml/2006/main">
+              <a:graphicData uri="http://schemas.openxmlformats.org/drawingml/2006/picture">
+                <pic:pic xmlns:pic="http://schemas.openxmlformats.org/drawingml/2006/picture">
+                  <pic:nvPicPr>
+                    <pic:cNvPr id="1616113236" name=""/>
+                    <pic:cNvPicPr/>
+                  </pic:nvPicPr>
+                  <pic:blipFill>
+                    <a:blip r:embed="rId15"/>
+                    <a:stretch>
+                      <a:fillRect/>
+                    </a:stretch>
+                  </pic:blipFill>
+                  <pic:spPr>
+                    <a:xfrm>
+                      <a:off x="0" y="0"/>
+                      <a:ext cx="4323809" cy="2780952"/>
+                    </a:xfrm>
+                    <a:prstGeom prst="rect">
+                      <a:avLst/>
+                    </a:prstGeom>
+                  </pic:spPr>
+                </pic:pic>
+              </a:graphicData>
+            </a:graphic>
+          </wp:inline>
+        </w:drawing>
+      </w:r>
+    </w:p>
+    <w:p>
+      <w:pPr>
+        <w:rPr>
+          <w:rFonts w:ascii="Book Antiqua" w:hAnsi="Book Antiqua"/>
+        </w:rPr>
+      </w:pPr>
+      <w:hyperlink r:id="rId16" w:history="1">
+        <w:r>
+          <w:rPr>
+            <w:rStyle w:val="Hipervnculo"/>
+            <w:rFonts w:ascii="Book Antiqua" w:hAnsi="Book Antiqua"/>
+          </w:rPr>
+          <w:t>app_langgraph.py</w:t>
+        </w:r>
+      </w:hyperlink>
+      <w:r>
+        <w:rPr>
+          <w:rFonts w:ascii="Book Antiqua" w:hAnsi="Book Antiqua"/>
+        </w:rPr>
+        <w:t> quedaría: </w:t>
+      </w:r>
+      <w:proofErr w:type="spellStart"/>
+      <w:r>
+        <w:rPr>
+          <w:rFonts w:ascii="Book Antiqua" w:hAnsi="Book Antiqua"/>
+        </w:rPr>
+        <w:fldChar w:fldCharType="begin"/>
+      </w:r>
+      <w:r>
+        <w:rPr>
+          <w:rFonts w:ascii="Book Antiqua" w:hAnsi="Book Antiqua"/>
+        </w:rPr>
+        <w:instrText>HYPERLINK "vscode-file://vscode-app/c:/Users/WG918GS/AppData/Local/Programs/Microsoft%20VS%20Code/10c8e557c8/resources/app/out/vs/code/electron-browser/workbench/workbench.html" \o ""</w:instrText>
+      </w:r>
+      <w:r>
+        <w:rPr>
+          <w:rFonts w:ascii="Book Antiqua" w:hAnsi="Book Antiqua"/>
+        </w:rPr>
+      </w:r>
+      <w:r>
+        <w:rPr>
+          <w:rFonts w:ascii="Book Antiqua" w:hAnsi="Book Antiqua"/>
+        </w:rPr>
+        <w:fldChar w:fldCharType="separate"/>
+      </w:r>
+      <w:r>
+        <w:rPr>
+          <w:rStyle w:val="Hipervnculo"/>
+          <w:rFonts w:ascii="Book Antiqua" w:hAnsi="Book Antiqua"/>
+        </w:rPr>
+        <w:t>validate</w:t>
+      </w:r>
+      <w:proofErr w:type="spellEnd"/>
+      <w:r>
+        <w:rPr>
+          <w:rStyle w:val="Hipervnculo"/>
+          <w:rFonts w:ascii="Book Antiqua" w:hAnsi="Book Antiqua"/>
+        </w:rPr>
+        <w:t xml:space="preserve"> → </w:t>
+      </w:r>
+      <w:proofErr w:type="spellStart"/>
+      <w:r>
+        <w:rPr>
+          <w:rStyle w:val="Hipervnculo"/>
+          <w:rFonts w:ascii="Book Antiqua" w:hAnsi="Book Antiqua"/>
+        </w:rPr>
+        <w:t>classify</w:t>
+      </w:r>
+      <w:proofErr w:type="spellEnd"/>
+      <w:r>
+        <w:rPr>
+          <w:rStyle w:val="Hipervnculo"/>
+          <w:rFonts w:ascii="Book Antiqua" w:hAnsi="Book Antiqua"/>
+        </w:rPr>
+        <w:t xml:space="preserve"> → </w:t>
+      </w:r>
+      <w:proofErr w:type="spellStart"/>
+      <w:r>
+        <w:rPr>
+          <w:rStyle w:val="Hipervnculo"/>
+          <w:rFonts w:ascii="Book Antiqua" w:hAnsi="Book Antiqua"/>
+        </w:rPr>
+        <w:t>router.select_strategy</w:t>
+      </w:r>
+      <w:proofErr w:type="spellEnd"/>
+      <w:r>
+        <w:rPr>
+          <w:rStyle w:val="Hipervnculo"/>
+          <w:rFonts w:ascii="Book Antiqua" w:hAnsi="Book Antiqua"/>
+        </w:rPr>
+        <w:t xml:space="preserve"> → </w:t>
+      </w:r>
+      <w:proofErr w:type="spellStart"/>
+      <w:r>
+        <w:rPr>
+          <w:rStyle w:val="Hipervnculo"/>
+          <w:rFonts w:ascii="Book Antiqua" w:hAnsi="Book Antiqua"/>
+        </w:rPr>
+        <w:t>retrieve</w:t>
+      </w:r>
+      <w:proofErr w:type="spellEnd"/>
+      <w:r>
+        <w:rPr>
+          <w:rStyle w:val="Hipervnculo"/>
+          <w:rFonts w:ascii="Book Antiqua" w:hAnsi="Book Antiqua"/>
+        </w:rPr>
+        <w:t xml:space="preserve"> → </w:t>
+      </w:r>
+      <w:proofErr w:type="spellStart"/>
+      <w:r>
+        <w:rPr>
+          <w:rStyle w:val="Hipervnculo"/>
+          <w:rFonts w:ascii="Book Antiqua" w:hAnsi="Book Antiqua"/>
+        </w:rPr>
+        <w:t>generate</w:t>
+      </w:r>
+      <w:proofErr w:type="spellEnd"/>
+      <w:r>
+        <w:rPr>
+          <w:rFonts w:ascii="Book Antiqua" w:hAnsi="Book Antiqua"/>
+        </w:rPr>
+        <w:fldChar w:fldCharType="end"/>
+      </w:r>
+      <w:r>
+        <w:rPr>
+          <w:rFonts w:ascii="Book Antiqua" w:hAnsi="Book Antiqua"/>
+        </w:rPr>
+        <w:t>, y el nodo </w:t>
+      </w:r>
+      <w:proofErr w:type="spellStart"/>
+      <w:r>
+        <w:rPr>
+          <w:rFonts w:ascii="Book Antiqua" w:hAnsi="Book Antiqua"/>
+        </w:rPr>
+        <w:fldChar w:fldCharType="begin"/>
+      </w:r>
+      <w:r>
+        <w:rPr>
+          <w:rFonts w:ascii="Book Antiqua" w:hAnsi="Book Antiqua"/>
+        </w:rPr>
+        <w:instrText>HYPERLINK "vscode-file://vscode-app/c:/Users/WG918GS/AppData/Local/Programs/Microsoft%20VS%20Code/10c8e557c8/resources/app/out/vs/code/electron-browser/workbench/workbench.html" \o ""</w:instrText>
+      </w:r>
+      <w:r>
+        <w:rPr>
+          <w:rFonts w:ascii="Book Antiqua" w:hAnsi="Book Antiqua"/>
+        </w:rPr>
+      </w:r>
+      <w:r>
+        <w:rPr>
+          <w:rFonts w:ascii="Book Antiqua" w:hAnsi="Book Antiqua"/>
+        </w:rPr>
+        <w:fldChar w:fldCharType="separate"/>
+      </w:r>
+      <w:r>
+        <w:rPr>
+          <w:rStyle w:val="Hipervnculo"/>
+          <w:rFonts w:ascii="Book Antiqua" w:hAnsi="Book Antiqua"/>
+        </w:rPr>
+        <w:t>process_cvs</w:t>
+      </w:r>
+      <w:proofErr w:type="spellEnd"/>
+      <w:r>
+        <w:rPr>
+          <w:rFonts w:ascii="Book Antiqua" w:hAnsi="Book Antiqua"/>
+        </w:rPr>
+        <w:fldChar w:fldCharType="end"/>
+      </w:r>
+      <w:r>
+        <w:rPr>
+          <w:rFonts w:ascii="Book Antiqua" w:hAnsi="Book Antiqua"/>
+        </w:rPr>
+        <w:t> se mueve dentro de </w:t>
+      </w:r>
+      <w:proofErr w:type="spellStart"/>
+      <w:r>
+        <w:rPr>
+          <w:rFonts w:ascii="Book Antiqua" w:hAnsi="Book Antiqua"/>
+        </w:rPr>
+        <w:t>cvs_parallel</w:t>
+      </w:r>
+      <w:proofErr w:type="spellEnd"/>
+      <w:r>
+        <w:rPr>
+          <w:rFonts w:ascii="Book Antiqua" w:hAnsi="Book Antiqua"/>
+        </w:rPr>
+        <w:t xml:space="preserve"> (es </w:t>
+      </w:r>
+      <w:proofErr w:type="spellStart"/>
+      <w:r>
+        <w:rPr>
+          <w:rFonts w:ascii="Book Antiqua" w:hAnsi="Book Antiqua"/>
+        </w:rPr>
+        <w:t>retrieval+respuesta</w:t>
+      </w:r>
+      <w:proofErr w:type="spellEnd"/>
+      <w:r>
+        <w:rPr>
+          <w:rFonts w:ascii="Book Antiqua" w:hAnsi="Book Antiqua"/>
+        </w:rPr>
+        <w:t xml:space="preserve"> acoplados, está bien encapsularlo allí).</w:t>
+      </w:r>
+    </w:p>
+    <w:p>
+      <w:pPr>
         <w:pStyle w:val="Ttulo2"/>
       </w:pPr>
       <w:proofErr w:type="spellStart"/>
@@ -7194,6 +7574,7 @@
           <w:rFonts w:ascii="Book Antiqua" w:hAnsi="Book Antiqua"/>
           <w:noProof/>
         </w:rPr>
+        <w:lastRenderedPageBreak/>
         <w:drawing>
           <wp:inline distT="0" distB="0" distL="0" distR="0" wp14:anchorId="01A2ADA2" wp14:editId="40B1190F">
             <wp:extent cx="6108700" cy="3150235"/>
@@ -7202,7 +7583,7 @@
             <wp:cNvGraphicFramePr/>
             <a:graphic xmlns:a="http://schemas.openxmlformats.org/drawingml/2006/main">
               <a:graphicData uri="http://schemas.openxmlformats.org/drawingml/2006/diagram">
-                <dgm:relIds xmlns:dgm="http://schemas.openxmlformats.org/drawingml/2006/diagram" xmlns:r="http://schemas.openxmlformats.org/officeDocument/2006/relationships" r:dm="rId15" r:lo="rId16" r:qs="rId17" r:cs="rId18"/>
+                <dgm:relIds xmlns:dgm="http://schemas.openxmlformats.org/drawingml/2006/diagram" xmlns:r="http://schemas.openxmlformats.org/officeDocument/2006/relationships" r:dm="rId17" r:lo="rId18" r:qs="rId19" r:cs="rId20"/>
               </a:graphicData>
             </a:graphic>
           </wp:inline>
@@ -7658,7 +8039,6 @@
           <w:rFonts w:ascii="Book Antiqua" w:hAnsi="Book Antiqua"/>
           <w:color w:val="7F7F7F" w:themeColor="text1" w:themeTint="80"/>
         </w:rPr>
-        <w:lastRenderedPageBreak/>
         <w:t xml:space="preserve">para el grupo 1 (&gt;90%), vamos a almacenar directamente una lista con los nombres de las personas de los </w:t>
       </w:r>
       <w:proofErr w:type="spellStart"/>
@@ -7725,7 +8105,6 @@
       <w:pPr>
         <w:rPr>
           <w:rFonts w:ascii="Book Antiqua" w:hAnsi="Book Antiqua"/>
-          <w:lang w:val="en-US"/>
         </w:rPr>
       </w:pPr>
     </w:p>
@@ -7865,6 +8244,7 @@
         <w:rPr>
           <w:rFonts w:ascii="Book Antiqua" w:hAnsi="Book Antiqua"/>
         </w:rPr>
+        <w:lastRenderedPageBreak/>
         <w:t>Genere respuesta esperada</w:t>
       </w:r>
     </w:p>
@@ -8260,6 +8640,20 @@
     </w:p>
     <w:p>
       <w:pPr>
+        <w:rPr>
+          <w:rFonts w:ascii="Book Antiqua" w:hAnsi="Book Antiqua"/>
+        </w:rPr>
+      </w:pPr>
+    </w:p>
+    <w:p>
+      <w:pPr>
+        <w:rPr>
+          <w:rFonts w:ascii="Book Antiqua" w:hAnsi="Book Antiqua"/>
+        </w:rPr>
+      </w:pPr>
+    </w:p>
+    <w:p>
+      <w:pPr>
         <w:pStyle w:val="Ttulo1"/>
       </w:pPr>
       <w:proofErr w:type="spellStart"/>
@@ -8571,7 +8965,7 @@
         </w:rPr>
         <w:t xml:space="preserve">. </w:t>
       </w:r>
-      <w:hyperlink r:id="rId20" w:history="1">
+      <w:hyperlink r:id="rId22" w:history="1">
         <w:r>
           <w:rPr>
             <w:rStyle w:val="Hipervnculo"/>
@@ -16124,7 +16518,7 @@
   <dgm:whole/>
   <dgm:extLst>
     <a:ext uri="http://schemas.microsoft.com/office/drawing/2008/diagram">
-      <dsp:dataModelExt xmlns:dsp="http://schemas.microsoft.com/office/drawing/2008/diagram" relId="rId19" minVer="http://schemas.openxmlformats.org/drawingml/2006/diagram"/>
+      <dsp:dataModelExt xmlns:dsp="http://schemas.microsoft.com/office/drawing/2008/diagram" relId="rId21" minVer="http://schemas.openxmlformats.org/drawingml/2006/diagram"/>
     </a:ext>
   </dgm:extLst>
 </dgm:dataModel>

</xml_diff>

<commit_message>
Remove obsolete diagram files and images related to the RAG pipeline documentation
</commit_message>
<xml_diff>
--- a/doc/Memoria supongo.docx
+++ b/doc/Memoria supongo.docx
@@ -4842,23 +4842,7 @@
           <w:rFonts w:ascii="Book Antiqua" w:hAnsi="Book Antiqua"/>
           <w:color w:val="4472C4" w:themeColor="accent1"/>
         </w:rPr>
-        <w:t>"</w:t>
-      </w:r>
-      <w:proofErr w:type="spellStart"/>
-      <w:r>
-        <w:rPr>
-          <w:rFonts w:ascii="Book Antiqua" w:hAnsi="Book Antiqua"/>
-          <w:color w:val="4472C4" w:themeColor="accent1"/>
-        </w:rPr>
-        <w:t>cloud</w:t>
-      </w:r>
-      <w:proofErr w:type="spellEnd"/>
-      <w:r>
-        <w:rPr>
-          <w:rFonts w:ascii="Book Antiqua" w:hAnsi="Book Antiqua"/>
-          <w:color w:val="4472C4" w:themeColor="accent1"/>
-        </w:rPr>
-        <w:t>"      →  [chunk_12 (×5), chunk_23 (×1), ...]</w:t>
+        <w:t>"cloud"      →  [chunk_12 (×5), chunk_23 (×1), ...]</w:t>
       </w:r>
     </w:p>
     <w:p>
@@ -6224,6 +6208,7 @@
           <w:b/>
           <w:bCs/>
           <w:color w:val="4472C4" w:themeColor="accent1"/>
+          <w:highlight w:val="darkGray"/>
         </w:rPr>
       </w:pPr>
       <w:r>
@@ -6232,6 +6217,7 @@
           <w:b/>
           <w:bCs/>
           <w:color w:val="4472C4" w:themeColor="accent1"/>
+          <w:highlight w:val="darkGray"/>
         </w:rPr>
         <w:t>Cómo funciona el RRF del proyecto:</w:t>
       </w:r>
@@ -6240,11 +6226,13 @@
       <w:pPr>
         <w:rPr>
           <w:rFonts w:ascii="Book Antiqua" w:hAnsi="Book Antiqua"/>
-        </w:rPr>
-      </w:pPr>
-      <w:r>
-        <w:rPr>
-          <w:rFonts w:ascii="Book Antiqua" w:hAnsi="Book Antiqua"/>
+          <w:highlight w:val="darkGray"/>
+        </w:rPr>
+      </w:pPr>
+      <w:r>
+        <w:rPr>
+          <w:rFonts w:ascii="Book Antiqua" w:hAnsi="Book Antiqua"/>
+          <w:highlight w:val="darkGray"/>
         </w:rPr>
         <w:t>Cuando obtienes los resultados de las 5 búsquedas, no puedes simplemente sumar las puntuaciones que BM25 da por defecto: cada búsqueda usa su propia escala, y 0.95 de una búsqueda vectorial no es comparable con 0.88 de una búsqueda BM25.</w:t>
       </w:r>
@@ -6256,6 +6244,7 @@
           <w:b/>
           <w:bCs/>
           <w:color w:val="4472C4" w:themeColor="accent1"/>
+          <w:highlight w:val="darkGray"/>
         </w:rPr>
       </w:pPr>
       <w:r>
@@ -6264,6 +6253,7 @@
           <w:b/>
           <w:bCs/>
           <w:color w:val="4472C4" w:themeColor="accent1"/>
+          <w:highlight w:val="darkGray"/>
         </w:rPr>
         <w:t>La solución: usar el rango, no la puntuación</w:t>
       </w:r>
@@ -6273,12 +6263,14 @@
         <w:rPr>
           <w:rFonts w:ascii="Book Antiqua" w:hAnsi="Book Antiqua"/>
           <w:color w:val="4472C4" w:themeColor="accent1"/>
-        </w:rPr>
-      </w:pPr>
-      <w:r>
-        <w:rPr>
-          <w:rFonts w:ascii="Book Antiqua" w:hAnsi="Book Antiqua"/>
-          <w:color w:val="4472C4" w:themeColor="accent1"/>
+          <w:highlight w:val="darkGray"/>
+        </w:rPr>
+      </w:pPr>
+      <w:r>
+        <w:rPr>
+          <w:rFonts w:ascii="Book Antiqua" w:hAnsi="Book Antiqua"/>
+          <w:color w:val="4472C4" w:themeColor="accent1"/>
+          <w:highlight w:val="darkGray"/>
         </w:rPr>
         <w:t>RRF ignora completamente las puntuaciones numéricas y solo usa la </w:t>
       </w:r>
@@ -6288,6 +6280,7 @@
           <w:b/>
           <w:bCs/>
           <w:color w:val="4472C4" w:themeColor="accent1"/>
+          <w:highlight w:val="darkGray"/>
         </w:rPr>
         <w:t>posición</w:t>
       </w:r>
@@ -6295,6 +6288,7 @@
         <w:rPr>
           <w:rFonts w:ascii="Book Antiqua" w:hAnsi="Book Antiqua"/>
           <w:color w:val="4472C4" w:themeColor="accent1"/>
+          <w:highlight w:val="darkGray"/>
         </w:rPr>
         <w:t> (</w:t>
       </w:r>
@@ -6305,6 +6299,7 @@
           <w:i/>
           <w:iCs/>
           <w:color w:val="4472C4" w:themeColor="accent1"/>
+          <w:highlight w:val="darkGray"/>
         </w:rPr>
         <w:t>rank</w:t>
       </w:r>
@@ -6313,6 +6308,7 @@
         <w:rPr>
           <w:rFonts w:ascii="Book Antiqua" w:hAnsi="Book Antiqua"/>
           <w:color w:val="4472C4" w:themeColor="accent1"/>
+          <w:highlight w:val="darkGray"/>
         </w:rPr>
         <w:t>) de cada resultado en su lista. La fórmula para cada aparición es:</w:t>
       </w:r>
@@ -6322,6 +6318,7 @@
         <w:rPr>
           <w:rFonts w:ascii="Book Antiqua" w:hAnsi="Book Antiqua"/>
           <w:color w:val="4472C4" w:themeColor="accent1"/>
+          <w:highlight w:val="darkGray"/>
         </w:rPr>
       </w:pPr>
       <w:proofErr w:type="spellStart"/>
@@ -6334,6 +6331,7 @@
             <w:rPr>
               <w:rFonts w:ascii="Book Antiqua" w:hAnsi="Book Antiqua"/>
               <w:color w:val="4472C4" w:themeColor="accent1"/>
+              <w:highlight w:val="darkGray"/>
             </w:rPr>
             <m:t>RRF_score</m:t>
           </m:r>
@@ -6342,6 +6340,7 @@
             <w:rPr>
               <w:rFonts w:ascii="Cambria Math" w:hAnsi="Cambria Math"/>
               <w:color w:val="4472C4" w:themeColor="accent1"/>
+              <w:highlight w:val="darkGray"/>
             </w:rPr>
             <m:t>(d,q)=</m:t>
           </m:r>
@@ -6351,6 +6350,7 @@
                 <w:rPr>
                   <w:rFonts w:ascii="Cambria Math" w:hAnsi="Cambria Math"/>
                   <w:color w:val="4472C4" w:themeColor="accent1"/>
+                  <w:highlight w:val="darkGray"/>
                 </w:rPr>
               </m:ctrlPr>
             </m:fPr>
@@ -6359,6 +6359,7 @@
                 <w:rPr>
                   <w:rFonts w:ascii="Cambria Math" w:hAnsi="Cambria Math"/>
                   <w:color w:val="4472C4" w:themeColor="accent1"/>
+                  <w:highlight w:val="darkGray"/>
                 </w:rPr>
                 <m:t>1</m:t>
               </m:r>
@@ -6368,6 +6369,7 @@
                 <w:rPr>
                   <w:rFonts w:ascii="Cambria Math" w:hAnsi="Cambria Math"/>
                   <w:color w:val="4472C4" w:themeColor="accent1"/>
+                  <w:highlight w:val="darkGray"/>
                 </w:rPr>
                 <m:t>k+</m:t>
               </m:r>
@@ -6378,6 +6380,7 @@
                 <w:rPr>
                   <w:rFonts w:ascii="Book Antiqua" w:hAnsi="Book Antiqua"/>
                   <w:color w:val="4472C4" w:themeColor="accent1"/>
+                  <w:highlight w:val="darkGray"/>
                 </w:rPr>
                 <m:t>rank</m:t>
               </m:r>
@@ -6385,6 +6388,7 @@
                 <w:rPr>
                   <w:rFonts w:ascii="Cambria Math" w:hAnsi="Cambria Math"/>
                   <w:color w:val="4472C4" w:themeColor="accent1"/>
+                  <w:highlight w:val="darkGray"/>
                 </w:rPr>
                 <m:t>(d,q)</m:t>
               </m:r>
@@ -6398,12 +6402,14 @@
         <w:rPr>
           <w:rFonts w:ascii="Book Antiqua" w:hAnsi="Book Antiqua"/>
           <w:color w:val="4472C4" w:themeColor="accent1"/>
-        </w:rPr>
-      </w:pPr>
-      <w:r>
-        <w:rPr>
-          <w:rFonts w:ascii="Book Antiqua" w:hAnsi="Book Antiqua"/>
-          <w:color w:val="4472C4" w:themeColor="accent1"/>
+          <w:highlight w:val="darkGray"/>
+        </w:rPr>
+      </w:pPr>
+      <w:r>
+        <w:rPr>
+          <w:rFonts w:ascii="Book Antiqua" w:hAnsi="Book Antiqua"/>
+          <w:color w:val="4472C4" w:themeColor="accent1"/>
+          <w:highlight w:val="darkGray"/>
         </w:rPr>
         <w:t>Donde:</w:t>
       </w:r>
@@ -6417,6 +6423,7 @@
         <w:rPr>
           <w:rFonts w:ascii="Book Antiqua" w:hAnsi="Book Antiqua"/>
           <w:color w:val="4472C4" w:themeColor="accent1"/>
+          <w:highlight w:val="darkGray"/>
         </w:rPr>
       </w:pPr>
       <w:proofErr w:type="spellStart"/>
@@ -6428,6 +6435,7 @@
           <w:rPr>
             <w:rFonts w:ascii="Book Antiqua" w:hAnsi="Book Antiqua"/>
             <w:color w:val="4472C4" w:themeColor="accent1"/>
+            <w:highlight w:val="darkGray"/>
           </w:rPr>
           <m:t>rank</m:t>
         </m:r>
@@ -6436,6 +6444,7 @@
           <w:rPr>
             <w:rFonts w:ascii="Cambria Math" w:hAnsi="Cambria Math"/>
             <w:color w:val="4472C4" w:themeColor="accent1"/>
+            <w:highlight w:val="darkGray"/>
           </w:rPr>
           <m:t>(d,q)</m:t>
         </m:r>
@@ -6444,6 +6453,7 @@
         <w:rPr>
           <w:rFonts w:ascii="Book Antiqua" w:hAnsi="Book Antiqua"/>
           <w:color w:val="4472C4" w:themeColor="accent1"/>
+          <w:highlight w:val="darkGray"/>
         </w:rPr>
         <w:t> es la posición del documento </w:t>
       </w:r>
@@ -6452,6 +6462,7 @@
           <w:rPr>
             <w:rFonts w:ascii="Cambria Math" w:hAnsi="Cambria Math"/>
             <w:color w:val="4472C4" w:themeColor="accent1"/>
+            <w:highlight w:val="darkGray"/>
           </w:rPr>
           <m:t>d</m:t>
         </m:r>
@@ -6460,6 +6471,7 @@
         <w:rPr>
           <w:rFonts w:ascii="Book Antiqua" w:hAnsi="Book Antiqua"/>
           <w:color w:val="4472C4" w:themeColor="accent1"/>
+          <w:highlight w:val="darkGray"/>
         </w:rPr>
         <w:t> en la lista de la búsqueda </w:t>
       </w:r>
@@ -6468,6 +6480,7 @@
           <w:rPr>
             <w:rFonts w:ascii="Cambria Math" w:hAnsi="Cambria Math"/>
             <w:color w:val="4472C4" w:themeColor="accent1"/>
+            <w:highlight w:val="darkGray"/>
           </w:rPr>
           <m:t>q</m:t>
         </m:r>
@@ -6476,6 +6489,7 @@
         <w:rPr>
           <w:rFonts w:ascii="Book Antiqua" w:hAnsi="Book Antiqua"/>
           <w:color w:val="4472C4" w:themeColor="accent1"/>
+          <w:highlight w:val="darkGray"/>
         </w:rPr>
         <w:t> (1 = primero)</w:t>
       </w:r>
@@ -6489,6 +6503,7 @@
         <w:rPr>
           <w:rFonts w:ascii="Book Antiqua" w:hAnsi="Book Antiqua"/>
           <w:color w:val="4472C4" w:themeColor="accent1"/>
+          <w:highlight w:val="darkGray"/>
         </w:rPr>
       </w:pPr>
       <m:oMath>
@@ -6496,6 +6511,7 @@
           <w:rPr>
             <w:rFonts w:ascii="Cambria Math" w:hAnsi="Cambria Math"/>
             <w:color w:val="4472C4" w:themeColor="accent1"/>
+            <w:highlight w:val="darkGray"/>
           </w:rPr>
           <m:t>k=60</m:t>
         </m:r>
@@ -6504,6 +6520,7 @@
         <w:rPr>
           <w:rFonts w:ascii="Book Antiqua" w:hAnsi="Book Antiqua"/>
           <w:color w:val="4472C4" w:themeColor="accent1"/>
+          <w:highlight w:val="darkGray"/>
         </w:rPr>
         <w:t> es una constante de suavizado estándar (evita que los primeros puestos dominen demasiado)</w:t>
       </w:r>
@@ -6513,12 +6530,14 @@
         <w:rPr>
           <w:rFonts w:ascii="Book Antiqua" w:hAnsi="Book Antiqua"/>
           <w:color w:val="4472C4" w:themeColor="accent1"/>
-        </w:rPr>
-      </w:pPr>
-      <w:r>
-        <w:rPr>
-          <w:rFonts w:ascii="Book Antiqua" w:hAnsi="Book Antiqua"/>
-          <w:color w:val="4472C4" w:themeColor="accent1"/>
+          <w:highlight w:val="darkGray"/>
+        </w:rPr>
+      </w:pPr>
+      <w:r>
+        <w:rPr>
+          <w:rFonts w:ascii="Book Antiqua" w:hAnsi="Book Antiqua"/>
+          <w:color w:val="4472C4" w:themeColor="accent1"/>
+          <w:highlight w:val="darkGray"/>
         </w:rPr>
         <w:t>La puntuación </w:t>
       </w:r>
@@ -6528,6 +6547,7 @@
           <w:b/>
           <w:bCs/>
           <w:color w:val="4472C4" w:themeColor="accent1"/>
+          <w:highlight w:val="darkGray"/>
         </w:rPr>
         <w:t>final</w:t>
       </w:r>
@@ -6535,6 +6555,7 @@
         <w:rPr>
           <w:rFonts w:ascii="Book Antiqua" w:hAnsi="Book Antiqua"/>
           <w:color w:val="4472C4" w:themeColor="accent1"/>
+          <w:highlight w:val="darkGray"/>
         </w:rPr>
         <w:t> de un documento es la </w:t>
       </w:r>
@@ -6544,6 +6565,7 @@
           <w:b/>
           <w:bCs/>
           <w:color w:val="4472C4" w:themeColor="accent1"/>
+          <w:highlight w:val="darkGray"/>
         </w:rPr>
         <w:t>suma de sus contribuciones en todas las listas</w:t>
       </w:r>
@@ -6551,6 +6573,7 @@
         <w:rPr>
           <w:rFonts w:ascii="Book Antiqua" w:hAnsi="Book Antiqua"/>
           <w:color w:val="4472C4" w:themeColor="accent1"/>
+          <w:highlight w:val="darkGray"/>
         </w:rPr>
         <w:t> donde aparece:</w:t>
       </w:r>
@@ -6560,6 +6583,7 @@
         <w:rPr>
           <w:rFonts w:ascii="Book Antiqua" w:hAnsi="Book Antiqua"/>
           <w:color w:val="4472C4" w:themeColor="accent1"/>
+          <w:highlight w:val="darkGray"/>
           <w:lang w:val="en-US"/>
         </w:rPr>
       </w:pPr>
@@ -6573,6 +6597,7 @@
             <w:rPr>
               <w:rFonts w:ascii="Book Antiqua" w:hAnsi="Book Antiqua"/>
               <w:color w:val="4472C4" w:themeColor="accent1"/>
+              <w:highlight w:val="darkGray"/>
               <w:lang w:val="en-US"/>
             </w:rPr>
             <m:t>RRF_final</m:t>
@@ -6582,6 +6607,7 @@
             <w:rPr>
               <w:rFonts w:ascii="Cambria Math" w:hAnsi="Cambria Math"/>
               <w:color w:val="4472C4" w:themeColor="accent1"/>
+              <w:highlight w:val="darkGray"/>
               <w:lang w:val="en-US"/>
             </w:rPr>
             <m:t>(</m:t>
@@ -6590,6 +6616,7 @@
             <w:rPr>
               <w:rFonts w:ascii="Cambria Math" w:hAnsi="Cambria Math"/>
               <w:color w:val="4472C4" w:themeColor="accent1"/>
+              <w:highlight w:val="darkGray"/>
             </w:rPr>
             <m:t>d</m:t>
           </m:r>
@@ -6597,6 +6624,7 @@
             <w:rPr>
               <w:rFonts w:ascii="Cambria Math" w:hAnsi="Cambria Math"/>
               <w:color w:val="4472C4" w:themeColor="accent1"/>
+              <w:highlight w:val="darkGray"/>
               <w:lang w:val="en-US"/>
             </w:rPr>
             <m:t>)=</m:t>
@@ -6611,6 +6639,7 @@
                 <w:rPr>
                   <w:rFonts w:ascii="Cambria Math" w:hAnsi="Cambria Math"/>
                   <w:color w:val="4472C4" w:themeColor="accent1"/>
+                  <w:highlight w:val="darkGray"/>
                 </w:rPr>
               </m:ctrlPr>
             </m:naryPr>
@@ -6619,6 +6648,7 @@
                 <w:rPr>
                   <w:rFonts w:ascii="Cambria Math" w:hAnsi="Cambria Math"/>
                   <w:color w:val="4472C4" w:themeColor="accent1"/>
+                  <w:highlight w:val="darkGray"/>
                 </w:rPr>
                 <m:t>q</m:t>
               </m:r>
@@ -6626,6 +6656,7 @@
                 <w:rPr>
                   <w:rFonts w:ascii="Cambria Math" w:hAnsi="Cambria Math"/>
                   <w:color w:val="4472C4" w:themeColor="accent1"/>
+                  <w:highlight w:val="darkGray"/>
                   <w:lang w:val="en-US"/>
                 </w:rPr>
                 <m:t>∈</m:t>
@@ -6634,6 +6665,7 @@
                 <w:rPr>
                   <w:rFonts w:ascii="Cambria Math" w:hAnsi="Cambria Math"/>
                   <w:color w:val="4472C4" w:themeColor="accent1"/>
+                  <w:highlight w:val="darkGray"/>
                 </w:rPr>
                 <m:t>Q</m:t>
               </m:r>
@@ -6646,6 +6678,7 @@
                     <w:rPr>
                       <w:rFonts w:ascii="Cambria Math" w:hAnsi="Cambria Math"/>
                       <w:color w:val="4472C4" w:themeColor="accent1"/>
+                      <w:highlight w:val="darkGray"/>
                     </w:rPr>
                   </m:ctrlPr>
                 </m:fPr>
@@ -6654,6 +6687,7 @@
                     <w:rPr>
                       <w:rFonts w:ascii="Cambria Math" w:hAnsi="Cambria Math"/>
                       <w:color w:val="4472C4" w:themeColor="accent1"/>
+                      <w:highlight w:val="darkGray"/>
                       <w:lang w:val="en-US"/>
                     </w:rPr>
                     <m:t>1</m:t>
@@ -6664,6 +6698,7 @@
                     <w:rPr>
                       <w:rFonts w:ascii="Cambria Math" w:hAnsi="Cambria Math"/>
                       <w:color w:val="4472C4" w:themeColor="accent1"/>
+                      <w:highlight w:val="darkGray"/>
                       <w:lang w:val="en-US"/>
                     </w:rPr>
                     <m:t>60+</m:t>
@@ -6675,6 +6710,7 @@
                     <w:rPr>
                       <w:rFonts w:ascii="Book Antiqua" w:hAnsi="Book Antiqua"/>
                       <w:color w:val="4472C4" w:themeColor="accent1"/>
+                      <w:highlight w:val="darkGray"/>
                       <w:lang w:val="en-US"/>
                     </w:rPr>
                     <m:t>rank</m:t>
@@ -6683,6 +6719,7 @@
                     <w:rPr>
                       <w:rFonts w:ascii="Cambria Math" w:hAnsi="Cambria Math"/>
                       <w:color w:val="4472C4" w:themeColor="accent1"/>
+                      <w:highlight w:val="darkGray"/>
                       <w:lang w:val="en-US"/>
                     </w:rPr>
                     <m:t>(</m:t>
@@ -6691,6 +6728,7 @@
                     <w:rPr>
                       <w:rFonts w:ascii="Cambria Math" w:hAnsi="Cambria Math"/>
                       <w:color w:val="4472C4" w:themeColor="accent1"/>
+                      <w:highlight w:val="darkGray"/>
                     </w:rPr>
                     <m:t>d</m:t>
                   </m:r>
@@ -6698,6 +6736,7 @@
                     <w:rPr>
                       <w:rFonts w:ascii="Cambria Math" w:hAnsi="Cambria Math"/>
                       <w:color w:val="4472C4" w:themeColor="accent1"/>
+                      <w:highlight w:val="darkGray"/>
                       <w:lang w:val="en-US"/>
                     </w:rPr>
                     <m:t>,</m:t>
@@ -6706,6 +6745,7 @@
                     <w:rPr>
                       <w:rFonts w:ascii="Cambria Math" w:hAnsi="Cambria Math"/>
                       <w:color w:val="4472C4" w:themeColor="accent1"/>
+                      <w:highlight w:val="darkGray"/>
                     </w:rPr>
                     <m:t>q</m:t>
                   </m:r>
@@ -6713,6 +6753,7 @@
                     <w:rPr>
                       <w:rFonts w:ascii="Cambria Math" w:hAnsi="Cambria Math"/>
                       <w:color w:val="4472C4" w:themeColor="accent1"/>
+                      <w:highlight w:val="darkGray"/>
                       <w:lang w:val="en-US"/>
                     </w:rPr>
                     <m:t>)</m:t>
@@ -6735,6 +6776,7 @@
         <w:rPr>
           <w:rFonts w:ascii="Book Antiqua" w:hAnsi="Book Antiqua"/>
           <w:color w:val="4472C4" w:themeColor="accent1"/>
+          <w:highlight w:val="darkGray"/>
         </w:rPr>
         <w:t>La constante 60 en el denominador es estándar en RRF (suaviza la diferencia entre rangos altos y bajos). Un </w:t>
       </w:r>
@@ -6745,6 +6787,7 @@
           <w:i/>
           <w:iCs/>
           <w:color w:val="4472C4" w:themeColor="accent1"/>
+          <w:highlight w:val="darkGray"/>
         </w:rPr>
         <w:t>chunk</w:t>
       </w:r>
@@ -6753,6 +6796,7 @@
         <w:rPr>
           <w:rFonts w:ascii="Book Antiqua" w:hAnsi="Book Antiqua"/>
           <w:color w:val="4472C4" w:themeColor="accent1"/>
+          <w:highlight w:val="darkGray"/>
         </w:rPr>
         <w:t> que aparece en la posición 1 de varias búsquedas acumula mucho más que uno que aparece una sola vez en posición 20:</w:t>
       </w:r>
@@ -6760,6 +6804,7 @@
         <w:rPr>
           <w:rFonts w:ascii="Book Antiqua" w:hAnsi="Book Antiqua"/>
           <w:color w:val="4472C4" w:themeColor="accent1"/>
+          <w:highlight w:val="darkGray"/>
         </w:rPr>
         <w:t xml:space="preserve"> es decir, e</w:t>
       </w:r>
@@ -6767,6 +6812,7 @@
         <w:rPr>
           <w:rFonts w:ascii="Book Antiqua" w:hAnsi="Book Antiqua"/>
           <w:color w:val="4472C4" w:themeColor="accent1"/>
+          <w:highlight w:val="darkGray"/>
         </w:rPr>
         <w:t>l </w:t>
       </w:r>
@@ -6777,6 +6823,7 @@
           <w:i/>
           <w:iCs/>
           <w:color w:val="4472C4" w:themeColor="accent1"/>
+          <w:highlight w:val="darkGray"/>
         </w:rPr>
         <w:t>chunk</w:t>
       </w:r>
@@ -6785,6 +6832,7 @@
         <w:rPr>
           <w:rFonts w:ascii="Book Antiqua" w:hAnsi="Book Antiqua"/>
           <w:color w:val="4472C4" w:themeColor="accent1"/>
+          <w:highlight w:val="darkGray"/>
         </w:rPr>
         <w:t xml:space="preserve"> consistentemente relevante en múltiples reformulaciones de la </w:t>
       </w:r>
@@ -6793,6 +6841,7 @@
         <w:rPr>
           <w:rFonts w:ascii="Book Antiqua" w:hAnsi="Book Antiqua"/>
           <w:color w:val="4472C4" w:themeColor="accent1"/>
+          <w:highlight w:val="darkGray"/>
         </w:rPr>
         <w:t>query</w:t>
       </w:r>
@@ -6801,6 +6850,7 @@
         <w:rPr>
           <w:rFonts w:ascii="Book Antiqua" w:hAnsi="Book Antiqua"/>
           <w:color w:val="4472C4" w:themeColor="accent1"/>
+          <w:highlight w:val="darkGray"/>
         </w:rPr>
         <w:t xml:space="preserve"> gana sobre el que solo es relevante para una formulación concreta. Esto reduce el ruido y aumenta la precisión final.</w:t>
       </w:r>
@@ -14895,6 +14945,7 @@
   <w:style w:type="character" w:default="1" w:styleId="Fuentedeprrafopredeter">
     <w:name w:val="Default Paragraph Font"/>
     <w:uiPriority w:val="1"/>
+    <w:semiHidden/>
     <w:unhideWhenUsed/>
   </w:style>
   <w:style w:type="table" w:default="1" w:styleId="Tablanormal">

</xml_diff>